<commit_message>
feat: add metagenomics taizhou workflow v2.88
</commit_message>
<xml_diff>
--- a/scripts/metagenome_megahit.docx
+++ b/scripts/metagenome_megahit.docx
@@ -41,60 +41,6 @@
           <w:szCs w:val="21"/>
         </w:rPr>
       </w:pPr>
-      <w:r>
-        <w:rPr>
-          <w:rFonts w:cs="Times New Roman"/>
-          <w:szCs w:val="21"/>
-        </w:rPr>
-        <w:drawing>
-          <wp:inline distT="0" distB="0" distL="0" distR="0">
-            <wp:extent cx="3124200" cy="1989455"/>
-            <wp:effectExtent l="0" t="0" r="0" b="0"/>
-            <wp:docPr id="1" name="图片 1" descr="sanshu logo - 副本"/>
-            <wp:cNvGraphicFramePr>
-              <a:graphicFrameLocks xmlns:a="http://schemas.openxmlformats.org/drawingml/2006/main" noChangeAspect="1"/>
-            </wp:cNvGraphicFramePr>
-            <a:graphic xmlns:a="http://schemas.openxmlformats.org/drawingml/2006/main">
-              <a:graphicData uri="http://schemas.openxmlformats.org/drawingml/2006/picture">
-                <pic:pic xmlns:pic="http://schemas.openxmlformats.org/drawingml/2006/picture">
-                  <pic:nvPicPr>
-                    <pic:cNvPr id="1" name="图片 1" descr="sanshu logo - 副本"/>
-                    <pic:cNvPicPr>
-                      <a:picLocks noChangeAspect="1" noChangeArrowheads="1"/>
-                    </pic:cNvPicPr>
-                  </pic:nvPicPr>
-                  <pic:blipFill>
-                    <a:blip r:embed="rId15" cstate="print">
-                      <a:extLst>
-                        <a:ext uri="{28A0092B-C50C-407E-A947-70E740481C1C}">
-                          <a14:useLocalDpi xmlns:a14="http://schemas.microsoft.com/office/drawing/2010/main" val="0"/>
-                        </a:ext>
-                      </a:extLst>
-                    </a:blip>
-                    <a:srcRect b="22156"/>
-                    <a:stretch>
-                      <a:fillRect/>
-                    </a:stretch>
-                  </pic:blipFill>
-                  <pic:spPr>
-                    <a:xfrm>
-                      <a:off x="0" y="0"/>
-                      <a:ext cx="3124200" cy="1989455"/>
-                    </a:xfrm>
-                    <a:prstGeom prst="rect">
-                      <a:avLst/>
-                    </a:prstGeom>
-                    <a:noFill/>
-                    <a:ln>
-                      <a:noFill/>
-                    </a:ln>
-                  </pic:spPr>
-                </pic:pic>
-              </a:graphicData>
-            </a:graphic>
-          </wp:inline>
-        </w:drawing>
-      </w:r>
     </w:p>
     <w:p>
       <w:pPr>
@@ -129,16 +75,16 @@
           <w:szCs w:val="72"/>
         </w:rPr>
       </w:pPr>
-      <w:bookmarkStart w:id="1" w:name="_Toc12654"/>
-      <w:bookmarkStart w:id="2" w:name="_Toc7183"/>
-      <w:bookmarkStart w:id="3" w:name="_Toc6988"/>
-      <w:bookmarkStart w:id="4" w:name="_Toc145668912"/>
-      <w:bookmarkStart w:id="5" w:name="_Toc10198"/>
-      <w:bookmarkStart w:id="6" w:name="_Toc149655948"/>
-      <w:bookmarkStart w:id="7" w:name="_Toc161219785"/>
-      <w:bookmarkStart w:id="8" w:name="_Toc28989"/>
+      <w:bookmarkStart w:id="1" w:name="_Toc149655948"/>
+      <w:bookmarkStart w:id="2" w:name="_Toc28989"/>
+      <w:bookmarkStart w:id="3" w:name="_Toc161219785"/>
+      <w:bookmarkStart w:id="4" w:name="_Toc12654"/>
+      <w:bookmarkStart w:id="5" w:name="_Toc7183"/>
+      <w:bookmarkStart w:id="6" w:name="_Toc176436699"/>
+      <w:bookmarkStart w:id="7" w:name="_Toc6988"/>
+      <w:bookmarkStart w:id="8" w:name="_Toc10198"/>
       <w:bookmarkStart w:id="9" w:name="_Toc175927247"/>
-      <w:bookmarkStart w:id="10" w:name="_Toc176436699"/>
+      <w:bookmarkStart w:id="10" w:name="_Toc145668912"/>
       <w:r>
         <w:rPr>
           <w:rFonts w:hint="eastAsia" w:cs="Times New Roman"/>
@@ -668,47 +614,6 @@
     </w:p>
     <w:p>
       <w:pPr>
-        <w:ind w:firstLine="602"/>
-        <w:jc w:val="center"/>
-        <w:outlineLvl w:val="0"/>
-        <w:rPr>
-          <w:rFonts w:cs="Times New Roman"/>
-          <w:sz w:val="30"/>
-          <w:szCs w:val="30"/>
-        </w:rPr>
-      </w:pPr>
-      <w:bookmarkStart w:id="11" w:name="_Toc145668913"/>
-      <w:bookmarkStart w:id="12" w:name="_Toc8847"/>
-      <w:bookmarkStart w:id="13" w:name="_Toc27032"/>
-      <w:bookmarkStart w:id="14" w:name="_Toc5204"/>
-      <w:bookmarkStart w:id="15" w:name="_Toc4672"/>
-      <w:bookmarkStart w:id="16" w:name="_Toc176436700"/>
-      <w:bookmarkStart w:id="17" w:name="_Toc161219786"/>
-      <w:bookmarkStart w:id="18" w:name="_Toc149655949"/>
-      <w:bookmarkStart w:id="19" w:name="_Toc175927248"/>
-      <w:bookmarkStart w:id="20" w:name="_Toc21806"/>
-      <w:r>
-        <w:rPr>
-          <w:rFonts w:cs="Times New Roman"/>
-          <w:b/>
-          <w:sz w:val="30"/>
-          <w:szCs w:val="30"/>
-        </w:rPr>
-        <w:t>三黍生物编制</w:t>
-      </w:r>
-      <w:bookmarkEnd w:id="11"/>
-      <w:bookmarkEnd w:id="12"/>
-      <w:bookmarkEnd w:id="13"/>
-      <w:bookmarkEnd w:id="14"/>
-      <w:bookmarkEnd w:id="15"/>
-      <w:bookmarkEnd w:id="16"/>
-      <w:bookmarkEnd w:id="17"/>
-      <w:bookmarkEnd w:id="18"/>
-      <w:bookmarkEnd w:id="19"/>
-      <w:bookmarkEnd w:id="20"/>
-    </w:p>
-    <w:p>
-      <w:pPr>
         <w:widowControl/>
         <w:ind w:firstLine="0" w:firstLineChars="0"/>
         <w:jc w:val="left"/>
@@ -736,6 +641,12 @@
           <w:footerReference r:id="rId9" w:type="even"/>
           <w:pgSz w:w="11906" w:h="16838"/>
           <w:pgMar w:top="1440" w:right="1080" w:bottom="1440" w:left="1080" w:header="851" w:footer="992" w:gutter="0"/>
+          <w:pgBorders>
+            <w:top w:val="none" w:sz="0" w:space="0"/>
+            <w:left w:val="none" w:sz="0" w:space="0"/>
+            <w:bottom w:val="none" w:sz="0" w:space="0"/>
+            <w:right w:val="none" w:sz="0" w:space="0"/>
+          </w:pgBorders>
           <w:cols w:space="425" w:num="1"/>
           <w:docGrid w:type="lines" w:linePitch="312" w:charSpace="0"/>
         </w:sectPr>
@@ -748,7 +659,7 @@
           <w:tab w:val="right" w:leader="dot" w:pos="8306"/>
         </w:tabs>
       </w:pPr>
-      <w:bookmarkStart w:id="21" w:name="_Toc21614"/>
+      <w:bookmarkStart w:id="11" w:name="_Toc21614"/>
       <w:r>
         <w:rPr>
           <w:rFonts w:eastAsia="宋体" w:cs="Times New Roman"/>
@@ -2992,10 +2903,13 @@
         <w:rPr>
           <w:rFonts w:hint="eastAsia"/>
         </w:rPr>
-        <w:t xml:space="preserve"> M</w:t>
-      </w:r>
-      <w:r>
-        <w:t>etagenomeSeq</w:t>
+        <w:t xml:space="preserve"> </w:t>
+      </w:r>
+      <w:r>
+        <w:rPr>
+          <w:rFonts w:hint="default" w:ascii="Times New Roman" w:hAnsi="Times New Roman" w:cs="Times New Roman"/>
+        </w:rPr>
+        <w:t>MetagenomeSeq</w:t>
       </w:r>
       <w:r>
         <w:rPr>
@@ -5926,15 +5840,15 @@
       <w:pPr>
         <w:pStyle w:val="40"/>
       </w:pPr>
-      <w:bookmarkStart w:id="22" w:name="_Toc2028"/>
+      <w:bookmarkStart w:id="12" w:name="_Toc2028"/>
       <w:r>
         <w:rPr>
           <w:rFonts w:hint="eastAsia"/>
         </w:rPr>
         <w:t>1. 项目介绍</w:t>
       </w:r>
-      <w:bookmarkEnd w:id="21"/>
-      <w:bookmarkEnd w:id="22"/>
+      <w:bookmarkEnd w:id="11"/>
+      <w:bookmarkEnd w:id="12"/>
     </w:p>
     <w:p>
       <w:pPr>
@@ -5944,30 +5858,30 @@
           <w:bCs/>
         </w:rPr>
       </w:pPr>
-      <w:bookmarkStart w:id="23" w:name="_Toc1041"/>
-      <w:bookmarkStart w:id="24" w:name="_Toc5664"/>
-      <w:bookmarkStart w:id="25" w:name="_Toc16130"/>
-      <w:bookmarkStart w:id="26" w:name="_Toc12468"/>
+      <w:bookmarkStart w:id="13" w:name="_Toc12468"/>
+      <w:bookmarkStart w:id="14" w:name="_Toc16130"/>
+      <w:bookmarkStart w:id="15" w:name="_Toc5664"/>
+      <w:bookmarkStart w:id="16" w:name="_Toc1041"/>
       <w:r>
         <w:rPr>
           <w:rFonts w:hint="eastAsia"/>
         </w:rPr>
         <w:t>宏基因组（Metagenomics），也称元基因组，利用新一代高通量测序技术（NGS）以特定环境下微生物群体基因组为研究对象，在分析微生物多样性、种群结构、进化关系的基础上，可进一步探究微生物群体功能活性、相互协作关系及与环境之间的关系，发掘潜在的生物学意义。与传统微生物研究方法相比，宏基因组测序技术规避了绝大部分微生物不能培养、痕量菌无法检测的缺点，因此近年来在环境微生物学研究中得到了广泛应用。</w:t>
       </w:r>
-      <w:bookmarkEnd w:id="23"/>
-      <w:bookmarkEnd w:id="24"/>
-      <w:bookmarkEnd w:id="25"/>
-      <w:bookmarkEnd w:id="26"/>
+      <w:bookmarkEnd w:id="13"/>
+      <w:bookmarkEnd w:id="14"/>
+      <w:bookmarkEnd w:id="15"/>
+      <w:bookmarkEnd w:id="16"/>
     </w:p>
     <w:p>
       <w:pPr>
         <w:pStyle w:val="40"/>
       </w:pPr>
-      <w:bookmarkStart w:id="27" w:name="_Toc21927"/>
-      <w:bookmarkStart w:id="28" w:name="_Toc6908"/>
-      <w:bookmarkStart w:id="29" w:name="_Toc5477"/>
-      <w:bookmarkStart w:id="30" w:name="_Toc8162"/>
-      <w:bookmarkStart w:id="31" w:name="_Toc1690"/>
+      <w:bookmarkStart w:id="17" w:name="_Toc8162"/>
+      <w:bookmarkStart w:id="18" w:name="_Toc1690"/>
+      <w:bookmarkStart w:id="19" w:name="_Toc21927"/>
+      <w:bookmarkStart w:id="20" w:name="_Toc5477"/>
+      <w:bookmarkStart w:id="21" w:name="_Toc6908"/>
       <w:r>
         <w:t>2.</w:t>
       </w:r>
@@ -5980,11 +5894,11 @@
       <w:r>
         <w:t>数据分析流程</w:t>
       </w:r>
-      <w:bookmarkEnd w:id="27"/>
-      <w:bookmarkEnd w:id="28"/>
-      <w:bookmarkEnd w:id="29"/>
-      <w:bookmarkEnd w:id="30"/>
-      <w:bookmarkEnd w:id="31"/>
+      <w:bookmarkEnd w:id="17"/>
+      <w:bookmarkEnd w:id="18"/>
+      <w:bookmarkEnd w:id="19"/>
+      <w:bookmarkEnd w:id="20"/>
+      <w:bookmarkEnd w:id="21"/>
     </w:p>
     <w:p>
       <w:pPr>
@@ -6000,7 +5914,7 @@
     </w:p>
     <w:p>
       <w:pPr>
-        <w:ind w:firstLine="199" w:firstLineChars="95"/>
+        <w:ind w:left="0" w:leftChars="0" w:firstLine="0" w:firstLineChars="0"/>
         <w:jc w:val="left"/>
       </w:pPr>
       <w:r>
@@ -6022,7 +5936,7 @@
                     </pic:cNvPicPr>
                   </pic:nvPicPr>
                   <pic:blipFill>
-                    <a:blip r:embed="rId16"/>
+                    <a:blip r:embed="rId15"/>
                     <a:stretch>
                       <a:fillRect/>
                     </a:stretch>
@@ -6047,10 +5961,10 @@
       <w:pPr>
         <w:pStyle w:val="40"/>
       </w:pPr>
-      <w:bookmarkStart w:id="32" w:name="_Toc202"/>
-      <w:bookmarkStart w:id="33" w:name="_Toc23315"/>
-      <w:bookmarkStart w:id="34" w:name="_Toc14568"/>
-      <w:bookmarkStart w:id="35" w:name="_Toc14998"/>
+      <w:bookmarkStart w:id="22" w:name="_Toc23315"/>
+      <w:bookmarkStart w:id="23" w:name="_Toc14998"/>
+      <w:bookmarkStart w:id="24" w:name="_Toc202"/>
+      <w:bookmarkStart w:id="25" w:name="_Toc14568"/>
       <w:r>
         <w:rPr>
           <w:rFonts w:hint="eastAsia"/>
@@ -6066,20 +5980,20 @@
         </w:rPr>
         <w:t>质控</w:t>
       </w:r>
-      <w:bookmarkEnd w:id="32"/>
-      <w:bookmarkEnd w:id="33"/>
-      <w:bookmarkEnd w:id="34"/>
-      <w:bookmarkEnd w:id="35"/>
+      <w:bookmarkEnd w:id="22"/>
+      <w:bookmarkEnd w:id="23"/>
+      <w:bookmarkEnd w:id="24"/>
+      <w:bookmarkEnd w:id="25"/>
     </w:p>
     <w:p>
       <w:pPr>
         <w:pStyle w:val="41"/>
       </w:pPr>
-      <w:bookmarkStart w:id="36" w:name="_Toc18673"/>
-      <w:bookmarkStart w:id="37" w:name="_Toc72"/>
-      <w:bookmarkStart w:id="38" w:name="_Toc20984"/>
-      <w:bookmarkStart w:id="39" w:name="_Toc7828"/>
-      <w:bookmarkStart w:id="40" w:name="_Toc10389"/>
+      <w:bookmarkStart w:id="26" w:name="_Toc18673"/>
+      <w:bookmarkStart w:id="27" w:name="_Toc7828"/>
+      <w:bookmarkStart w:id="28" w:name="_Toc72"/>
+      <w:bookmarkStart w:id="29" w:name="_Toc20984"/>
+      <w:bookmarkStart w:id="30" w:name="_Toc10389"/>
       <w:r>
         <w:t>3.1</w:t>
       </w:r>
@@ -6089,17 +6003,17 @@
         </w:rPr>
         <w:t xml:space="preserve"> </w:t>
       </w:r>
-      <w:bookmarkEnd w:id="36"/>
-      <w:bookmarkEnd w:id="37"/>
-      <w:bookmarkEnd w:id="38"/>
-      <w:bookmarkEnd w:id="39"/>
+      <w:bookmarkEnd w:id="26"/>
+      <w:bookmarkEnd w:id="27"/>
+      <w:bookmarkEnd w:id="28"/>
+      <w:bookmarkEnd w:id="29"/>
       <w:r>
         <w:rPr>
           <w:rFonts w:hint="eastAsia"/>
         </w:rPr>
         <w:t>测序结果格式介绍</w:t>
       </w:r>
-      <w:bookmarkEnd w:id="40"/>
+      <w:bookmarkEnd w:id="30"/>
     </w:p>
     <w:p>
       <w:pPr>
@@ -6170,7 +6084,7 @@
                     </pic:cNvPicPr>
                   </pic:nvPicPr>
                   <pic:blipFill>
-                    <a:blip r:embed="rId17">
+                    <a:blip r:embed="rId16">
                       <a:extLst>
                         <a:ext uri="{28A0092B-C50C-407E-A947-70E740481C1C}">
                           <a14:useLocalDpi xmlns:a14="http://schemas.microsoft.com/office/drawing/2010/main" val="0"/>
@@ -6236,7 +6150,7 @@
           <w:bCs w:val="0"/>
         </w:rPr>
       </w:pPr>
-      <w:bookmarkStart w:id="41" w:name="_Toc12965"/>
+      <w:bookmarkStart w:id="31" w:name="_Toc12965"/>
       <w:r>
         <w:rPr>
           <w:bCs w:val="0"/>
@@ -6262,7 +6176,7 @@
         </w:rPr>
         <w:t>测序碱基质量值</w:t>
       </w:r>
-      <w:bookmarkEnd w:id="41"/>
+      <w:bookmarkEnd w:id="31"/>
     </w:p>
     <w:p>
       <w:pPr>
@@ -6381,6 +6295,10 @@
         <w:tc>
           <w:tcPr>
             <w:tcW w:w="2765" w:type="dxa"/>
+            <w:tcBorders>
+              <w:top w:val="single" w:color="auto" w:sz="12" w:space="0"/>
+              <w:bottom w:val="single" w:color="auto" w:sz="6" w:space="0"/>
+            </w:tcBorders>
           </w:tcPr>
           <w:p>
             <w:pPr>
@@ -6398,6 +6316,10 @@
         <w:tc>
           <w:tcPr>
             <w:tcW w:w="2765" w:type="dxa"/>
+            <w:tcBorders>
+              <w:top w:val="single" w:color="auto" w:sz="12" w:space="0"/>
+              <w:bottom w:val="single" w:color="auto" w:sz="6" w:space="0"/>
+            </w:tcBorders>
           </w:tcPr>
           <w:p>
             <w:pPr>
@@ -6415,6 +6337,10 @@
         <w:tc>
           <w:tcPr>
             <w:tcW w:w="2766" w:type="dxa"/>
+            <w:tcBorders>
+              <w:top w:val="single" w:color="auto" w:sz="12" w:space="0"/>
+              <w:bottom w:val="single" w:color="auto" w:sz="6" w:space="0"/>
+            </w:tcBorders>
           </w:tcPr>
           <w:p>
             <w:pPr>
@@ -6451,7 +6377,8 @@
           <w:tcPr>
             <w:tcW w:w="2765" w:type="dxa"/>
             <w:tcBorders>
-              <w:top w:val="single" w:color="auto" w:sz="4" w:space="0"/>
+              <w:top w:val="single" w:color="auto" w:sz="6" w:space="0"/>
+              <w:bottom w:val="nil"/>
             </w:tcBorders>
           </w:tcPr>
           <w:p>
@@ -6468,7 +6395,8 @@
           <w:tcPr>
             <w:tcW w:w="2765" w:type="dxa"/>
             <w:tcBorders>
-              <w:top w:val="single" w:color="auto" w:sz="4" w:space="0"/>
+              <w:top w:val="single" w:color="auto" w:sz="6" w:space="0"/>
+              <w:bottom w:val="nil"/>
             </w:tcBorders>
           </w:tcPr>
           <w:p>
@@ -6485,7 +6413,8 @@
           <w:tcPr>
             <w:tcW w:w="2766" w:type="dxa"/>
             <w:tcBorders>
-              <w:top w:val="single" w:color="auto" w:sz="4" w:space="0"/>
+              <w:top w:val="single" w:color="auto" w:sz="6" w:space="0"/>
+              <w:bottom w:val="nil"/>
             </w:tcBorders>
           </w:tcPr>
           <w:p>
@@ -6519,6 +6448,10 @@
         <w:tc>
           <w:tcPr>
             <w:tcW w:w="2765" w:type="dxa"/>
+            <w:tcBorders>
+              <w:top w:val="nil"/>
+              <w:bottom w:val="nil"/>
+            </w:tcBorders>
           </w:tcPr>
           <w:p>
             <w:pPr>
@@ -6533,6 +6466,10 @@
         <w:tc>
           <w:tcPr>
             <w:tcW w:w="2765" w:type="dxa"/>
+            <w:tcBorders>
+              <w:top w:val="nil"/>
+              <w:bottom w:val="nil"/>
+            </w:tcBorders>
           </w:tcPr>
           <w:p>
             <w:pPr>
@@ -6547,6 +6484,10 @@
         <w:tc>
           <w:tcPr>
             <w:tcW w:w="2766" w:type="dxa"/>
+            <w:tcBorders>
+              <w:top w:val="nil"/>
+              <w:bottom w:val="nil"/>
+            </w:tcBorders>
           </w:tcPr>
           <w:p>
             <w:pPr>
@@ -6579,6 +6520,10 @@
         <w:tc>
           <w:tcPr>
             <w:tcW w:w="2765" w:type="dxa"/>
+            <w:tcBorders>
+              <w:top w:val="nil"/>
+              <w:bottom w:val="nil"/>
+            </w:tcBorders>
           </w:tcPr>
           <w:p>
             <w:pPr>
@@ -6593,6 +6538,10 @@
         <w:tc>
           <w:tcPr>
             <w:tcW w:w="2765" w:type="dxa"/>
+            <w:tcBorders>
+              <w:top w:val="nil"/>
+              <w:bottom w:val="nil"/>
+            </w:tcBorders>
           </w:tcPr>
           <w:p>
             <w:pPr>
@@ -6607,6 +6556,10 @@
         <w:tc>
           <w:tcPr>
             <w:tcW w:w="2766" w:type="dxa"/>
+            <w:tcBorders>
+              <w:top w:val="nil"/>
+              <w:bottom w:val="nil"/>
+            </w:tcBorders>
           </w:tcPr>
           <w:p>
             <w:pPr>
@@ -6639,6 +6592,10 @@
         <w:tc>
           <w:tcPr>
             <w:tcW w:w="2765" w:type="dxa"/>
+            <w:tcBorders>
+              <w:top w:val="nil"/>
+              <w:bottom w:val="single" w:color="auto" w:sz="12" w:space="0"/>
+            </w:tcBorders>
           </w:tcPr>
           <w:p>
             <w:pPr>
@@ -6653,6 +6610,10 @@
         <w:tc>
           <w:tcPr>
             <w:tcW w:w="2765" w:type="dxa"/>
+            <w:tcBorders>
+              <w:top w:val="nil"/>
+              <w:bottom w:val="single" w:color="auto" w:sz="12" w:space="0"/>
+            </w:tcBorders>
           </w:tcPr>
           <w:p>
             <w:pPr>
@@ -6667,6 +6628,10 @@
         <w:tc>
           <w:tcPr>
             <w:tcW w:w="2766" w:type="dxa"/>
+            <w:tcBorders>
+              <w:top w:val="nil"/>
+              <w:bottom w:val="single" w:color="auto" w:sz="12" w:space="0"/>
+            </w:tcBorders>
           </w:tcPr>
           <w:p>
             <w:pPr>
@@ -6693,7 +6658,7 @@
     </w:p>
     <w:p>
       <w:pPr>
-        <w:ind w:firstLine="420"/>
+        <w:ind w:left="0" w:leftChars="0" w:firstLine="0" w:firstLineChars="0"/>
         <w:jc w:val="center"/>
       </w:pPr>
       <w:r>
@@ -6719,7 +6684,7 @@
                     </pic:cNvPicPr>
                   </pic:nvPicPr>
                   <pic:blipFill>
-                    <a:blip r:embed="rId18">
+                    <a:blip r:embed="rId17">
                       <a:extLst>
                         <a:ext uri="{28A0092B-C50C-407E-A947-70E740481C1C}">
                           <a14:useLocalDpi xmlns:a14="http://schemas.microsoft.com/office/drawing/2010/main" val="0"/>
@@ -6816,7 +6781,7 @@
           <w:bCs w:val="0"/>
         </w:rPr>
       </w:pPr>
-      <w:bookmarkStart w:id="42" w:name="_Toc10496"/>
+      <w:bookmarkStart w:id="32" w:name="_Toc10496"/>
       <w:r>
         <w:rPr>
           <w:bCs w:val="0"/>
@@ -6830,7 +6795,7 @@
         </w:rPr>
         <w:t xml:space="preserve"> 测序碱基含量分布</w:t>
       </w:r>
-      <w:bookmarkEnd w:id="42"/>
+      <w:bookmarkEnd w:id="32"/>
     </w:p>
     <w:p>
       <w:pPr>
@@ -6856,7 +6821,7 @@
     </w:p>
     <w:p>
       <w:pPr>
-        <w:ind w:firstLine="420"/>
+        <w:ind w:left="0" w:leftChars="0" w:firstLine="0" w:firstLineChars="0"/>
         <w:jc w:val="center"/>
       </w:pPr>
       <w:r>
@@ -6882,7 +6847,7 @@
                     </pic:cNvPicPr>
                   </pic:nvPicPr>
                   <pic:blipFill>
-                    <a:blip r:embed="rId18">
+                    <a:blip r:embed="rId17">
                       <a:extLst>
                         <a:ext uri="{28A0092B-C50C-407E-A947-70E740481C1C}">
                           <a14:useLocalDpi xmlns:a14="http://schemas.microsoft.com/office/drawing/2010/main" val="0"/>
@@ -6979,11 +6944,11 @@
           <w:bCs w:val="0"/>
         </w:rPr>
       </w:pPr>
-      <w:bookmarkStart w:id="43" w:name="_Toc3267"/>
-      <w:bookmarkStart w:id="44" w:name="_Toc12145"/>
-      <w:bookmarkStart w:id="45" w:name="_Toc5694"/>
-      <w:bookmarkStart w:id="46" w:name="_Toc24347"/>
-      <w:bookmarkStart w:id="47" w:name="_Toc30154"/>
+      <w:bookmarkStart w:id="33" w:name="_Toc3267"/>
+      <w:bookmarkStart w:id="34" w:name="_Toc24347"/>
+      <w:bookmarkStart w:id="35" w:name="_Toc5694"/>
+      <w:bookmarkStart w:id="36" w:name="_Toc12145"/>
+      <w:bookmarkStart w:id="37" w:name="_Toc30154"/>
       <w:r>
         <w:rPr>
           <w:bCs w:val="0"/>
@@ -6997,11 +6962,11 @@
         </w:rPr>
         <w:t xml:space="preserve"> 数据处理过程和参数</w:t>
       </w:r>
-      <w:bookmarkEnd w:id="43"/>
-      <w:bookmarkEnd w:id="44"/>
-      <w:bookmarkEnd w:id="45"/>
-      <w:bookmarkEnd w:id="46"/>
-      <w:bookmarkEnd w:id="47"/>
+      <w:bookmarkEnd w:id="33"/>
+      <w:bookmarkEnd w:id="34"/>
+      <w:bookmarkEnd w:id="35"/>
+      <w:bookmarkEnd w:id="36"/>
+      <w:bookmarkEnd w:id="37"/>
     </w:p>
     <w:p>
       <w:pPr>
@@ -7141,8 +7106,8 @@
       <w:pPr>
         <w:pStyle w:val="41"/>
       </w:pPr>
-      <w:bookmarkStart w:id="48" w:name="_Toc143847364"/>
-      <w:bookmarkStart w:id="49" w:name="_Toc29637"/>
+      <w:bookmarkStart w:id="38" w:name="_Toc143847364"/>
+      <w:bookmarkStart w:id="39" w:name="_Toc29637"/>
       <w:r>
         <w:t>3.5</w:t>
       </w:r>
@@ -7155,8 +7120,8 @@
       <w:r>
         <w:t>数据质控与统计</w:t>
       </w:r>
-      <w:bookmarkEnd w:id="48"/>
-      <w:bookmarkEnd w:id="49"/>
+      <w:bookmarkEnd w:id="38"/>
+      <w:bookmarkEnd w:id="39"/>
     </w:p>
     <w:p>
       <w:pPr>
@@ -7194,7 +7159,7 @@
     </w:p>
     <w:p>
       <w:pPr>
-        <w:ind w:firstLine="420"/>
+        <w:ind w:left="0" w:leftChars="0" w:firstLine="0" w:firstLineChars="0"/>
         <w:jc w:val="center"/>
       </w:pPr>
       <w:r>
@@ -7220,7 +7185,7 @@
                     </pic:cNvPicPr>
                   </pic:nvPicPr>
                   <pic:blipFill>
-                    <a:blip r:embed="rId18">
+                    <a:blip r:embed="rId17">
                       <a:extLst>
                         <a:ext uri="{28A0092B-C50C-407E-A947-70E740481C1C}">
                           <a14:useLocalDpi xmlns:a14="http://schemas.microsoft.com/office/drawing/2010/main" val="0"/>
@@ -7264,7 +7229,7 @@
       <w:pPr>
         <w:ind w:firstLine="420"/>
         <w:rPr>
-          <w:rFonts w:cs="Times New Roman"/>
+          <w:rFonts w:hint="eastAsia" w:cs="Times New Roman"/>
           <w:color w:val="000000" w:themeColor="text1"/>
           <w14:textFill>
             <w14:solidFill>
@@ -7309,6 +7274,48 @@
         </w:rPr>
         <w:t>png</w:t>
       </w:r>
+    </w:p>
+    <w:p>
+      <w:pPr>
+        <w:ind w:firstLine="420"/>
+        <w:rPr>
+          <w:rFonts w:hint="eastAsia" w:cs="Times New Roman"/>
+          <w:color w:val="000000" w:themeColor="text1"/>
+          <w14:textFill>
+            <w14:solidFill>
+              <w14:schemeClr w14:val="tx1"/>
+            </w14:solidFill>
+          </w14:textFill>
+        </w:rPr>
+      </w:pPr>
+    </w:p>
+    <w:p>
+      <w:pPr>
+        <w:ind w:firstLine="420"/>
+        <w:rPr>
+          <w:rFonts w:hint="eastAsia" w:cs="Times New Roman"/>
+          <w:color w:val="000000" w:themeColor="text1"/>
+          <w14:textFill>
+            <w14:solidFill>
+              <w14:schemeClr w14:val="tx1"/>
+            </w14:solidFill>
+          </w14:textFill>
+        </w:rPr>
+      </w:pPr>
+    </w:p>
+    <w:p>
+      <w:pPr>
+        <w:ind w:firstLine="420"/>
+        <w:rPr>
+          <w:rFonts w:hint="eastAsia" w:cs="Times New Roman"/>
+          <w:color w:val="000000" w:themeColor="text1"/>
+          <w14:textFill>
+            <w14:solidFill>
+              <w14:schemeClr w14:val="tx1"/>
+            </w14:solidFill>
+          </w14:textFill>
+        </w:rPr>
+      </w:pPr>
     </w:p>
     <w:p>
       <w:pPr>
@@ -8486,7 +8493,7 @@
       <w:pPr>
         <w:pStyle w:val="40"/>
       </w:pPr>
-      <w:bookmarkStart w:id="50" w:name="_Toc26845"/>
+      <w:bookmarkStart w:id="40" w:name="_Toc26845"/>
       <w:r>
         <w:rPr>
           <w:rFonts w:hint="eastAsia"/>
@@ -8502,17 +8509,25 @@
         </w:rPr>
         <w:t>数据组装</w:t>
       </w:r>
-      <w:bookmarkEnd w:id="50"/>
-    </w:p>
-    <w:p>
-      <w:pPr>
-        <w:ind w:firstLine="420"/>
-      </w:pPr>
-      <w:r>
-        <w:rPr>
-          <w:rFonts w:hint="eastAsia"/>
-        </w:rPr>
-        <w:t>序列经过质控后，为了得到更为有效的基因组信息，并对序列进行更为准确的功能注释分析，需要进行宏基因组的组装分析。</w:t>
+      <w:bookmarkEnd w:id="40"/>
+    </w:p>
+    <w:p>
+      <w:pPr>
+        <w:ind w:firstLine="420"/>
+      </w:pPr>
+      <w:r>
+        <w:rPr>
+          <w:rFonts w:hint="eastAsia"/>
+        </w:rPr>
+        <w:t>序列经过质控后，为了得到更为有效的基因组信息，并对序</w:t>
+      </w:r>
+      <w:bookmarkStart w:id="199" w:name="_GoBack"/>
+      <w:bookmarkEnd w:id="199"/>
+      <w:r>
+        <w:rPr>
+          <w:rFonts w:hint="eastAsia"/>
+        </w:rPr>
+        <w:t>列进行更为准确的功能注释分析，需要进行宏基因组的组装分析。</w:t>
       </w:r>
     </w:p>
     <w:p>
@@ -8539,7 +8554,7 @@
     </w:p>
     <w:p>
       <w:pPr>
-        <w:ind w:firstLine="420"/>
+        <w:ind w:left="0" w:leftChars="0" w:firstLine="0" w:firstLineChars="0"/>
         <w:jc w:val="center"/>
       </w:pPr>
       <w:r>
@@ -8565,7 +8580,7 @@
                     </pic:cNvPicPr>
                   </pic:nvPicPr>
                   <pic:blipFill>
-                    <a:blip r:embed="rId18">
+                    <a:blip r:embed="rId17">
                       <a:extLst>
                         <a:ext uri="{28A0092B-C50C-407E-A947-70E740481C1C}">
                           <a14:useLocalDpi xmlns:a14="http://schemas.microsoft.com/office/drawing/2010/main" val="0"/>
@@ -8659,7 +8674,7 @@
       <w:pPr>
         <w:pStyle w:val="40"/>
       </w:pPr>
-      <w:bookmarkStart w:id="51" w:name="_Toc10298"/>
+      <w:bookmarkStart w:id="41" w:name="_Toc10298"/>
       <w:r>
         <w:t>5</w:t>
       </w:r>
@@ -8678,7 +8693,7 @@
         </w:rPr>
         <w:t>基因预测以及基因集构建</w:t>
       </w:r>
-      <w:bookmarkEnd w:id="51"/>
+      <w:bookmarkEnd w:id="41"/>
     </w:p>
     <w:p>
       <w:pPr>
@@ -8755,7 +8770,7 @@
     </w:p>
     <w:p>
       <w:pPr>
-        <w:ind w:firstLine="420"/>
+        <w:ind w:left="0" w:leftChars="0" w:firstLine="0" w:firstLineChars="0"/>
         <w:jc w:val="center"/>
       </w:pPr>
       <w:r>
@@ -8777,7 +8792,7 @@
                     </pic:cNvPicPr>
                   </pic:nvPicPr>
                   <pic:blipFill>
-                    <a:blip r:embed="rId19"/>
+                    <a:blip r:embed="rId18"/>
                     <a:stretch>
                       <a:fillRect/>
                     </a:stretch>
@@ -8802,7 +8817,7 @@
       <w:pPr>
         <w:pStyle w:val="41"/>
       </w:pPr>
-      <w:bookmarkStart w:id="52" w:name="_Toc30498"/>
+      <w:bookmarkStart w:id="42" w:name="_Toc30498"/>
       <w:r>
         <w:t xml:space="preserve">5.1 </w:t>
       </w:r>
@@ -8812,7 +8827,7 @@
         </w:rPr>
         <w:t>gene catalogue基本信息统计</w:t>
       </w:r>
-      <w:bookmarkEnd w:id="52"/>
+      <w:bookmarkEnd w:id="42"/>
     </w:p>
     <w:p>
       <w:pPr>
@@ -8827,7 +8842,7 @@
     </w:p>
     <w:p>
       <w:pPr>
-        <w:ind w:firstLine="420"/>
+        <w:ind w:left="0" w:leftChars="0" w:firstLine="0" w:firstLineChars="0"/>
         <w:jc w:val="center"/>
       </w:pPr>
       <w:r>
@@ -8853,7 +8868,7 @@
                     </pic:cNvPicPr>
                   </pic:nvPicPr>
                   <pic:blipFill>
-                    <a:blip r:embed="rId18">
+                    <a:blip r:embed="rId17">
                       <a:extLst>
                         <a:ext uri="{28A0092B-C50C-407E-A947-70E740481C1C}">
                           <a14:useLocalDpi xmlns:a14="http://schemas.microsoft.com/office/drawing/2010/main" val="0"/>
@@ -8935,7 +8950,7 @@
       <w:pPr>
         <w:pStyle w:val="41"/>
       </w:pPr>
-      <w:bookmarkStart w:id="53" w:name="_Toc26780"/>
+      <w:bookmarkStart w:id="43" w:name="_Toc26780"/>
       <w:r>
         <w:t xml:space="preserve">5.2 </w:t>
       </w:r>
@@ -8945,7 +8960,7 @@
         </w:rPr>
         <w:t>基于基因丰度的样品间相关性和韦恩分析</w:t>
       </w:r>
-      <w:bookmarkEnd w:id="53"/>
+      <w:bookmarkEnd w:id="43"/>
     </w:p>
     <w:p>
       <w:pPr>
@@ -8971,7 +8986,7 @@
     </w:p>
     <w:p>
       <w:pPr>
-        <w:ind w:firstLine="420"/>
+        <w:ind w:left="0" w:leftChars="0" w:firstLine="0" w:firstLineChars="0"/>
         <w:jc w:val="center"/>
       </w:pPr>
       <w:r>
@@ -9003,7 +9018,7 @@
                     </pic:cNvPicPr>
                   </pic:nvPicPr>
                   <pic:blipFill>
-                    <a:blip r:embed="rId20"/>
+                    <a:blip r:embed="rId19"/>
                     <a:stretch>
                       <a:fillRect/>
                     </a:stretch>
@@ -9086,7 +9101,7 @@
     </w:p>
     <w:p>
       <w:pPr>
-        <w:ind w:firstLine="420"/>
+        <w:ind w:left="0" w:leftChars="0" w:firstLine="0" w:firstLineChars="0"/>
         <w:jc w:val="center"/>
       </w:pPr>
       <w:r>
@@ -9118,7 +9133,7 @@
                     </pic:cNvPicPr>
                   </pic:nvPicPr>
                   <pic:blipFill>
-                    <a:blip r:embed="rId20"/>
+                    <a:blip r:embed="rId19"/>
                     <a:stretch>
                       <a:fillRect/>
                     </a:stretch>
@@ -9192,11 +9207,11 @@
       <w:pPr>
         <w:pStyle w:val="40"/>
       </w:pPr>
-      <w:bookmarkStart w:id="54" w:name="_Toc14195"/>
-      <w:bookmarkStart w:id="55" w:name="_Toc20388"/>
-      <w:bookmarkStart w:id="56" w:name="_Toc27566"/>
-      <w:bookmarkStart w:id="57" w:name="_Toc25884"/>
-      <w:bookmarkStart w:id="58" w:name="_Toc10762"/>
+      <w:bookmarkStart w:id="44" w:name="_Toc10762"/>
+      <w:bookmarkStart w:id="45" w:name="_Toc20388"/>
+      <w:bookmarkStart w:id="46" w:name="_Toc14195"/>
+      <w:bookmarkStart w:id="47" w:name="_Toc25884"/>
+      <w:bookmarkStart w:id="48" w:name="_Toc27566"/>
       <w:r>
         <w:t>6</w:t>
       </w:r>
@@ -9215,11 +9230,11 @@
         </w:rPr>
         <w:t>物种组成及丰度分析</w:t>
       </w:r>
-      <w:bookmarkEnd w:id="54"/>
-      <w:bookmarkEnd w:id="55"/>
-      <w:bookmarkEnd w:id="56"/>
-      <w:bookmarkEnd w:id="57"/>
-      <w:bookmarkEnd w:id="58"/>
+      <w:bookmarkEnd w:id="44"/>
+      <w:bookmarkEnd w:id="45"/>
+      <w:bookmarkEnd w:id="46"/>
+      <w:bookmarkEnd w:id="47"/>
+      <w:bookmarkEnd w:id="48"/>
     </w:p>
     <w:p>
       <w:pPr>
@@ -9278,7 +9293,7 @@
       <w:pPr>
         <w:pStyle w:val="41"/>
       </w:pPr>
-      <w:bookmarkStart w:id="59" w:name="_Toc21213"/>
+      <w:bookmarkStart w:id="49" w:name="_Toc21213"/>
       <w:r>
         <w:t xml:space="preserve">6.1 </w:t>
       </w:r>
@@ -9288,7 +9303,7 @@
         </w:rPr>
         <w:t>物种组成分析</w:t>
       </w:r>
-      <w:bookmarkEnd w:id="59"/>
+      <w:bookmarkEnd w:id="49"/>
     </w:p>
     <w:p>
       <w:pPr>
@@ -9365,7 +9380,7 @@
       <w:pPr>
         <w:pStyle w:val="41"/>
       </w:pPr>
-      <w:bookmarkStart w:id="60" w:name="_Toc17663"/>
+      <w:bookmarkStart w:id="50" w:name="_Toc17663"/>
       <w:r>
         <w:t xml:space="preserve">6.2 </w:t>
       </w:r>
@@ -9375,7 +9390,7 @@
         </w:rPr>
         <w:t>注释分析</w:t>
       </w:r>
-      <w:bookmarkEnd w:id="60"/>
+      <w:bookmarkEnd w:id="50"/>
     </w:p>
     <w:p>
       <w:pPr>
@@ -9394,7 +9409,20 @@
         <w:rPr>
           <w:rFonts w:hint="eastAsia" w:cs="Times New Roman"/>
         </w:rPr>
-        <w:t>（kingdom）</w:t>
+        <w:t>（</w:t>
+      </w:r>
+      <w:r>
+        <w:rPr>
+          <w:rFonts w:hint="eastAsia" w:cs="Times New Roman"/>
+          <w:lang w:val="en-US" w:eastAsia="zh-CN"/>
+        </w:rPr>
+        <w:t>K</w:t>
+      </w:r>
+      <w:r>
+        <w:rPr>
+          <w:rFonts w:hint="eastAsia" w:cs="Times New Roman"/>
+        </w:rPr>
+        <w:t>ingdom）</w:t>
       </w:r>
       <w:r>
         <w:rPr>
@@ -9568,7 +9596,6 @@
       <w:pPr>
         <w:pStyle w:val="32"/>
         <w:spacing w:line="360" w:lineRule="auto"/>
-        <w:ind w:firstLine="420" w:firstLineChars="200"/>
         <w:jc w:val="center"/>
       </w:pPr>
       <w:r>
@@ -9590,7 +9617,7 @@
                     </pic:cNvPicPr>
                   </pic:nvPicPr>
                   <pic:blipFill>
-                    <a:blip r:embed="rId21"/>
+                    <a:blip r:embed="rId20"/>
                     <a:stretch>
                       <a:fillRect/>
                     </a:stretch>
@@ -9678,11 +9705,11 @@
       <w:pPr>
         <w:pStyle w:val="41"/>
       </w:pPr>
-      <w:bookmarkStart w:id="61" w:name="_Toc1294"/>
-      <w:bookmarkStart w:id="62" w:name="_Toc17445"/>
-      <w:bookmarkStart w:id="63" w:name="_Toc19702"/>
-      <w:bookmarkStart w:id="64" w:name="_Toc3516"/>
-      <w:bookmarkStart w:id="65" w:name="_Toc26806"/>
+      <w:bookmarkStart w:id="51" w:name="_Toc3516"/>
+      <w:bookmarkStart w:id="52" w:name="_Toc1294"/>
+      <w:bookmarkStart w:id="53" w:name="_Toc26806"/>
+      <w:bookmarkStart w:id="54" w:name="_Toc17445"/>
+      <w:bookmarkStart w:id="55" w:name="_Toc19702"/>
       <w:r>
         <w:t>6.3</w:t>
       </w:r>
@@ -9695,11 +9722,11 @@
       <w:r>
         <w:t>物种组成柱状图</w:t>
       </w:r>
-      <w:bookmarkEnd w:id="61"/>
-      <w:bookmarkEnd w:id="62"/>
-      <w:bookmarkEnd w:id="63"/>
-      <w:bookmarkEnd w:id="64"/>
-      <w:bookmarkEnd w:id="65"/>
+      <w:bookmarkEnd w:id="51"/>
+      <w:bookmarkEnd w:id="52"/>
+      <w:bookmarkEnd w:id="53"/>
+      <w:bookmarkEnd w:id="54"/>
+      <w:bookmarkEnd w:id="55"/>
     </w:p>
     <w:p>
       <w:pPr>
@@ -9772,7 +9799,7 @@
     <w:p>
       <w:pPr>
         <w:widowControl/>
-        <w:ind w:firstLine="420"/>
+        <w:ind w:left="0" w:leftChars="0" w:firstLine="0" w:firstLineChars="0"/>
         <w:jc w:val="center"/>
         <w:rPr>
           <w:rFonts w:cs="Times New Roman"/>
@@ -9808,7 +9835,7 @@
                     </pic:cNvPicPr>
                   </pic:nvPicPr>
                   <pic:blipFill>
-                    <a:blip r:embed="rId20"/>
+                    <a:blip r:embed="rId19"/>
                     <a:stretch>
                       <a:fillRect/>
                     </a:stretch>
@@ -9850,10 +9877,10 @@
           </w14:textFill>
         </w:rPr>
       </w:pPr>
-      <w:bookmarkStart w:id="66" w:name="_Toc26174"/>
-      <w:bookmarkStart w:id="67" w:name="_Toc6261"/>
-      <w:bookmarkStart w:id="68" w:name="_Toc1589"/>
-      <w:bookmarkStart w:id="69" w:name="_Toc6862"/>
+      <w:bookmarkStart w:id="56" w:name="_Toc26174"/>
+      <w:bookmarkStart w:id="57" w:name="_Toc1589"/>
+      <w:bookmarkStart w:id="58" w:name="_Toc6862"/>
+      <w:bookmarkStart w:id="59" w:name="_Toc6261"/>
       <w:r>
         <w:rPr>
           <w:rFonts w:hint="eastAsia" w:cs="Times New Roman"/>
@@ -9883,7 +9910,7 @@
       <w:pPr>
         <w:pStyle w:val="41"/>
       </w:pPr>
-      <w:bookmarkStart w:id="70" w:name="_Toc28007"/>
+      <w:bookmarkStart w:id="60" w:name="_Toc28007"/>
       <w:r>
         <w:t>6.4</w:t>
       </w:r>
@@ -9893,11 +9920,11 @@
         </w:rPr>
         <w:t xml:space="preserve"> UPGMA聚类树与柱状图结合绘图</w:t>
       </w:r>
-      <w:bookmarkEnd w:id="66"/>
-      <w:bookmarkEnd w:id="67"/>
-      <w:bookmarkEnd w:id="68"/>
-      <w:bookmarkEnd w:id="69"/>
-      <w:bookmarkEnd w:id="70"/>
+      <w:bookmarkEnd w:id="56"/>
+      <w:bookmarkEnd w:id="57"/>
+      <w:bookmarkEnd w:id="58"/>
+      <w:bookmarkEnd w:id="59"/>
+      <w:bookmarkEnd w:id="60"/>
     </w:p>
     <w:p>
       <w:pPr>
@@ -9997,7 +10024,7 @@
     <w:p>
       <w:pPr>
         <w:widowControl/>
-        <w:ind w:firstLine="420"/>
+        <w:ind w:left="0" w:leftChars="0" w:firstLine="0" w:firstLineChars="0"/>
         <w:jc w:val="center"/>
         <w:rPr>
           <w:rFonts w:cs="Times New Roman"/>
@@ -10033,7 +10060,7 @@
                     </pic:cNvPicPr>
                   </pic:nvPicPr>
                   <pic:blipFill>
-                    <a:blip r:embed="rId20"/>
+                    <a:blip r:embed="rId19"/>
                     <a:stretch>
                       <a:fillRect/>
                     </a:stretch>
@@ -10075,14 +10102,14 @@
           </w14:textFill>
         </w:rPr>
       </w:pPr>
-      <w:bookmarkStart w:id="71" w:name="_Toc6742"/>
-      <w:bookmarkStart w:id="72" w:name="_Toc666"/>
-      <w:bookmarkStart w:id="73" w:name="_Toc28927"/>
-      <w:bookmarkStart w:id="74" w:name="_Toc29843"/>
-      <w:bookmarkStart w:id="75" w:name="_Toc31760"/>
-      <w:bookmarkStart w:id="76" w:name="_Toc22802"/>
-      <w:bookmarkStart w:id="77" w:name="_Toc5001"/>
-      <w:bookmarkStart w:id="78" w:name="_Toc22594"/>
+      <w:bookmarkStart w:id="61" w:name="_Toc666"/>
+      <w:bookmarkStart w:id="62" w:name="_Toc29843"/>
+      <w:bookmarkStart w:id="63" w:name="_Toc6742"/>
+      <w:bookmarkStart w:id="64" w:name="_Toc28927"/>
+      <w:bookmarkStart w:id="65" w:name="_Toc22802"/>
+      <w:bookmarkStart w:id="66" w:name="_Toc31760"/>
+      <w:bookmarkStart w:id="67" w:name="_Toc5001"/>
+      <w:bookmarkStart w:id="68" w:name="_Toc22594"/>
       <w:r>
         <w:rPr>
           <w:rFonts w:hint="eastAsia" w:cs="Times New Roman"/>
@@ -10112,7 +10139,7 @@
       <w:pPr>
         <w:pStyle w:val="41"/>
       </w:pPr>
-      <w:bookmarkStart w:id="79" w:name="_Toc10435"/>
+      <w:bookmarkStart w:id="69" w:name="_Toc10435"/>
       <w:r>
         <w:t>6.5</w:t>
       </w:r>
@@ -10125,11 +10152,11 @@
       <w:r>
         <w:t>物种组成聚类热图</w:t>
       </w:r>
-      <w:bookmarkEnd w:id="71"/>
-      <w:bookmarkEnd w:id="72"/>
-      <w:bookmarkEnd w:id="73"/>
-      <w:bookmarkEnd w:id="74"/>
-      <w:bookmarkEnd w:id="79"/>
+      <w:bookmarkEnd w:id="61"/>
+      <w:bookmarkEnd w:id="62"/>
+      <w:bookmarkEnd w:id="63"/>
+      <w:bookmarkEnd w:id="64"/>
+      <w:bookmarkEnd w:id="69"/>
     </w:p>
     <w:p>
       <w:pPr>
@@ -10229,7 +10256,11 @@
     <w:p>
       <w:pPr>
         <w:widowControl/>
-        <w:ind w:firstLine="420"/>
+        <w:tabs>
+          <w:tab w:val="left" w:pos="992"/>
+          <w:tab w:val="center" w:pos="4423"/>
+        </w:tabs>
+        <w:ind w:left="0" w:leftChars="0" w:firstLine="0" w:firstLineChars="0"/>
         <w:jc w:val="center"/>
         <w:rPr>
           <w:rFonts w:cs="Times New Roman"/>
@@ -10265,7 +10296,7 @@
                     </pic:cNvPicPr>
                   </pic:nvPicPr>
                   <pic:blipFill>
-                    <a:blip r:embed="rId20"/>
+                    <a:blip r:embed="rId19"/>
                     <a:stretch>
                       <a:fillRect/>
                     </a:stretch>
@@ -10336,7 +10367,7 @@
       <w:pPr>
         <w:pStyle w:val="41"/>
       </w:pPr>
-      <w:bookmarkStart w:id="80" w:name="_Toc3987"/>
+      <w:bookmarkStart w:id="70" w:name="_Toc3987"/>
       <w:r>
         <w:t>6.6</w:t>
       </w:r>
@@ -10346,20 +10377,20 @@
         </w:rPr>
         <w:t xml:space="preserve"> 基于物种丰度的降维分析</w:t>
       </w:r>
-      <w:bookmarkEnd w:id="80"/>
-    </w:p>
-    <w:bookmarkEnd w:id="75"/>
-    <w:bookmarkEnd w:id="76"/>
-    <w:bookmarkEnd w:id="77"/>
-    <w:bookmarkEnd w:id="78"/>
+      <w:bookmarkEnd w:id="70"/>
+    </w:p>
+    <w:bookmarkEnd w:id="65"/>
+    <w:bookmarkEnd w:id="66"/>
+    <w:bookmarkEnd w:id="67"/>
+    <w:bookmarkEnd w:id="68"/>
     <w:p>
       <w:pPr>
         <w:pStyle w:val="43"/>
       </w:pPr>
-      <w:bookmarkStart w:id="81" w:name="_Toc7803"/>
-      <w:bookmarkStart w:id="82" w:name="_Toc24094"/>
-      <w:bookmarkStart w:id="83" w:name="_Toc4343"/>
-      <w:bookmarkStart w:id="84" w:name="_Toc3482"/>
+      <w:bookmarkStart w:id="71" w:name="_Toc7803"/>
+      <w:bookmarkStart w:id="72" w:name="_Toc3482"/>
+      <w:bookmarkStart w:id="73" w:name="_Toc4343"/>
+      <w:bookmarkStart w:id="74" w:name="_Toc24094"/>
       <w:r>
         <w:rPr>
           <w:rFonts w:hint="eastAsia"/>
@@ -10369,10 +10400,10 @@
       <w:r>
         <w:t>6.1 PCA分析</w:t>
       </w:r>
-      <w:bookmarkEnd w:id="81"/>
-      <w:bookmarkEnd w:id="82"/>
-      <w:bookmarkEnd w:id="83"/>
-      <w:bookmarkEnd w:id="84"/>
+      <w:bookmarkEnd w:id="71"/>
+      <w:bookmarkEnd w:id="72"/>
+      <w:bookmarkEnd w:id="73"/>
+      <w:bookmarkEnd w:id="74"/>
     </w:p>
     <w:p>
       <w:pPr>
@@ -10426,7 +10457,7 @@
     <w:p>
       <w:pPr>
         <w:widowControl/>
-        <w:ind w:firstLine="420"/>
+        <w:ind w:left="0" w:leftChars="0" w:firstLine="0" w:firstLineChars="0"/>
         <w:jc w:val="center"/>
         <w:rPr>
           <w:rFonts w:cs="Times New Roman"/>
@@ -10462,7 +10493,7 @@
                     </pic:cNvPicPr>
                   </pic:nvPicPr>
                   <pic:blipFill>
-                    <a:blip r:embed="rId20"/>
+                    <a:blip r:embed="rId19"/>
                     <a:stretch>
                       <a:fillRect/>
                     </a:stretch>
@@ -10504,10 +10535,10 @@
           </w14:textFill>
         </w:rPr>
       </w:pPr>
-      <w:bookmarkStart w:id="85" w:name="_Toc18116"/>
-      <w:bookmarkStart w:id="86" w:name="_Toc1873"/>
-      <w:bookmarkStart w:id="87" w:name="_Toc17711"/>
-      <w:bookmarkStart w:id="88" w:name="_Toc21078"/>
+      <w:bookmarkStart w:id="75" w:name="_Toc21078"/>
+      <w:bookmarkStart w:id="76" w:name="_Toc1873"/>
+      <w:bookmarkStart w:id="77" w:name="_Toc17711"/>
+      <w:bookmarkStart w:id="78" w:name="_Toc18116"/>
       <w:r>
         <w:rPr>
           <w:rFonts w:hint="eastAsia" w:cs="Times New Roman"/>
@@ -10543,7 +10574,7 @@
           <w:bCs w:val="0"/>
         </w:rPr>
       </w:pPr>
-      <w:bookmarkStart w:id="89" w:name="_Toc939"/>
+      <w:bookmarkStart w:id="79" w:name="_Toc939"/>
       <w:r>
         <w:rPr>
           <w:rFonts w:hint="eastAsia"/>
@@ -10566,11 +10597,11 @@
         </w:rPr>
         <w:t xml:space="preserve"> PCoA分析</w:t>
       </w:r>
-      <w:bookmarkEnd w:id="85"/>
-      <w:bookmarkEnd w:id="86"/>
-      <w:bookmarkEnd w:id="87"/>
-      <w:bookmarkEnd w:id="88"/>
-      <w:bookmarkEnd w:id="89"/>
+      <w:bookmarkEnd w:id="75"/>
+      <w:bookmarkEnd w:id="76"/>
+      <w:bookmarkEnd w:id="77"/>
+      <w:bookmarkEnd w:id="78"/>
+      <w:bookmarkEnd w:id="79"/>
     </w:p>
     <w:p>
       <w:pPr>
@@ -10675,7 +10706,7 @@
     <w:p>
       <w:pPr>
         <w:widowControl/>
-        <w:ind w:firstLine="420"/>
+        <w:ind w:left="0" w:leftChars="0" w:firstLine="0" w:firstLineChars="0"/>
         <w:jc w:val="center"/>
         <w:rPr>
           <w:rFonts w:cs="Times New Roman"/>
@@ -10711,7 +10742,7 @@
                     </pic:cNvPicPr>
                   </pic:nvPicPr>
                   <pic:blipFill>
-                    <a:blip r:embed="rId20"/>
+                    <a:blip r:embed="rId19"/>
                     <a:stretch>
                       <a:fillRect/>
                     </a:stretch>
@@ -10753,10 +10784,10 @@
           </w14:textFill>
         </w:rPr>
       </w:pPr>
-      <w:bookmarkStart w:id="90" w:name="_Toc15026"/>
-      <w:bookmarkStart w:id="91" w:name="_Toc8350"/>
-      <w:bookmarkStart w:id="92" w:name="_Toc7221"/>
-      <w:bookmarkStart w:id="93" w:name="_Toc9709"/>
+      <w:bookmarkStart w:id="80" w:name="_Toc15026"/>
+      <w:bookmarkStart w:id="81" w:name="_Toc8350"/>
+      <w:bookmarkStart w:id="82" w:name="_Toc9709"/>
+      <w:bookmarkStart w:id="83" w:name="_Toc7221"/>
       <w:r>
         <w:rPr>
           <w:rFonts w:hint="eastAsia" w:cs="Times New Roman"/>
@@ -10792,7 +10823,7 @@
           <w:bCs w:val="0"/>
         </w:rPr>
       </w:pPr>
-      <w:bookmarkStart w:id="94" w:name="_Toc5180"/>
+      <w:bookmarkStart w:id="84" w:name="_Toc5180"/>
       <w:r>
         <w:rPr>
           <w:rFonts w:hint="eastAsia"/>
@@ -10815,11 +10846,11 @@
         </w:rPr>
         <w:t xml:space="preserve"> NMDS分析</w:t>
       </w:r>
-      <w:bookmarkEnd w:id="90"/>
-      <w:bookmarkEnd w:id="91"/>
-      <w:bookmarkEnd w:id="92"/>
-      <w:bookmarkEnd w:id="93"/>
-      <w:bookmarkEnd w:id="94"/>
+      <w:bookmarkEnd w:id="80"/>
+      <w:bookmarkEnd w:id="81"/>
+      <w:bookmarkEnd w:id="82"/>
+      <w:bookmarkEnd w:id="83"/>
+      <w:bookmarkEnd w:id="84"/>
     </w:p>
     <w:p>
       <w:pPr>
@@ -10930,7 +10961,7 @@
     <w:p>
       <w:pPr>
         <w:widowControl/>
-        <w:ind w:firstLine="420"/>
+        <w:ind w:left="0" w:leftChars="0" w:firstLine="0" w:firstLineChars="0"/>
         <w:jc w:val="center"/>
         <w:rPr>
           <w:rFonts w:cs="Times New Roman"/>
@@ -10966,7 +10997,7 @@
                     </pic:cNvPicPr>
                   </pic:nvPicPr>
                   <pic:blipFill>
-                    <a:blip r:embed="rId20"/>
+                    <a:blip r:embed="rId19"/>
                     <a:stretch>
                       <a:fillRect/>
                     </a:stretch>
@@ -11008,10 +11039,10 @@
           </w14:textFill>
         </w:rPr>
       </w:pPr>
-      <w:bookmarkStart w:id="95" w:name="_Toc13031"/>
-      <w:bookmarkStart w:id="96" w:name="_Toc10335"/>
-      <w:bookmarkStart w:id="97" w:name="_Toc10329"/>
-      <w:bookmarkStart w:id="98" w:name="_Toc31954"/>
+      <w:bookmarkStart w:id="85" w:name="_Toc31954"/>
+      <w:bookmarkStart w:id="86" w:name="_Toc10335"/>
+      <w:bookmarkStart w:id="87" w:name="_Toc13031"/>
+      <w:bookmarkStart w:id="88" w:name="_Toc10329"/>
       <w:r>
         <w:rPr>
           <w:rFonts w:hint="eastAsia" w:cs="Times New Roman"/>
@@ -11045,7 +11076,7 @@
           <w:lang w:val="en-US" w:eastAsia="zh-CN"/>
         </w:rPr>
       </w:pPr>
-      <w:bookmarkStart w:id="99" w:name="_Toc10407"/>
+      <w:bookmarkStart w:id="89" w:name="_Toc10407"/>
       <w:r>
         <w:rPr>
           <w:rFonts w:hint="eastAsia"/>
@@ -11060,7 +11091,7 @@
         </w:rPr>
         <w:t>.Alpha多样性分析</w:t>
       </w:r>
-      <w:bookmarkEnd w:id="99"/>
+      <w:bookmarkEnd w:id="89"/>
     </w:p>
     <w:p>
       <w:pPr>
@@ -11073,7 +11104,7 @@
           <w:lang w:val="en-US" w:eastAsia="zh-CN"/>
         </w:rPr>
       </w:pPr>
-      <w:bookmarkStart w:id="100" w:name="_Toc13054"/>
+      <w:bookmarkStart w:id="90" w:name="_Toc13054"/>
       <w:r>
         <w:rPr>
           <w:rFonts w:hint="eastAsia"/>
@@ -11081,7 +11112,7 @@
         </w:rPr>
         <w:t>6.7.1 多样性指数统计</w:t>
       </w:r>
-      <w:bookmarkEnd w:id="100"/>
+      <w:bookmarkEnd w:id="90"/>
     </w:p>
     <w:p>
       <w:pPr>
@@ -11281,7 +11312,7 @@
           </w14:textFill>
         </w:rPr>
       </w:pPr>
-      <w:bookmarkStart w:id="101" w:name="_Toc12132"/>
+      <w:bookmarkStart w:id="91" w:name="_Toc12132"/>
       <w:r>
         <w:rPr>
           <w:rFonts w:hint="eastAsia"/>
@@ -11289,7 +11320,7 @@
         </w:rPr>
         <w:t>6.7.2 多样性指数差异分析</w:t>
       </w:r>
-      <w:bookmarkEnd w:id="101"/>
+      <w:bookmarkEnd w:id="91"/>
     </w:p>
     <w:p>
       <w:pPr>
@@ -11385,7 +11416,7 @@
                     </pic:cNvPicPr>
                   </pic:nvPicPr>
                   <pic:blipFill>
-                    <a:blip r:embed="rId20"/>
+                    <a:blip r:embed="rId19"/>
                     <a:stretch>
                       <a:fillRect/>
                     </a:stretch>
@@ -11478,7 +11509,7 @@
       <w:pPr>
         <w:pStyle w:val="40"/>
       </w:pPr>
-      <w:bookmarkStart w:id="102" w:name="_Toc20832"/>
+      <w:bookmarkStart w:id="92" w:name="_Toc20832"/>
       <w:r>
         <w:rPr>
           <w:rFonts w:hint="eastAsia"/>
@@ -11489,36 +11520,36 @@
       <w:r>
         <w:t>. 差异分析</w:t>
       </w:r>
+      <w:bookmarkEnd w:id="85"/>
+      <w:bookmarkEnd w:id="86"/>
+      <w:bookmarkEnd w:id="87"/>
+      <w:bookmarkEnd w:id="88"/>
+      <w:bookmarkEnd w:id="92"/>
+    </w:p>
+    <w:p>
+      <w:pPr>
+        <w:pStyle w:val="41"/>
+      </w:pPr>
+      <w:bookmarkStart w:id="93" w:name="_Toc30386"/>
+      <w:bookmarkStart w:id="94" w:name="_Toc10644"/>
+      <w:bookmarkStart w:id="95" w:name="_Toc1528"/>
+      <w:bookmarkStart w:id="96" w:name="_Toc21158"/>
+      <w:bookmarkStart w:id="97" w:name="_Toc19923"/>
+      <w:r>
+        <w:rPr>
+          <w:rFonts w:hint="eastAsia"/>
+          <w:lang w:val="en-US" w:eastAsia="zh-CN"/>
+        </w:rPr>
+        <w:t>7</w:t>
+      </w:r>
+      <w:r>
+        <w:t>.1 ANOVA分析</w:t>
+      </w:r>
+      <w:bookmarkEnd w:id="93"/>
+      <w:bookmarkEnd w:id="94"/>
       <w:bookmarkEnd w:id="95"/>
       <w:bookmarkEnd w:id="96"/>
       <w:bookmarkEnd w:id="97"/>
-      <w:bookmarkEnd w:id="98"/>
-      <w:bookmarkEnd w:id="102"/>
-    </w:p>
-    <w:p>
-      <w:pPr>
-        <w:pStyle w:val="41"/>
-      </w:pPr>
-      <w:bookmarkStart w:id="103" w:name="_Toc21158"/>
-      <w:bookmarkStart w:id="104" w:name="_Toc30386"/>
-      <w:bookmarkStart w:id="105" w:name="_Toc1528"/>
-      <w:bookmarkStart w:id="106" w:name="_Toc10644"/>
-      <w:bookmarkStart w:id="107" w:name="_Toc19923"/>
-      <w:r>
-        <w:rPr>
-          <w:rFonts w:hint="eastAsia"/>
-          <w:lang w:val="en-US" w:eastAsia="zh-CN"/>
-        </w:rPr>
-        <w:t>7</w:t>
-      </w:r>
-      <w:r>
-        <w:t>.1 ANOVA分析</w:t>
-      </w:r>
-      <w:bookmarkEnd w:id="103"/>
-      <w:bookmarkEnd w:id="104"/>
-      <w:bookmarkEnd w:id="105"/>
-      <w:bookmarkEnd w:id="106"/>
-      <w:bookmarkEnd w:id="107"/>
     </w:p>
     <w:p>
       <w:pPr>
@@ -11567,7 +11598,7 @@
     </w:p>
     <w:p>
       <w:pPr>
-        <w:ind w:firstLine="420"/>
+        <w:ind w:left="0" w:leftChars="0" w:firstLine="0" w:firstLineChars="0"/>
         <w:jc w:val="center"/>
         <w:rPr>
           <w:rFonts w:cs="Times New Roman"/>
@@ -11603,7 +11634,7 @@
                     </pic:cNvPicPr>
                   </pic:nvPicPr>
                   <pic:blipFill>
-                    <a:blip r:embed="rId20"/>
+                    <a:blip r:embed="rId19"/>
                     <a:stretch>
                       <a:fillRect/>
                     </a:stretch>
@@ -11648,11 +11679,11 @@
           </w14:textFill>
         </w:rPr>
       </w:pPr>
-      <w:bookmarkStart w:id="108" w:name="_Toc12933"/>
-      <w:bookmarkStart w:id="109" w:name="_Toc17804"/>
-      <w:bookmarkStart w:id="110" w:name="_Toc24646"/>
-      <w:bookmarkStart w:id="111" w:name="_Toc15665"/>
-      <w:bookmarkStart w:id="112" w:name="_Hlk141098520"/>
+      <w:bookmarkStart w:id="98" w:name="_Toc15665"/>
+      <w:bookmarkStart w:id="99" w:name="_Toc12933"/>
+      <w:bookmarkStart w:id="100" w:name="_Toc17804"/>
+      <w:bookmarkStart w:id="101" w:name="_Toc24646"/>
+      <w:bookmarkStart w:id="102" w:name="_Hlk141098520"/>
       <w:r>
         <w:rPr>
           <w:rFonts w:hint="eastAsia" w:cs="Times New Roman"/>
@@ -11707,7 +11738,7 @@
       <w:pPr>
         <w:pStyle w:val="41"/>
       </w:pPr>
-      <w:bookmarkStart w:id="113" w:name="_Toc7022"/>
+      <w:bookmarkStart w:id="103" w:name="_Toc7022"/>
       <w:r>
         <w:rPr>
           <w:rFonts w:hint="eastAsia"/>
@@ -11724,11 +11755,11 @@
         </w:rPr>
         <w:t>秩和检验</w:t>
       </w:r>
-      <w:bookmarkEnd w:id="108"/>
-      <w:bookmarkEnd w:id="109"/>
-      <w:bookmarkEnd w:id="110"/>
-      <w:bookmarkEnd w:id="111"/>
-      <w:bookmarkEnd w:id="113"/>
+      <w:bookmarkEnd w:id="98"/>
+      <w:bookmarkEnd w:id="99"/>
+      <w:bookmarkEnd w:id="100"/>
+      <w:bookmarkEnd w:id="101"/>
+      <w:bookmarkEnd w:id="103"/>
     </w:p>
     <w:p>
       <w:pPr>
@@ -11761,7 +11792,7 @@
     </w:p>
     <w:p>
       <w:pPr>
-        <w:ind w:firstLine="420"/>
+        <w:ind w:left="0" w:leftChars="0" w:firstLine="0" w:firstLineChars="0"/>
         <w:jc w:val="center"/>
         <w:rPr>
           <w:rFonts w:cs="Times New Roman"/>
@@ -11797,7 +11828,7 @@
                     </pic:cNvPicPr>
                   </pic:nvPicPr>
                   <pic:blipFill>
-                    <a:blip r:embed="rId20"/>
+                    <a:blip r:embed="rId19"/>
                     <a:stretch>
                       <a:fillRect/>
                     </a:stretch>
@@ -11829,24 +11860,24 @@
         <w:t>注：横坐标为分组，不同颜色代表不同的分组，纵坐标为差异物种的相对丰度。</w:t>
       </w:r>
     </w:p>
-    <w:bookmarkEnd w:id="112"/>
-    <w:p>
-      <w:pPr>
-        <w:ind w:firstLine="420"/>
-        <w:rPr>
-          <w:rFonts w:cs="Times New Roman"/>
-          <w:color w:val="000000" w:themeColor="text1"/>
-          <w14:textFill>
-            <w14:solidFill>
-              <w14:schemeClr w14:val="tx1"/>
-            </w14:solidFill>
-          </w14:textFill>
-        </w:rPr>
-      </w:pPr>
-      <w:bookmarkStart w:id="114" w:name="_Toc5380"/>
-      <w:bookmarkStart w:id="115" w:name="_Toc22458"/>
-      <w:bookmarkStart w:id="116" w:name="_Toc7105"/>
-      <w:bookmarkStart w:id="117" w:name="_Toc32428"/>
+    <w:bookmarkEnd w:id="102"/>
+    <w:p>
+      <w:pPr>
+        <w:ind w:firstLine="420"/>
+        <w:rPr>
+          <w:rFonts w:cs="Times New Roman"/>
+          <w:color w:val="000000" w:themeColor="text1"/>
+          <w14:textFill>
+            <w14:solidFill>
+              <w14:schemeClr w14:val="tx1"/>
+            </w14:solidFill>
+          </w14:textFill>
+        </w:rPr>
+      </w:pPr>
+      <w:bookmarkStart w:id="104" w:name="_Toc22458"/>
+      <w:bookmarkStart w:id="105" w:name="_Toc5380"/>
+      <w:bookmarkStart w:id="106" w:name="_Toc7105"/>
+      <w:bookmarkStart w:id="107" w:name="_Toc32428"/>
       <w:r>
         <w:rPr>
           <w:rFonts w:hint="eastAsia" w:cs="Times New Roman"/>
@@ -11897,20 +11928,20 @@
         <w:t>-TaxStatistical_analysis/*/*/2.wilcoxon</w:t>
       </w:r>
     </w:p>
-    <w:bookmarkEnd w:id="114"/>
-    <w:bookmarkEnd w:id="115"/>
-    <w:bookmarkEnd w:id="116"/>
-    <w:bookmarkEnd w:id="117"/>
+    <w:bookmarkEnd w:id="104"/>
+    <w:bookmarkEnd w:id="105"/>
+    <w:bookmarkEnd w:id="106"/>
+    <w:bookmarkEnd w:id="107"/>
     <w:p>
       <w:pPr>
         <w:pStyle w:val="41"/>
       </w:pPr>
-      <w:bookmarkStart w:id="118" w:name="_Toc1105"/>
-      <w:bookmarkStart w:id="119" w:name="_Toc30637"/>
-      <w:bookmarkStart w:id="120" w:name="_Toc2650"/>
-      <w:bookmarkStart w:id="121" w:name="_Toc21411"/>
-      <w:bookmarkStart w:id="122" w:name="_Toc2973"/>
-      <w:bookmarkStart w:id="123" w:name="_Hlk141098708"/>
+      <w:bookmarkStart w:id="108" w:name="_Toc21411"/>
+      <w:bookmarkStart w:id="109" w:name="_Toc1105"/>
+      <w:bookmarkStart w:id="110" w:name="_Toc30637"/>
+      <w:bookmarkStart w:id="111" w:name="_Toc2973"/>
+      <w:bookmarkStart w:id="112" w:name="_Toc2650"/>
+      <w:bookmarkStart w:id="113" w:name="_Hlk141098708"/>
       <w:r>
         <w:rPr>
           <w:rFonts w:hint="eastAsia"/>
@@ -11927,11 +11958,11 @@
         </w:rPr>
         <w:t>Stamp分析</w:t>
       </w:r>
-      <w:bookmarkEnd w:id="118"/>
-      <w:bookmarkEnd w:id="119"/>
-      <w:bookmarkEnd w:id="120"/>
-      <w:bookmarkEnd w:id="121"/>
-      <w:bookmarkEnd w:id="122"/>
+      <w:bookmarkEnd w:id="108"/>
+      <w:bookmarkEnd w:id="109"/>
+      <w:bookmarkEnd w:id="110"/>
+      <w:bookmarkEnd w:id="111"/>
+      <w:bookmarkEnd w:id="112"/>
     </w:p>
     <w:p>
       <w:pPr>
@@ -11999,7 +12030,7 @@
     </w:p>
     <w:p>
       <w:pPr>
-        <w:ind w:firstLine="420"/>
+        <w:ind w:left="0" w:leftChars="0" w:firstLine="0" w:firstLineChars="0"/>
         <w:jc w:val="center"/>
         <w:rPr>
           <w:rFonts w:cs="Times New Roman"/>
@@ -12035,7 +12066,7 @@
                     </pic:cNvPicPr>
                   </pic:nvPicPr>
                   <pic:blipFill>
-                    <a:blip r:embed="rId20"/>
+                    <a:blip r:embed="rId19"/>
                     <a:stretch>
                       <a:fillRect/>
                     </a:stretch>
@@ -12080,10 +12111,10 @@
           </w14:textFill>
         </w:rPr>
       </w:pPr>
-      <w:bookmarkStart w:id="124" w:name="_Toc30959"/>
-      <w:bookmarkStart w:id="125" w:name="_Toc31058"/>
-      <w:bookmarkStart w:id="126" w:name="_Toc4303"/>
-      <w:bookmarkStart w:id="127" w:name="_Toc7991"/>
+      <w:bookmarkStart w:id="114" w:name="_Toc31058"/>
+      <w:bookmarkStart w:id="115" w:name="_Toc4303"/>
+      <w:bookmarkStart w:id="116" w:name="_Toc7991"/>
+      <w:bookmarkStart w:id="117" w:name="_Toc30959"/>
       <w:r>
         <w:rPr>
           <w:rFonts w:hint="eastAsia" w:cs="Times New Roman"/>
@@ -12138,7 +12169,7 @@
       <w:pPr>
         <w:pStyle w:val="41"/>
       </w:pPr>
-      <w:bookmarkStart w:id="128" w:name="_Toc10748"/>
+      <w:bookmarkStart w:id="118" w:name="_Toc10748"/>
       <w:r>
         <w:rPr>
           <w:rFonts w:hint="eastAsia"/>
@@ -12155,11 +12186,11 @@
         </w:rPr>
         <w:t>Random_Forest分析</w:t>
       </w:r>
-      <w:bookmarkEnd w:id="124"/>
-      <w:bookmarkEnd w:id="125"/>
-      <w:bookmarkEnd w:id="126"/>
-      <w:bookmarkEnd w:id="127"/>
-      <w:bookmarkEnd w:id="128"/>
+      <w:bookmarkEnd w:id="114"/>
+      <w:bookmarkEnd w:id="115"/>
+      <w:bookmarkEnd w:id="116"/>
+      <w:bookmarkEnd w:id="117"/>
+      <w:bookmarkEnd w:id="118"/>
     </w:p>
     <w:p>
       <w:pPr>
@@ -12205,7 +12236,7 @@
     </w:p>
     <w:p>
       <w:pPr>
-        <w:ind w:firstLine="420"/>
+        <w:ind w:left="0" w:leftChars="0" w:firstLine="0" w:firstLineChars="0"/>
         <w:jc w:val="center"/>
         <w:rPr>
           <w:rFonts w:cs="Times New Roman"/>
@@ -12241,7 +12272,7 @@
                     </pic:cNvPicPr>
                   </pic:nvPicPr>
                   <pic:blipFill>
-                    <a:blip r:embed="rId20"/>
+                    <a:blip r:embed="rId19"/>
                     <a:stretch>
                       <a:fillRect/>
                     </a:stretch>
@@ -12286,10 +12317,10 @@
           </w14:textFill>
         </w:rPr>
       </w:pPr>
-      <w:bookmarkStart w:id="129" w:name="_Toc14834"/>
-      <w:bookmarkStart w:id="130" w:name="_Toc28369"/>
-      <w:bookmarkStart w:id="131" w:name="_Toc10259"/>
-      <w:bookmarkStart w:id="132" w:name="_Toc31360"/>
+      <w:bookmarkStart w:id="119" w:name="_Toc31360"/>
+      <w:bookmarkStart w:id="120" w:name="_Toc28369"/>
+      <w:bookmarkStart w:id="121" w:name="_Toc10259"/>
+      <w:bookmarkStart w:id="122" w:name="_Toc14834"/>
       <w:r>
         <w:rPr>
           <w:rFonts w:hint="eastAsia" w:cs="Times New Roman"/>
@@ -12344,7 +12375,7 @@
       <w:pPr>
         <w:pStyle w:val="41"/>
       </w:pPr>
-      <w:bookmarkStart w:id="133" w:name="_Toc26781"/>
+      <w:bookmarkStart w:id="123" w:name="_Toc26781"/>
       <w:r>
         <w:rPr>
           <w:rFonts w:hint="eastAsia"/>
@@ -12370,11 +12401,11 @@
         </w:rPr>
         <w:t>分析</w:t>
       </w:r>
-      <w:bookmarkEnd w:id="129"/>
-      <w:bookmarkEnd w:id="130"/>
-      <w:bookmarkEnd w:id="131"/>
-      <w:bookmarkEnd w:id="132"/>
-      <w:bookmarkEnd w:id="133"/>
+      <w:bookmarkEnd w:id="119"/>
+      <w:bookmarkEnd w:id="120"/>
+      <w:bookmarkEnd w:id="121"/>
+      <w:bookmarkEnd w:id="122"/>
+      <w:bookmarkEnd w:id="123"/>
     </w:p>
     <w:p>
       <w:pPr>
@@ -12420,7 +12451,7 @@
     </w:p>
     <w:p>
       <w:pPr>
-        <w:ind w:firstLine="420"/>
+        <w:ind w:left="0" w:leftChars="0" w:firstLine="0" w:firstLineChars="0"/>
         <w:jc w:val="center"/>
         <w:rPr>
           <w:rFonts w:cs="Times New Roman"/>
@@ -12456,7 +12487,7 @@
                     </pic:cNvPicPr>
                   </pic:nvPicPr>
                   <pic:blipFill>
-                    <a:blip r:embed="rId20"/>
+                    <a:blip r:embed="rId19"/>
                     <a:stretch>
                       <a:fillRect/>
                     </a:stretch>
@@ -12527,10 +12558,10 @@
           </w14:textFill>
         </w:rPr>
       </w:pPr>
-      <w:bookmarkStart w:id="134" w:name="_Toc15915"/>
-      <w:bookmarkStart w:id="135" w:name="_Toc7634"/>
-      <w:bookmarkStart w:id="136" w:name="_Toc31431"/>
-      <w:bookmarkStart w:id="137" w:name="_Toc9989"/>
+      <w:bookmarkStart w:id="124" w:name="_Toc31431"/>
+      <w:bookmarkStart w:id="125" w:name="_Toc9989"/>
+      <w:bookmarkStart w:id="126" w:name="_Toc15915"/>
+      <w:bookmarkStart w:id="127" w:name="_Toc7634"/>
       <w:r>
         <w:rPr>
           <w:rFonts w:hint="eastAsia" w:cs="Times New Roman"/>
@@ -12585,7 +12616,7 @@
       <w:pPr>
         <w:pStyle w:val="41"/>
       </w:pPr>
-      <w:bookmarkStart w:id="138" w:name="_Toc27643"/>
+      <w:bookmarkStart w:id="128" w:name="_Toc27643"/>
       <w:r>
         <w:rPr>
           <w:rFonts w:hint="eastAsia"/>
@@ -12602,11 +12633,11 @@
         </w:rPr>
         <w:t>分析</w:t>
       </w:r>
-      <w:bookmarkEnd w:id="134"/>
-      <w:bookmarkEnd w:id="135"/>
-      <w:bookmarkEnd w:id="136"/>
-      <w:bookmarkEnd w:id="137"/>
-      <w:bookmarkEnd w:id="138"/>
+      <w:bookmarkEnd w:id="124"/>
+      <w:bookmarkEnd w:id="125"/>
+      <w:bookmarkEnd w:id="126"/>
+      <w:bookmarkEnd w:id="127"/>
+      <w:bookmarkEnd w:id="128"/>
     </w:p>
     <w:p>
       <w:pPr>
@@ -12704,7 +12735,7 @@
     </w:p>
     <w:p>
       <w:pPr>
-        <w:ind w:firstLine="420"/>
+        <w:ind w:left="0" w:leftChars="0" w:firstLine="0" w:firstLineChars="0"/>
         <w:jc w:val="center"/>
         <w:rPr>
           <w:rFonts w:cs="Times New Roman"/>
@@ -12739,7 +12770,7 @@
                     </pic:cNvPicPr>
                   </pic:nvPicPr>
                   <pic:blipFill>
-                    <a:blip r:embed="rId20"/>
+                    <a:blip r:embed="rId19"/>
                     <a:stretch>
                       <a:fillRect/>
                     </a:stretch>
@@ -12799,10 +12830,10 @@
           </w14:textFill>
         </w:rPr>
       </w:pPr>
-      <w:bookmarkStart w:id="139" w:name="_Toc7938"/>
-      <w:bookmarkStart w:id="140" w:name="_Toc14055"/>
-      <w:bookmarkStart w:id="141" w:name="_Toc7747"/>
-      <w:bookmarkStart w:id="142" w:name="_Toc26979"/>
+      <w:bookmarkStart w:id="129" w:name="_Toc14055"/>
+      <w:bookmarkStart w:id="130" w:name="_Toc7938"/>
+      <w:bookmarkStart w:id="131" w:name="_Toc26979"/>
+      <w:bookmarkStart w:id="132" w:name="_Toc7747"/>
       <w:r>
         <w:rPr>
           <w:rFonts w:hint="eastAsia" w:cs="Times New Roman"/>
@@ -12857,7 +12888,7 @@
       <w:pPr>
         <w:pStyle w:val="41"/>
       </w:pPr>
-      <w:bookmarkStart w:id="143" w:name="_Toc9291"/>
+      <w:bookmarkStart w:id="133" w:name="_Toc9291"/>
       <w:r>
         <w:rPr>
           <w:rFonts w:hint="eastAsia"/>
@@ -12868,11 +12899,11 @@
       <w:r>
         <w:t>.7 ADONIS分析</w:t>
       </w:r>
-      <w:bookmarkEnd w:id="139"/>
-      <w:bookmarkEnd w:id="140"/>
-      <w:bookmarkEnd w:id="141"/>
-      <w:bookmarkEnd w:id="142"/>
-      <w:bookmarkEnd w:id="143"/>
+      <w:bookmarkEnd w:id="129"/>
+      <w:bookmarkEnd w:id="130"/>
+      <w:bookmarkEnd w:id="131"/>
+      <w:bookmarkEnd w:id="132"/>
+      <w:bookmarkEnd w:id="133"/>
     </w:p>
     <w:p>
       <w:pPr>
@@ -13198,6 +13229,12 @@
             <w:insideH w:val="none" w:color="auto" w:sz="0" w:space="0"/>
             <w:insideV w:val="none" w:color="auto" w:sz="0" w:space="0"/>
           </w:tblBorders>
+          <w:tblCellMar>
+            <w:top w:w="0" w:type="dxa"/>
+            <w:left w:w="108" w:type="dxa"/>
+            <w:bottom w:w="0" w:type="dxa"/>
+            <w:right w:w="108" w:type="dxa"/>
+          </w:tblCellMar>
         </w:tblPrEx>
         <w:trPr>
           <w:jc w:val="center"/>
@@ -13277,6 +13314,12 @@
             <w:insideH w:val="none" w:color="auto" w:sz="0" w:space="0"/>
             <w:insideV w:val="none" w:color="auto" w:sz="0" w:space="0"/>
           </w:tblBorders>
+          <w:tblCellMar>
+            <w:top w:w="0" w:type="dxa"/>
+            <w:left w:w="108" w:type="dxa"/>
+            <w:bottom w:w="0" w:type="dxa"/>
+            <w:right w:w="108" w:type="dxa"/>
+          </w:tblCellMar>
         </w:tblPrEx>
         <w:trPr>
           <w:jc w:val="center"/>
@@ -13535,6 +13578,12 @@
             <w:insideH w:val="none" w:color="auto" w:sz="0" w:space="0"/>
             <w:insideV w:val="none" w:color="auto" w:sz="0" w:space="0"/>
           </w:tblBorders>
+          <w:tblCellMar>
+            <w:top w:w="0" w:type="dxa"/>
+            <w:left w:w="108" w:type="dxa"/>
+            <w:bottom w:w="0" w:type="dxa"/>
+            <w:right w:w="108" w:type="dxa"/>
+          </w:tblCellMar>
         </w:tblPrEx>
         <w:trPr>
           <w:jc w:val="center"/>
@@ -13788,10 +13837,10 @@
           </w14:textFill>
         </w:rPr>
       </w:pPr>
-      <w:bookmarkStart w:id="144" w:name="_Toc28567"/>
-      <w:bookmarkStart w:id="145" w:name="_Toc30645"/>
-      <w:bookmarkStart w:id="146" w:name="_Toc192"/>
-      <w:bookmarkStart w:id="147" w:name="_Toc28881"/>
+      <w:bookmarkStart w:id="134" w:name="_Toc192"/>
+      <w:bookmarkStart w:id="135" w:name="_Toc30645"/>
+      <w:bookmarkStart w:id="136" w:name="_Toc28881"/>
+      <w:bookmarkStart w:id="137" w:name="_Toc28567"/>
       <w:r>
         <w:rPr>
           <w:rFonts w:hint="eastAsia" w:cs="Times New Roman"/>
@@ -13846,7 +13895,7 @@
       <w:pPr>
         <w:pStyle w:val="41"/>
       </w:pPr>
-      <w:bookmarkStart w:id="148" w:name="_Toc29585"/>
+      <w:bookmarkStart w:id="138" w:name="_Toc29585"/>
       <w:r>
         <w:rPr>
           <w:rFonts w:hint="eastAsia"/>
@@ -13857,11 +13906,11 @@
       <w:r>
         <w:t>.8 MRPP分析</w:t>
       </w:r>
-      <w:bookmarkEnd w:id="144"/>
-      <w:bookmarkEnd w:id="145"/>
-      <w:bookmarkEnd w:id="146"/>
-      <w:bookmarkEnd w:id="147"/>
-      <w:bookmarkEnd w:id="148"/>
+      <w:bookmarkEnd w:id="134"/>
+      <w:bookmarkEnd w:id="135"/>
+      <w:bookmarkEnd w:id="136"/>
+      <w:bookmarkEnd w:id="137"/>
+      <w:bookmarkEnd w:id="138"/>
     </w:p>
     <w:p>
       <w:pPr>
@@ -13877,24 +13926,24 @@
         <w:t>MRPP（Multi Response Permutation Procedure）分析与Anosim类似，但MRPP是基于Bray-Curtis的参数检验，用来检验组间（两组/多组）的差异是否显著大于组内差异，通常配合PCA、PCoA、NMDS等降维图使用，利用R vegan包mrpp函数进行MRPP分析，Observe Delta值越小说明组内差异小，Expect delta值越大说明组间差异大。A值大于0说明组间差异大于组内差异，A值小于0说明组内差异大于组间差异。P值小于0.05说明差异显著，具体结果如下表所示：</w:t>
       </w:r>
     </w:p>
-    <w:bookmarkEnd w:id="123"/>
-    <w:p>
-      <w:pPr>
-        <w:ind w:firstLine="420"/>
-        <w:rPr>
-          <w:rFonts w:cs="Times New Roman"/>
-          <w:color w:val="000000" w:themeColor="text1"/>
-          <w14:textFill>
-            <w14:solidFill>
-              <w14:schemeClr w14:val="tx1"/>
-            </w14:solidFill>
-          </w14:textFill>
-        </w:rPr>
-      </w:pPr>
-      <w:bookmarkStart w:id="149" w:name="_Toc8462"/>
-      <w:bookmarkStart w:id="150" w:name="_Toc18761"/>
-      <w:bookmarkStart w:id="151" w:name="_Toc13804"/>
-      <w:bookmarkStart w:id="152" w:name="_Toc30417"/>
+    <w:bookmarkEnd w:id="113"/>
+    <w:p>
+      <w:pPr>
+        <w:ind w:firstLine="420"/>
+        <w:rPr>
+          <w:rFonts w:cs="Times New Roman"/>
+          <w:color w:val="000000" w:themeColor="text1"/>
+          <w14:textFill>
+            <w14:solidFill>
+              <w14:schemeClr w14:val="tx1"/>
+            </w14:solidFill>
+          </w14:textFill>
+        </w:rPr>
+      </w:pPr>
+      <w:bookmarkStart w:id="139" w:name="_Toc8462"/>
+      <w:bookmarkStart w:id="140" w:name="_Toc18761"/>
+      <w:bookmarkStart w:id="141" w:name="_Toc13804"/>
+      <w:bookmarkStart w:id="142" w:name="_Toc30417"/>
       <w:r>
         <w:rPr>
           <w:rFonts w:hint="eastAsia" w:cs="Times New Roman"/>
@@ -13949,7 +13998,7 @@
       <w:pPr>
         <w:pStyle w:val="41"/>
       </w:pPr>
-      <w:bookmarkStart w:id="153" w:name="_Toc7887"/>
+      <w:bookmarkStart w:id="143" w:name="_Toc7887"/>
       <w:r>
         <w:rPr>
           <w:rFonts w:hint="eastAsia"/>
@@ -13960,7 +14009,7 @@
       <w:r>
         <w:t>.9 Lefse分析</w:t>
       </w:r>
-      <w:bookmarkEnd w:id="153"/>
+      <w:bookmarkEnd w:id="143"/>
     </w:p>
     <w:p>
       <w:pPr>
@@ -14348,7 +14397,7 @@
           </w:tcPr>
           <w:p>
             <w:pPr>
-              <w:ind w:firstLine="420"/>
+              <w:ind w:left="0" w:leftChars="0" w:firstLine="0" w:firstLineChars="0"/>
               <w:jc w:val="center"/>
               <w:rPr>
                 <w:rFonts w:cs="Times New Roman"/>
@@ -14382,7 +14431,7 @@
           </w:tcPr>
           <w:p>
             <w:pPr>
-              <w:ind w:firstLine="420"/>
+              <w:ind w:left="0" w:leftChars="0" w:firstLine="0" w:firstLineChars="0"/>
               <w:jc w:val="center"/>
               <w:rPr>
                 <w:rFonts w:cs="Times New Roman"/>
@@ -14436,7 +14485,7 @@
           </w:tcPr>
           <w:p>
             <w:pPr>
-              <w:ind w:firstLine="420"/>
+              <w:ind w:left="0" w:leftChars="0" w:firstLine="0" w:firstLineChars="0"/>
               <w:jc w:val="center"/>
               <w:rPr>
                 <w:rFonts w:cs="Times New Roman"/>
@@ -14469,7 +14518,28 @@
           </w:tcPr>
           <w:p>
             <w:pPr>
-              <w:ind w:firstLine="420"/>
+              <w:ind w:left="0" w:leftChars="0" w:firstLine="0" w:firstLineChars="0"/>
+              <w:jc w:val="center"/>
+              <w:rPr>
+                <w:rFonts w:hint="eastAsia" w:cs="Times New Roman"/>
+                <w:color w:val="000000"/>
+                <w:kern w:val="0"/>
+                <w:szCs w:val="20"/>
+              </w:rPr>
+            </w:pPr>
+            <w:r>
+              <w:rPr>
+                <w:rFonts w:hint="eastAsia" w:cs="Times New Roman"/>
+                <w:color w:val="000000"/>
+                <w:kern w:val="0"/>
+                <w:szCs w:val="20"/>
+              </w:rPr>
+              <w:t>各组分丰度平均值中最大值的log10，</w:t>
+            </w:r>
+          </w:p>
+          <w:p>
+            <w:pPr>
+              <w:ind w:left="0" w:leftChars="0" w:firstLine="0" w:firstLineChars="0"/>
               <w:jc w:val="center"/>
               <w:rPr>
                 <w:rFonts w:cs="Times New Roman"/>
@@ -14486,7 +14556,7 @@
                 <w:kern w:val="0"/>
                 <w:szCs w:val="20"/>
               </w:rPr>
-              <w:t>各组分丰度平均值中最大值的log10，如果平均丰度小于10的按照10来计算</w:t>
+              <w:t>如果平均丰度小于10的按照10来计算</w:t>
             </w:r>
           </w:p>
         </w:tc>
@@ -14523,7 +14593,7 @@
           </w:tcPr>
           <w:p>
             <w:pPr>
-              <w:ind w:firstLine="420"/>
+              <w:ind w:left="0" w:leftChars="0" w:firstLine="0" w:firstLineChars="0"/>
               <w:jc w:val="center"/>
               <w:rPr>
                 <w:rFonts w:cs="Times New Roman"/>
@@ -14556,7 +14626,7 @@
           </w:tcPr>
           <w:p>
             <w:pPr>
-              <w:ind w:firstLine="420"/>
+              <w:ind w:left="0" w:leftChars="0" w:firstLine="0" w:firstLineChars="0"/>
               <w:jc w:val="center"/>
               <w:rPr>
                 <w:rFonts w:cs="Times New Roman"/>
@@ -14610,7 +14680,7 @@
           </w:tcPr>
           <w:p>
             <w:pPr>
-              <w:ind w:firstLine="420"/>
+              <w:ind w:left="0" w:leftChars="0" w:firstLine="0" w:firstLineChars="0"/>
               <w:jc w:val="center"/>
               <w:rPr>
                 <w:rFonts w:cs="Times New Roman"/>
@@ -14643,7 +14713,7 @@
           </w:tcPr>
           <w:p>
             <w:pPr>
-              <w:ind w:firstLine="420"/>
+              <w:ind w:left="0" w:leftChars="0" w:firstLine="0" w:firstLineChars="0"/>
               <w:jc w:val="center"/>
               <w:rPr>
                 <w:rFonts w:cs="Times New Roman"/>
@@ -14697,7 +14767,7 @@
           </w:tcPr>
           <w:p>
             <w:pPr>
-              <w:ind w:firstLine="420"/>
+              <w:ind w:left="0" w:leftChars="0" w:firstLine="0" w:firstLineChars="0"/>
               <w:jc w:val="center"/>
               <w:rPr>
                 <w:rFonts w:cs="Times New Roman"/>
@@ -14730,7 +14800,7 @@
           </w:tcPr>
           <w:p>
             <w:pPr>
-              <w:ind w:firstLine="420"/>
+              <w:ind w:left="0" w:leftChars="0" w:firstLine="0" w:firstLineChars="0"/>
               <w:jc w:val="center"/>
               <w:rPr>
                 <w:rFonts w:cs="Times New Roman"/>
@@ -14779,7 +14849,7 @@
     <w:p>
       <w:pPr>
         <w:widowControl/>
-        <w:ind w:firstLine="420"/>
+        <w:ind w:left="0" w:leftChars="0" w:firstLine="0" w:firstLineChars="0"/>
         <w:jc w:val="center"/>
         <w:rPr>
           <w:rFonts w:cs="Times New Roman"/>
@@ -14815,7 +14885,7 @@
                     </pic:cNvPicPr>
                   </pic:nvPicPr>
                   <pic:blipFill>
-                    <a:blip r:embed="rId20"/>
+                    <a:blip r:embed="rId19"/>
                     <a:stretch>
                       <a:fillRect/>
                     </a:stretch>
@@ -14953,7 +15023,7 @@
       <w:pPr>
         <w:pStyle w:val="40"/>
       </w:pPr>
-      <w:bookmarkStart w:id="154" w:name="_Toc3280"/>
+      <w:bookmarkStart w:id="144" w:name="_Toc3280"/>
       <w:r>
         <w:rPr>
           <w:rFonts w:hint="eastAsia"/>
@@ -14970,207 +15040,207 @@
         </w:rPr>
         <w:t>功能预测</w:t>
       </w:r>
+      <w:bookmarkEnd w:id="139"/>
+      <w:bookmarkEnd w:id="140"/>
+      <w:bookmarkEnd w:id="141"/>
+      <w:bookmarkEnd w:id="142"/>
+      <w:bookmarkEnd w:id="144"/>
+    </w:p>
+    <w:p>
+      <w:pPr>
+        <w:ind w:firstLine="420"/>
+      </w:pPr>
+      <w:r>
+        <w:rPr>
+          <w:rFonts w:hint="eastAsia"/>
+        </w:rPr>
+        <w:t>目前常用的功能数据库主要有：</w:t>
+      </w:r>
+    </w:p>
+    <w:p>
+      <w:pPr>
+        <w:ind w:firstLine="420"/>
+      </w:pPr>
+      <w:r>
+        <w:rPr>
+          <w:rFonts w:hint="eastAsia"/>
+        </w:rPr>
+        <w:t>Kyoto Encyclopedia of Genes and Genomes（KEGG）；</w:t>
+      </w:r>
+    </w:p>
+    <w:p>
+      <w:pPr>
+        <w:ind w:firstLine="420"/>
+      </w:pPr>
+      <w:r>
+        <w:rPr>
+          <w:rFonts w:hint="eastAsia"/>
+        </w:rPr>
+        <w:t>Evolutionary genealogy of genes: Non-supervised Orthologous Groups（eggNOG）；</w:t>
+      </w:r>
+    </w:p>
+    <w:p>
+      <w:pPr>
+        <w:ind w:firstLine="420"/>
+      </w:pPr>
+      <w:r>
+        <w:t>Carbohydrate-Active enzymes Database (CAZy)</w:t>
+      </w:r>
+    </w:p>
+    <w:p>
+      <w:pPr>
+        <w:ind w:firstLine="420"/>
+      </w:pPr>
+      <w:r>
+        <w:rPr>
+          <w:rFonts w:hint="eastAsia"/>
+        </w:rPr>
+        <w:t>Gene Ontology (GO)</w:t>
+      </w:r>
+    </w:p>
+    <w:p>
+      <w:pPr>
+        <w:ind w:firstLine="420"/>
+      </w:pPr>
+      <w:r>
+        <w:rPr>
+          <w:rFonts w:hint="eastAsia"/>
+        </w:rPr>
+        <w:t>KEGG数据库于1995年由Kanehisa Laboratories推出0.1版，目前发展为一个综合性数据库，其中最核心的为KEGG PATHWAY和KEGG ORTHOLOGY数据库。在KEGG ORTHOLOGY数据库中，将行使相同功能的基因聚在一起，称为Ortholog Groups（KO entries），每个KO包含多个基因信息，并在一至多个pathway中发挥作用。而在KEGG PATHWAY数据库中，将生物代谢通路划分为7类，分别为：细胞过程（Cellular Processes）、环境信息处理（Environmental Information Processing）、遗传信息处理（Genetic Information Processing）、人类疾病（Human Diseases）、新陈代谢（Metabolism）、生物体系统（Organismal Systems）、药物发展（Drug Development），其中每类又被系统分类为二、三、四层。第二层目前包括有43种子pathway；第三层即为其代谢通路图；第四层为每个代谢通路图的具体注释信息。</w:t>
+      </w:r>
+    </w:p>
+    <w:p>
+      <w:pPr>
+        <w:ind w:firstLine="420"/>
+      </w:pPr>
+      <w:r>
+        <w:rPr>
+          <w:rFonts w:hint="eastAsia"/>
+        </w:rPr>
+        <w:t>eggNOG数据库是利用Smith-Waterman比对算法对构建的基因直系同源簇（Orthologous Groups）进行功能注释，eggNOG V4.1涵盖了2031个物种的基因，构建了约19万个Orthologous Groups。</w:t>
+      </w:r>
+    </w:p>
+    <w:p>
+      <w:pPr>
+        <w:ind w:firstLine="420"/>
+      </w:pPr>
+      <w:r>
+        <w:rPr>
+          <w:rFonts w:hint="eastAsia"/>
+        </w:rPr>
+        <w:t>CAZy数据库是研究碳水化合物酶的专业级数据库，主要涵盖6大功能类：糖苷水解酶（Glycoside Hydrolases，GHs），糖基转移酶（Glycosyl Transferases，GTs），多糖裂合酶（Polysaccharide Lyases，PLs），碳水化合物酯酶（Carbohydrate Esterases，CEs），辅助氧化还原酶(Auxiliary Activities，AAs)和碳水化合物结合模块（Carbohydrate-Binding Modules，CBMs）。</w:t>
+      </w:r>
+    </w:p>
+    <w:p>
+      <w:pPr>
+        <w:ind w:firstLine="420"/>
+      </w:pPr>
+      <w:r>
+        <w:rPr>
+          <w:rFonts w:hint="eastAsia"/>
+        </w:rPr>
+        <w:t>GO是基因本体联合会（Gene Ontology Consortium）所建立的数据库，旨在建立一个适用于各种物种的，对基因和蛋白功能进行限定和描述的，并能随着研究不断深入而更新的语义词汇标准，适用于各物种。GO按照生物过程（Biology Process），分子功能（Molecular Function）和细胞组成（Cellular Component）对基因进行注释和分类。通过GO富集分析可以粗略了解差异基因富集在哪些生物学功能、途径或者细胞定位。</w:t>
+      </w:r>
+    </w:p>
+    <w:p>
+      <w:pPr>
+        <w:ind w:firstLine="420"/>
+      </w:pPr>
+      <w:r>
+        <w:rPr>
+          <w:rFonts w:hint="eastAsia"/>
+        </w:rPr>
+        <w:t>功能注释基本步骤：</w:t>
+      </w:r>
+    </w:p>
+    <w:p>
+      <w:pPr>
+        <w:ind w:firstLine="420"/>
+      </w:pPr>
+      <w:r>
+        <w:rPr>
+          <w:rFonts w:hint="eastAsia"/>
+        </w:rPr>
+        <w:t>[1].</w:t>
+      </w:r>
+      <w:r>
+        <w:t xml:space="preserve"> </w:t>
+      </w:r>
+      <w:r>
+        <w:rPr>
+          <w:rFonts w:hint="eastAsia"/>
+        </w:rPr>
+        <w:t>使用</w:t>
+      </w:r>
+      <w:r>
+        <w:t>eggNOG-mapper</w:t>
+      </w:r>
+      <w:r>
+        <w:rPr>
+          <w:rFonts w:hint="eastAsia"/>
+        </w:rPr>
+        <w:t>软件将非冗余基因与各功能数据库进行比对，取e&lt;1e-5的注释，筛选具有最高序列相似性的蛋白，从而得到功能注释信息；</w:t>
+      </w:r>
+    </w:p>
+    <w:p>
+      <w:pPr>
+        <w:ind w:firstLine="420"/>
+      </w:pPr>
+      <w:r>
+        <w:rPr>
+          <w:rFonts w:hint="eastAsia"/>
+        </w:rPr>
+        <w:t>[</w:t>
+      </w:r>
+      <w:r>
+        <w:t>2</w:t>
+      </w:r>
+      <w:r>
+        <w:rPr>
+          <w:rFonts w:hint="eastAsia"/>
+        </w:rPr>
+        <w:t>].</w:t>
+      </w:r>
+      <w:r>
+        <w:t xml:space="preserve"> </w:t>
+      </w:r>
+      <w:r>
+        <w:rPr>
+          <w:rFonts w:hint="eastAsia"/>
+        </w:rPr>
+        <w:t>从比对结果出发，统计不同功能层级的相对丰度（各功能层级的相对丰度等于注释为该功能层级的基因的相对丰度之和）。</w:t>
+      </w:r>
+    </w:p>
+    <w:p>
+      <w:pPr>
+        <w:pStyle w:val="41"/>
+      </w:pPr>
+      <w:bookmarkStart w:id="145" w:name="_Toc3514"/>
+      <w:bookmarkStart w:id="146" w:name="_Toc17265"/>
+      <w:bookmarkStart w:id="147" w:name="_Toc28038"/>
+      <w:bookmarkStart w:id="148" w:name="_Toc3422"/>
+      <w:bookmarkStart w:id="149" w:name="_Toc719"/>
+      <w:r>
+        <w:rPr>
+          <w:rFonts w:hint="eastAsia"/>
+          <w:lang w:val="en-US" w:eastAsia="zh-CN"/>
+        </w:rPr>
+        <w:t>8</w:t>
+      </w:r>
+      <w:r>
+        <w:t xml:space="preserve">.1 </w:t>
+      </w:r>
+      <w:bookmarkEnd w:id="145"/>
+      <w:bookmarkEnd w:id="146"/>
+      <w:bookmarkEnd w:id="147"/>
+      <w:bookmarkEnd w:id="148"/>
+      <w:r>
+        <w:rPr>
+          <w:rFonts w:hint="eastAsia"/>
+        </w:rPr>
+        <w:t>功能相对丰度概况</w:t>
+      </w:r>
       <w:bookmarkEnd w:id="149"/>
-      <w:bookmarkEnd w:id="150"/>
-      <w:bookmarkEnd w:id="151"/>
-      <w:bookmarkEnd w:id="152"/>
-      <w:bookmarkEnd w:id="154"/>
-    </w:p>
-    <w:p>
-      <w:pPr>
-        <w:ind w:firstLine="420"/>
-      </w:pPr>
-      <w:r>
-        <w:rPr>
-          <w:rFonts w:hint="eastAsia"/>
-        </w:rPr>
-        <w:t>目前常用的功能数据库主要有：</w:t>
-      </w:r>
-    </w:p>
-    <w:p>
-      <w:pPr>
-        <w:ind w:firstLine="420"/>
-      </w:pPr>
-      <w:r>
-        <w:rPr>
-          <w:rFonts w:hint="eastAsia"/>
-        </w:rPr>
-        <w:t>Kyoto Encyclopedia of Genes and Genomes（KEGG）；</w:t>
-      </w:r>
-    </w:p>
-    <w:p>
-      <w:pPr>
-        <w:ind w:firstLine="420"/>
-      </w:pPr>
-      <w:r>
-        <w:rPr>
-          <w:rFonts w:hint="eastAsia"/>
-        </w:rPr>
-        <w:t>Evolutionary genealogy of genes: Non-supervised Orthologous Groups（eggNOG）；</w:t>
-      </w:r>
-    </w:p>
-    <w:p>
-      <w:pPr>
-        <w:ind w:firstLine="420"/>
-      </w:pPr>
-      <w:r>
-        <w:t>Carbohydrate-Active enzymes Database (CAZy)</w:t>
-      </w:r>
-    </w:p>
-    <w:p>
-      <w:pPr>
-        <w:ind w:firstLine="420"/>
-      </w:pPr>
-      <w:r>
-        <w:rPr>
-          <w:rFonts w:hint="eastAsia"/>
-        </w:rPr>
-        <w:t>Gene Ontology (GO)</w:t>
-      </w:r>
-    </w:p>
-    <w:p>
-      <w:pPr>
-        <w:ind w:firstLine="420"/>
-      </w:pPr>
-      <w:r>
-        <w:rPr>
-          <w:rFonts w:hint="eastAsia"/>
-        </w:rPr>
-        <w:t>KEGG数据库于1995年由Kanehisa Laboratories推出0.1版，目前发展为一个综合性数据库，其中最核心的为KEGG PATHWAY和KEGG ORTHOLOGY数据库。在KEGG ORTHOLOGY数据库中，将行使相同功能的基因聚在一起，称为Ortholog Groups（KO entries），每个KO包含多个基因信息，并在一至多个pathway中发挥作用。而在KEGG PATHWAY数据库中，将生物代谢通路划分为7类，分别为：细胞过程（Cellular Processes）、环境信息处理（Environmental Information Processing）、遗传信息处理（Genetic Information Processing）、人类疾病（Human Diseases）、新陈代谢（Metabolism）、生物体系统（Organismal Systems）、药物发展（Drug Development），其中每类又被系统分类为二、三、四层。第二层目前包括有43种子pathway；第三层即为其代谢通路图；第四层为每个代谢通路图的具体注释信息。</w:t>
-      </w:r>
-    </w:p>
-    <w:p>
-      <w:pPr>
-        <w:ind w:firstLine="420"/>
-      </w:pPr>
-      <w:r>
-        <w:rPr>
-          <w:rFonts w:hint="eastAsia"/>
-        </w:rPr>
-        <w:t>eggNOG数据库是利用Smith-Waterman比对算法对构建的基因直系同源簇（Orthologous Groups）进行功能注释，eggNOG V4.1涵盖了2031个物种的基因，构建了约19万个Orthologous Groups。</w:t>
-      </w:r>
-    </w:p>
-    <w:p>
-      <w:pPr>
-        <w:ind w:firstLine="420"/>
-      </w:pPr>
-      <w:r>
-        <w:rPr>
-          <w:rFonts w:hint="eastAsia"/>
-        </w:rPr>
-        <w:t>CAZy数据库是研究碳水化合物酶的专业级数据库，主要涵盖6大功能类：糖苷水解酶（Glycoside Hydrolases，GHs），糖基转移酶（Glycosyl Transferases，GTs），多糖裂合酶（Polysaccharide Lyases，PLs），碳水化合物酯酶（Carbohydrate Esterases，CEs），辅助氧化还原酶(Auxiliary Activities，AAs)和碳水化合物结合模块（Carbohydrate-Binding Modules，CBMs）。</w:t>
-      </w:r>
-    </w:p>
-    <w:p>
-      <w:pPr>
-        <w:ind w:firstLine="420"/>
-      </w:pPr>
-      <w:r>
-        <w:rPr>
-          <w:rFonts w:hint="eastAsia"/>
-        </w:rPr>
-        <w:t>GO是基因本体联合会（Gene Ontology Consortium）所建立的数据库，旨在建立一个适用于各种物种的，对基因和蛋白功能进行限定和描述的，并能随着研究不断深入而更新的语义词汇标准，适用于各物种。GO按照生物过程（Biology Process），分子功能（Molecular Function）和细胞组成（Celular component）对基因进行注释和分类。通过GO富集分析可以粗略了解差异基因富集在哪些生物学功能、途径或者细胞定位。</w:t>
-      </w:r>
-    </w:p>
-    <w:p>
-      <w:pPr>
-        <w:ind w:firstLine="420"/>
-      </w:pPr>
-      <w:r>
-        <w:rPr>
-          <w:rFonts w:hint="eastAsia"/>
-        </w:rPr>
-        <w:t>功能注释基本步骤：</w:t>
-      </w:r>
-    </w:p>
-    <w:p>
-      <w:pPr>
-        <w:ind w:firstLine="420"/>
-      </w:pPr>
-      <w:r>
-        <w:rPr>
-          <w:rFonts w:hint="eastAsia"/>
-        </w:rPr>
-        <w:t>[1].</w:t>
-      </w:r>
-      <w:r>
-        <w:t xml:space="preserve"> </w:t>
-      </w:r>
-      <w:r>
-        <w:rPr>
-          <w:rFonts w:hint="eastAsia"/>
-        </w:rPr>
-        <w:t>使用</w:t>
-      </w:r>
-      <w:r>
-        <w:t>eggNOG-mapper</w:t>
-      </w:r>
-      <w:r>
-        <w:rPr>
-          <w:rFonts w:hint="eastAsia"/>
-        </w:rPr>
-        <w:t>软件将非冗余基因与各功能数据库进行比对，取e&lt;1e-5的注释，筛选具有最高序列相似性的蛋白，从而得到功能注释信息；</w:t>
-      </w:r>
-    </w:p>
-    <w:p>
-      <w:pPr>
-        <w:ind w:firstLine="420"/>
-      </w:pPr>
-      <w:r>
-        <w:rPr>
-          <w:rFonts w:hint="eastAsia"/>
-        </w:rPr>
-        <w:t>[</w:t>
-      </w:r>
-      <w:r>
-        <w:t>2</w:t>
-      </w:r>
-      <w:r>
-        <w:rPr>
-          <w:rFonts w:hint="eastAsia"/>
-        </w:rPr>
-        <w:t>].</w:t>
-      </w:r>
-      <w:r>
-        <w:t xml:space="preserve"> </w:t>
-      </w:r>
-      <w:r>
-        <w:rPr>
-          <w:rFonts w:hint="eastAsia"/>
-        </w:rPr>
-        <w:t>从比对结果出发，统计不同功能层级的相对丰度（各功能层级的相对丰度等于注释为该功能层级的基因的相对丰度之和）。</w:t>
-      </w:r>
-    </w:p>
-    <w:p>
-      <w:pPr>
-        <w:pStyle w:val="41"/>
-      </w:pPr>
-      <w:bookmarkStart w:id="155" w:name="_Toc3514"/>
-      <w:bookmarkStart w:id="156" w:name="_Toc17265"/>
-      <w:bookmarkStart w:id="157" w:name="_Toc28038"/>
-      <w:bookmarkStart w:id="158" w:name="_Toc3422"/>
-      <w:bookmarkStart w:id="159" w:name="_Toc719"/>
-      <w:r>
-        <w:rPr>
-          <w:rFonts w:hint="eastAsia"/>
-          <w:lang w:val="en-US" w:eastAsia="zh-CN"/>
-        </w:rPr>
-        <w:t>8</w:t>
-      </w:r>
-      <w:r>
-        <w:t xml:space="preserve">.1 </w:t>
-      </w:r>
-      <w:bookmarkEnd w:id="155"/>
-      <w:bookmarkEnd w:id="156"/>
-      <w:bookmarkEnd w:id="157"/>
-      <w:bookmarkEnd w:id="158"/>
-      <w:r>
-        <w:rPr>
-          <w:rFonts w:hint="eastAsia"/>
-        </w:rPr>
-        <w:t>功能相对丰度概况</w:t>
-      </w:r>
-      <w:bookmarkEnd w:id="159"/>
     </w:p>
     <w:p>
       <w:pPr>
@@ -15219,7 +15289,7 @@
     </w:p>
     <w:p>
       <w:pPr>
-        <w:ind w:firstLine="420"/>
+        <w:ind w:left="0" w:leftChars="0" w:firstLine="0" w:firstLineChars="0"/>
         <w:jc w:val="center"/>
         <w:rPr>
           <w:bCs/>
@@ -15254,7 +15324,7 @@
                     </pic:cNvPicPr>
                   </pic:nvPicPr>
                   <pic:blipFill>
-                    <a:blip r:embed="rId20"/>
+                    <a:blip r:embed="rId19"/>
                     <a:stretch>
                       <a:fillRect/>
                     </a:stretch>
@@ -15380,7 +15450,7 @@
     </w:p>
     <w:p>
       <w:pPr>
-        <w:ind w:firstLine="420"/>
+        <w:ind w:left="0" w:leftChars="0" w:firstLine="0" w:firstLineChars="0"/>
         <w:jc w:val="center"/>
         <w:rPr>
           <w:rFonts w:cs="Times New Roman"/>
@@ -15416,7 +15486,7 @@
                     </pic:cNvPicPr>
                   </pic:nvPicPr>
                   <pic:blipFill>
-                    <a:blip r:embed="rId20"/>
+                    <a:blip r:embed="rId19"/>
                     <a:stretch>
                       <a:fillRect/>
                     </a:stretch>
@@ -15575,7 +15645,7 @@
       <w:pPr>
         <w:pStyle w:val="41"/>
       </w:pPr>
-      <w:bookmarkStart w:id="160" w:name="_Toc29501"/>
+      <w:bookmarkStart w:id="150" w:name="_Toc29501"/>
       <w:r>
         <w:rPr>
           <w:rFonts w:hint="eastAsia"/>
@@ -15592,13 +15662,13 @@
         </w:rPr>
         <w:t>基于功能丰度的降维分析</w:t>
       </w:r>
-      <w:bookmarkEnd w:id="160"/>
+      <w:bookmarkEnd w:id="150"/>
     </w:p>
     <w:p>
       <w:pPr>
         <w:pStyle w:val="43"/>
       </w:pPr>
-      <w:bookmarkStart w:id="161" w:name="_Toc18771"/>
+      <w:bookmarkStart w:id="151" w:name="_Toc18771"/>
       <w:r>
         <w:rPr>
           <w:rFonts w:hint="eastAsia"/>
@@ -15615,7 +15685,7 @@
         </w:rPr>
         <w:t>分析</w:t>
       </w:r>
-      <w:bookmarkEnd w:id="161"/>
+      <w:bookmarkEnd w:id="151"/>
     </w:p>
     <w:p>
       <w:pPr>
@@ -15663,7 +15733,7 @@
     </w:p>
     <w:p>
       <w:pPr>
-        <w:ind w:firstLine="420"/>
+        <w:ind w:left="0" w:leftChars="0" w:firstLine="0" w:firstLineChars="0"/>
         <w:jc w:val="center"/>
         <w:rPr>
           <w:rFonts w:cs="Times New Roman"/>
@@ -15699,7 +15769,7 @@
                     </pic:cNvPicPr>
                   </pic:nvPicPr>
                   <pic:blipFill>
-                    <a:blip r:embed="rId20"/>
+                    <a:blip r:embed="rId19"/>
                     <a:stretch>
                       <a:fillRect/>
                     </a:stretch>
@@ -15744,7 +15814,7 @@
           </w14:textFill>
         </w:rPr>
       </w:pPr>
-      <w:bookmarkStart w:id="162" w:name="_Toc14522"/>
+      <w:bookmarkStart w:id="152" w:name="_Toc14522"/>
       <w:r>
         <w:rPr>
           <w:rFonts w:hint="eastAsia" w:cs="Times New Roman"/>
@@ -15824,7 +15894,7 @@
         </w:rPr>
         <w:t>分析</w:t>
       </w:r>
-      <w:bookmarkEnd w:id="162"/>
+      <w:bookmarkEnd w:id="152"/>
     </w:p>
     <w:p>
       <w:pPr>
@@ -15898,7 +15968,7 @@
     </w:p>
     <w:p>
       <w:pPr>
-        <w:ind w:firstLine="420"/>
+        <w:ind w:left="0" w:leftChars="0" w:firstLine="0" w:firstLineChars="0"/>
         <w:jc w:val="center"/>
         <w:rPr>
           <w:rFonts w:cs="Times New Roman"/>
@@ -15934,7 +16004,7 @@
                     </pic:cNvPicPr>
                   </pic:nvPicPr>
                   <pic:blipFill>
-                    <a:blip r:embed="rId20"/>
+                    <a:blip r:embed="rId19"/>
                     <a:stretch>
                       <a:fillRect/>
                     </a:stretch>
@@ -15982,7 +16052,7 @@
           </w14:textFill>
         </w:rPr>
       </w:pPr>
-      <w:bookmarkStart w:id="163" w:name="_Toc17650"/>
+      <w:bookmarkStart w:id="153" w:name="_Toc17650"/>
       <w:r>
         <w:rPr>
           <w:rFonts w:hint="eastAsia" w:cs="Times New Roman"/>
@@ -16053,7 +16123,7 @@
         </w:rPr>
         <w:t>分析</w:t>
       </w:r>
-      <w:bookmarkEnd w:id="163"/>
+      <w:bookmarkEnd w:id="153"/>
     </w:p>
     <w:p>
       <w:pPr>
@@ -16113,7 +16183,7 @@
     </w:p>
     <w:p>
       <w:pPr>
-        <w:ind w:firstLine="420"/>
+        <w:ind w:left="0" w:leftChars="0" w:firstLine="0" w:firstLineChars="0"/>
         <w:jc w:val="center"/>
         <w:rPr>
           <w:rFonts w:cs="Times New Roman"/>
@@ -16149,7 +16219,7 @@
                     </pic:cNvPicPr>
                   </pic:nvPicPr>
                   <pic:blipFill>
-                    <a:blip r:embed="rId20"/>
+                    <a:blip r:embed="rId19"/>
                     <a:stretch>
                       <a:fillRect/>
                     </a:stretch>
@@ -16248,7 +16318,7 @@
       <w:pPr>
         <w:pStyle w:val="41"/>
       </w:pPr>
-      <w:bookmarkStart w:id="164" w:name="_Toc13156"/>
+      <w:bookmarkStart w:id="154" w:name="_Toc13156"/>
       <w:r>
         <w:rPr>
           <w:rFonts w:hint="eastAsia"/>
@@ -16265,13 +16335,13 @@
         </w:rPr>
         <w:t>基于功能丰度的组间差异分析</w:t>
       </w:r>
-      <w:bookmarkEnd w:id="164"/>
+      <w:bookmarkEnd w:id="154"/>
     </w:p>
     <w:p>
       <w:pPr>
         <w:pStyle w:val="43"/>
       </w:pPr>
-      <w:bookmarkStart w:id="165" w:name="_Toc625"/>
+      <w:bookmarkStart w:id="155" w:name="_Toc625"/>
       <w:r>
         <w:rPr>
           <w:rFonts w:hint="eastAsia"/>
@@ -16288,7 +16358,7 @@
         </w:rPr>
         <w:t>分析</w:t>
       </w:r>
-      <w:bookmarkEnd w:id="165"/>
+      <w:bookmarkEnd w:id="155"/>
     </w:p>
     <w:p>
       <w:pPr>
@@ -16348,7 +16418,7 @@
     </w:p>
     <w:p>
       <w:pPr>
-        <w:ind w:firstLine="420"/>
+        <w:ind w:left="0" w:leftChars="0" w:firstLine="0" w:firstLineChars="0"/>
         <w:jc w:val="center"/>
         <w:rPr>
           <w:rFonts w:cs="Times New Roman"/>
@@ -16384,7 +16454,7 @@
                     </pic:cNvPicPr>
                   </pic:nvPicPr>
                   <pic:blipFill>
-                    <a:blip r:embed="rId20"/>
+                    <a:blip r:embed="rId19"/>
                     <a:stretch>
                       <a:fillRect/>
                     </a:stretch>
@@ -16429,7 +16499,7 @@
           </w14:textFill>
         </w:rPr>
       </w:pPr>
-      <w:bookmarkStart w:id="166" w:name="_Toc3887"/>
+      <w:bookmarkStart w:id="156" w:name="_Toc3887"/>
       <w:r>
         <w:rPr>
           <w:rFonts w:hint="eastAsia" w:cs="Times New Roman"/>
@@ -16500,7 +16570,7 @@
         </w:rPr>
         <w:t>秩和检验</w:t>
       </w:r>
-      <w:bookmarkEnd w:id="166"/>
+      <w:bookmarkEnd w:id="156"/>
     </w:p>
     <w:p>
       <w:pPr>
@@ -16554,7 +16624,7 @@
     </w:p>
     <w:p>
       <w:pPr>
-        <w:ind w:firstLine="420"/>
+        <w:ind w:left="0" w:leftChars="0" w:firstLine="0" w:firstLineChars="0"/>
         <w:jc w:val="center"/>
         <w:rPr>
           <w:rFonts w:cs="Times New Roman"/>
@@ -16590,7 +16660,7 @@
                     </pic:cNvPicPr>
                   </pic:nvPicPr>
                   <pic:blipFill>
-                    <a:blip r:embed="rId20"/>
+                    <a:blip r:embed="rId19"/>
                     <a:stretch>
                       <a:fillRect/>
                     </a:stretch>
@@ -16635,8 +16705,8 @@
           </w14:textFill>
         </w:rPr>
       </w:pPr>
-      <w:bookmarkStart w:id="167" w:name="_Toc23965"/>
-      <w:bookmarkStart w:id="168" w:name="_Toc5685"/>
+      <w:bookmarkStart w:id="157" w:name="_Toc23965"/>
+      <w:bookmarkStart w:id="158" w:name="_Toc5685"/>
       <w:r>
         <w:rPr>
           <w:rFonts w:hint="eastAsia" w:cs="Times New Roman"/>
@@ -16687,7 +16757,7 @@
         <w:t>-FunctionStatistical_analysis/*/2.wilcoxon</w:t>
       </w:r>
     </w:p>
-    <w:bookmarkEnd w:id="167"/>
+    <w:bookmarkEnd w:id="157"/>
     <w:p>
       <w:pPr>
         <w:pStyle w:val="43"/>
@@ -16708,7 +16778,7 @@
         </w:rPr>
         <w:t>分析</w:t>
       </w:r>
-      <w:bookmarkEnd w:id="168"/>
+      <w:bookmarkEnd w:id="158"/>
     </w:p>
     <w:p>
       <w:pPr>
@@ -16729,7 +16799,7 @@
     <w:p>
       <w:pPr>
         <w:widowControl/>
-        <w:ind w:firstLine="420"/>
+        <w:ind w:left="0" w:leftChars="0" w:firstLine="0" w:firstLineChars="0"/>
         <w:jc w:val="center"/>
         <w:rPr>
           <w:rFonts w:cs="Times New Roman"/>
@@ -16765,7 +16835,7 @@
                     </pic:cNvPicPr>
                   </pic:nvPicPr>
                   <pic:blipFill>
-                    <a:blip r:embed="rId20"/>
+                    <a:blip r:embed="rId19"/>
                     <a:stretch>
                       <a:fillRect/>
                     </a:stretch>
@@ -16813,7 +16883,7 @@
           </w14:textFill>
         </w:rPr>
       </w:pPr>
-      <w:bookmarkStart w:id="169" w:name="_Toc17043"/>
+      <w:bookmarkStart w:id="159" w:name="_Toc17043"/>
       <w:r>
         <w:rPr>
           <w:rFonts w:hint="eastAsia" w:cs="Times New Roman"/>
@@ -16884,7 +16954,7 @@
         </w:rPr>
         <w:t>分析</w:t>
       </w:r>
-      <w:bookmarkEnd w:id="169"/>
+      <w:bookmarkEnd w:id="159"/>
     </w:p>
     <w:p>
       <w:pPr>
@@ -16944,7 +17014,7 @@
     </w:p>
     <w:p>
       <w:pPr>
-        <w:ind w:firstLine="420"/>
+        <w:ind w:left="0" w:leftChars="0" w:firstLine="0" w:firstLineChars="0"/>
         <w:jc w:val="center"/>
         <w:rPr>
           <w:rFonts w:cs="Times New Roman"/>
@@ -16980,7 +17050,7 @@
                     </pic:cNvPicPr>
                   </pic:nvPicPr>
                   <pic:blipFill>
-                    <a:blip r:embed="rId20"/>
+                    <a:blip r:embed="rId19"/>
                     <a:stretch>
                       <a:fillRect/>
                     </a:stretch>
@@ -17043,7 +17113,7 @@
           </w14:textFill>
         </w:rPr>
       </w:pPr>
-      <w:bookmarkStart w:id="170" w:name="_Toc3208"/>
+      <w:bookmarkStart w:id="160" w:name="_Toc3208"/>
       <w:r>
         <w:rPr>
           <w:rFonts w:hint="eastAsia" w:cs="Times New Roman"/>
@@ -17114,7 +17184,7 @@
         </w:rPr>
         <w:t>分析</w:t>
       </w:r>
-      <w:bookmarkEnd w:id="170"/>
+      <w:bookmarkEnd w:id="160"/>
     </w:p>
     <w:p>
       <w:pPr>
@@ -17160,7 +17230,7 @@
     </w:p>
     <w:p>
       <w:pPr>
-        <w:ind w:firstLine="420"/>
+        <w:ind w:left="0" w:leftChars="0" w:firstLine="0" w:firstLineChars="0"/>
         <w:jc w:val="center"/>
         <w:rPr>
           <w:rFonts w:cs="Times New Roman"/>
@@ -17196,7 +17266,7 @@
                     </pic:cNvPicPr>
                   </pic:nvPicPr>
                   <pic:blipFill>
-                    <a:blip r:embed="rId20"/>
+                    <a:blip r:embed="rId19"/>
                     <a:stretch>
                       <a:fillRect/>
                     </a:stretch>
@@ -17241,7 +17311,7 @@
           </w14:textFill>
         </w:rPr>
       </w:pPr>
-      <w:bookmarkStart w:id="171" w:name="_Toc30678"/>
+      <w:bookmarkStart w:id="161" w:name="_Toc30678"/>
       <w:r>
         <w:rPr>
           <w:rFonts w:hint="eastAsia" w:cs="Times New Roman"/>
@@ -17312,7 +17382,7 @@
         </w:rPr>
         <w:t>分析</w:t>
       </w:r>
-      <w:bookmarkEnd w:id="171"/>
+      <w:bookmarkEnd w:id="161"/>
     </w:p>
     <w:p>
       <w:pPr>
@@ -17365,7 +17435,7 @@
           </w14:textFill>
         </w:rPr>
       </w:pPr>
-      <w:bookmarkStart w:id="172" w:name="_Toc32602"/>
+      <w:bookmarkStart w:id="162" w:name="_Toc32602"/>
       <w:r>
         <w:rPr>
           <w:rFonts w:hint="eastAsia" w:cs="Times New Roman"/>
@@ -17430,7 +17500,7 @@
       <w:r>
         <w:t>.3.7 ADONIS分析</w:t>
       </w:r>
-      <w:bookmarkEnd w:id="172"/>
+      <w:bookmarkEnd w:id="162"/>
     </w:p>
     <w:p>
       <w:pPr>
@@ -17501,7 +17571,7 @@
           </w14:textFill>
         </w:rPr>
       </w:pPr>
-      <w:bookmarkStart w:id="173" w:name="_Toc30259"/>
+      <w:bookmarkStart w:id="163" w:name="_Toc30259"/>
       <w:r>
         <w:rPr>
           <w:rFonts w:hint="eastAsia" w:cs="Times New Roman"/>
@@ -17559,7 +17629,7 @@
       <w:r>
         <w:t>8.3.8 MRPP分析</w:t>
       </w:r>
-      <w:bookmarkEnd w:id="173"/>
+      <w:bookmarkEnd w:id="163"/>
     </w:p>
     <w:p>
       <w:pPr>
@@ -17830,7 +17900,7 @@
     </w:p>
     <w:p>
       <w:pPr>
-        <w:ind w:firstLine="420"/>
+        <w:ind w:left="0" w:leftChars="0" w:firstLine="0" w:firstLineChars="0"/>
         <w:jc w:val="center"/>
         <w:rPr>
           <w:rFonts w:cs="Times New Roman"/>
@@ -17866,7 +17936,7 @@
                     </pic:cNvPicPr>
                   </pic:nvPicPr>
                   <pic:blipFill>
-                    <a:blip r:embed="rId20"/>
+                    <a:blip r:embed="rId19"/>
                     <a:stretch>
                       <a:fillRect/>
                     </a:stretch>
@@ -18013,7 +18083,7 @@
       <w:pPr>
         <w:pStyle w:val="40"/>
       </w:pPr>
-      <w:bookmarkStart w:id="174" w:name="_Toc25740"/>
+      <w:bookmarkStart w:id="164" w:name="_Toc25740"/>
       <w:r>
         <w:rPr>
           <w:rFonts w:hint="eastAsia"/>
@@ -18030,7 +18100,7 @@
         </w:rPr>
         <w:t>生物地球化学循环功能分析</w:t>
       </w:r>
-      <w:bookmarkEnd w:id="174"/>
+      <w:bookmarkEnd w:id="164"/>
     </w:p>
     <w:p>
       <w:pPr>
@@ -18058,7 +18128,7 @@
       <w:pPr>
         <w:pStyle w:val="41"/>
       </w:pPr>
-      <w:bookmarkStart w:id="175" w:name="_Toc19051"/>
+      <w:bookmarkStart w:id="165" w:name="_Toc19051"/>
       <w:r>
         <w:rPr>
           <w:rFonts w:hint="eastAsia"/>
@@ -18075,7 +18145,7 @@
         </w:rPr>
         <w:t>功能相对丰度概况</w:t>
       </w:r>
-      <w:bookmarkEnd w:id="175"/>
+      <w:bookmarkEnd w:id="165"/>
     </w:p>
     <w:p>
       <w:pPr>
@@ -18109,7 +18179,7 @@
     </w:p>
     <w:p>
       <w:pPr>
-        <w:ind w:firstLine="420"/>
+        <w:ind w:left="0" w:leftChars="0" w:firstLine="0" w:firstLineChars="0"/>
         <w:jc w:val="center"/>
         <w:rPr>
           <w:bCs/>
@@ -18144,7 +18214,7 @@
                     </pic:cNvPicPr>
                   </pic:nvPicPr>
                   <pic:blipFill>
-                    <a:blip r:embed="rId20"/>
+                    <a:blip r:embed="rId19"/>
                     <a:stretch>
                       <a:fillRect/>
                     </a:stretch>
@@ -18268,7 +18338,7 @@
     </w:p>
     <w:p>
       <w:pPr>
-        <w:ind w:firstLine="420"/>
+        <w:ind w:left="0" w:leftChars="0" w:firstLine="0" w:firstLineChars="0"/>
         <w:jc w:val="center"/>
         <w:rPr>
           <w:rFonts w:cs="Times New Roman"/>
@@ -18304,7 +18374,7 @@
                     </pic:cNvPicPr>
                   </pic:nvPicPr>
                   <pic:blipFill>
-                    <a:blip r:embed="rId20"/>
+                    <a:blip r:embed="rId19"/>
                     <a:stretch>
                       <a:fillRect/>
                     </a:stretch>
@@ -18445,7 +18515,7 @@
       <w:pPr>
         <w:pStyle w:val="41"/>
       </w:pPr>
-      <w:bookmarkStart w:id="176" w:name="_Toc570"/>
+      <w:bookmarkStart w:id="166" w:name="_Toc570"/>
       <w:r>
         <w:rPr>
           <w:rFonts w:hint="eastAsia"/>
@@ -18462,7 +18532,7 @@
         </w:rPr>
         <w:t>基于功能丰度的降维分析</w:t>
       </w:r>
-      <w:bookmarkEnd w:id="176"/>
+      <w:bookmarkEnd w:id="166"/>
     </w:p>
     <w:p>
       <w:pPr>
@@ -18531,7 +18601,7 @@
     </w:p>
     <w:p>
       <w:pPr>
-        <w:ind w:firstLine="420"/>
+        <w:ind w:left="0" w:leftChars="0" w:firstLine="0" w:firstLineChars="0"/>
         <w:jc w:val="center"/>
         <w:rPr>
           <w:rFonts w:cs="Times New Roman"/>
@@ -18569,7 +18639,7 @@
                     </pic:cNvPicPr>
                   </pic:nvPicPr>
                   <pic:blipFill>
-                    <a:blip r:embed="rId20"/>
+                    <a:blip r:embed="rId19"/>
                     <a:stretch>
                       <a:fillRect/>
                     </a:stretch>
@@ -18766,7 +18836,7 @@
     </w:p>
     <w:p>
       <w:pPr>
-        <w:ind w:firstLine="420"/>
+        <w:ind w:left="0" w:leftChars="0" w:firstLine="0" w:firstLineChars="0"/>
         <w:jc w:val="center"/>
         <w:rPr>
           <w:rFonts w:cs="Times New Roman"/>
@@ -18802,7 +18872,7 @@
                     </pic:cNvPicPr>
                   </pic:nvPicPr>
                   <pic:blipFill>
-                    <a:blip r:embed="rId20"/>
+                    <a:blip r:embed="rId19"/>
                     <a:stretch>
                       <a:fillRect/>
                     </a:stretch>
@@ -18979,7 +19049,7 @@
     </w:p>
     <w:p>
       <w:pPr>
-        <w:ind w:firstLine="420"/>
+        <w:ind w:left="0" w:leftChars="0" w:firstLine="0" w:firstLineChars="0"/>
         <w:jc w:val="center"/>
         <w:rPr>
           <w:rFonts w:cs="Times New Roman"/>
@@ -19015,7 +19085,7 @@
                     </pic:cNvPicPr>
                   </pic:nvPicPr>
                   <pic:blipFill>
-                    <a:blip r:embed="rId20"/>
+                    <a:blip r:embed="rId19"/>
                     <a:stretch>
                       <a:fillRect/>
                     </a:stretch>
@@ -19114,7 +19184,7 @@
       <w:pPr>
         <w:pStyle w:val="41"/>
       </w:pPr>
-      <w:bookmarkStart w:id="177" w:name="_Toc24121"/>
+      <w:bookmarkStart w:id="167" w:name="_Toc24121"/>
       <w:r>
         <w:rPr>
           <w:rFonts w:hint="eastAsia"/>
@@ -19131,7 +19201,7 @@
         </w:rPr>
         <w:t>基于功能丰度的组间差异分析</w:t>
       </w:r>
-      <w:bookmarkEnd w:id="177"/>
+      <w:bookmarkEnd w:id="167"/>
     </w:p>
     <w:p>
       <w:pPr>
@@ -19212,7 +19282,7 @@
     </w:p>
     <w:p>
       <w:pPr>
-        <w:ind w:firstLine="420"/>
+        <w:ind w:left="0" w:leftChars="0" w:firstLine="0" w:firstLineChars="0"/>
         <w:jc w:val="center"/>
         <w:rPr>
           <w:rFonts w:cs="Times New Roman"/>
@@ -19248,7 +19318,7 @@
                     </pic:cNvPicPr>
                   </pic:nvPicPr>
                   <pic:blipFill>
-                    <a:blip r:embed="rId20"/>
+                    <a:blip r:embed="rId19"/>
                     <a:stretch>
                       <a:fillRect/>
                     </a:stretch>
@@ -19416,7 +19486,7 @@
     </w:p>
     <w:p>
       <w:pPr>
-        <w:ind w:firstLine="420"/>
+        <w:ind w:left="0" w:leftChars="0" w:firstLine="0" w:firstLineChars="0"/>
         <w:jc w:val="center"/>
         <w:rPr>
           <w:rFonts w:cs="Times New Roman"/>
@@ -19452,7 +19522,7 @@
                     </pic:cNvPicPr>
                   </pic:nvPicPr>
                   <pic:blipFill>
-                    <a:blip r:embed="rId20"/>
+                    <a:blip r:embed="rId19"/>
                     <a:stretch>
                       <a:fillRect/>
                     </a:stretch>
@@ -19587,7 +19657,7 @@
     <w:p>
       <w:pPr>
         <w:widowControl/>
-        <w:ind w:firstLine="420"/>
+        <w:ind w:left="0" w:leftChars="0" w:firstLine="0" w:firstLineChars="0"/>
         <w:jc w:val="center"/>
         <w:rPr>
           <w:rFonts w:cs="Times New Roman"/>
@@ -19623,7 +19693,7 @@
                     </pic:cNvPicPr>
                   </pic:nvPicPr>
                   <pic:blipFill>
-                    <a:blip r:embed="rId20"/>
+                    <a:blip r:embed="rId19"/>
                     <a:stretch>
                       <a:fillRect/>
                     </a:stretch>
@@ -19800,7 +19870,7 @@
     </w:p>
     <w:p>
       <w:pPr>
-        <w:ind w:firstLine="420"/>
+        <w:ind w:left="0" w:leftChars="0" w:firstLine="0" w:firstLineChars="0"/>
         <w:jc w:val="center"/>
         <w:rPr>
           <w:rFonts w:cs="Times New Roman"/>
@@ -19836,7 +19906,7 @@
                     </pic:cNvPicPr>
                   </pic:nvPicPr>
                   <pic:blipFill>
-                    <a:blip r:embed="rId20"/>
+                    <a:blip r:embed="rId19"/>
                     <a:stretch>
                       <a:fillRect/>
                     </a:stretch>
@@ -20014,7 +20084,7 @@
     </w:p>
     <w:p>
       <w:pPr>
-        <w:ind w:firstLine="420"/>
+        <w:ind w:left="0" w:leftChars="0" w:firstLine="0" w:firstLineChars="0"/>
         <w:jc w:val="center"/>
         <w:rPr>
           <w:rFonts w:cs="Times New Roman"/>
@@ -20050,7 +20120,7 @@
                     </pic:cNvPicPr>
                   </pic:nvPicPr>
                   <pic:blipFill>
-                    <a:blip r:embed="rId20"/>
+                    <a:blip r:embed="rId19"/>
                     <a:stretch>
                       <a:fillRect/>
                     </a:stretch>
@@ -20660,7 +20730,7 @@
     </w:p>
     <w:p>
       <w:pPr>
-        <w:ind w:firstLine="420"/>
+        <w:ind w:left="0" w:leftChars="0" w:firstLine="0" w:firstLineChars="0"/>
         <w:jc w:val="center"/>
         <w:rPr>
           <w:rFonts w:cs="Times New Roman"/>
@@ -20696,7 +20766,7 @@
                     </pic:cNvPicPr>
                   </pic:nvPicPr>
                   <pic:blipFill>
-                    <a:blip r:embed="rId20"/>
+                    <a:blip r:embed="rId19"/>
                     <a:stretch>
                       <a:fillRect/>
                     </a:stretch>
@@ -20843,7 +20913,7 @@
       <w:pPr>
         <w:pStyle w:val="40"/>
       </w:pPr>
-      <w:bookmarkStart w:id="178" w:name="_Toc16616"/>
+      <w:bookmarkStart w:id="168" w:name="_Toc16616"/>
       <w:r>
         <w:t>1</w:t>
       </w:r>
@@ -20863,7 +20933,7 @@
         </w:rPr>
         <w:t>抗性基因注释</w:t>
       </w:r>
-      <w:bookmarkEnd w:id="178"/>
+      <w:bookmarkEnd w:id="168"/>
     </w:p>
     <w:p>
       <w:pPr>
@@ -20900,7 +20970,7 @@
       <w:pPr>
         <w:pStyle w:val="41"/>
       </w:pPr>
-      <w:bookmarkStart w:id="179" w:name="_Toc29189"/>
+      <w:bookmarkStart w:id="169" w:name="_Toc29189"/>
       <w:r>
         <w:t>1</w:t>
       </w:r>
@@ -20920,7 +20990,7 @@
         </w:rPr>
         <w:t>抗性基因丰度统计</w:t>
       </w:r>
-      <w:bookmarkEnd w:id="179"/>
+      <w:bookmarkEnd w:id="169"/>
     </w:p>
     <w:p>
       <w:pPr>
@@ -20947,7 +21017,7 @@
     </w:p>
     <w:p>
       <w:pPr>
-        <w:ind w:firstLine="420"/>
+        <w:ind w:left="0" w:leftChars="0" w:firstLine="0" w:firstLineChars="0"/>
         <w:jc w:val="center"/>
         <w:rPr>
           <w:rFonts w:cs="Times New Roman"/>
@@ -20983,7 +21053,7 @@
                     </pic:cNvPicPr>
                   </pic:nvPicPr>
                   <pic:blipFill>
-                    <a:blip r:embed="rId20"/>
+                    <a:blip r:embed="rId19"/>
                     <a:stretch>
                       <a:fillRect/>
                     </a:stretch>
@@ -21147,7 +21217,7 @@
     </w:p>
     <w:p>
       <w:pPr>
-        <w:ind w:firstLine="420"/>
+        <w:ind w:left="0" w:leftChars="0" w:firstLine="0" w:firstLineChars="0"/>
         <w:jc w:val="center"/>
         <w:rPr>
           <w:rFonts w:cs="Times New Roman"/>
@@ -21183,7 +21253,7 @@
                     </pic:cNvPicPr>
                   </pic:nvPicPr>
                   <pic:blipFill>
-                    <a:blip r:embed="rId20"/>
+                    <a:blip r:embed="rId19"/>
                     <a:stretch>
                       <a:fillRect/>
                     </a:stretch>
@@ -21390,7 +21460,7 @@
       <w:pPr>
         <w:pStyle w:val="41"/>
       </w:pPr>
-      <w:bookmarkStart w:id="180" w:name="_Toc23463"/>
+      <w:bookmarkStart w:id="170" w:name="_Toc23463"/>
       <w:r>
         <w:t>1</w:t>
       </w:r>
@@ -21410,7 +21480,7 @@
         </w:rPr>
         <w:t>基于抗性基因功能的降维分析</w:t>
       </w:r>
-      <w:bookmarkEnd w:id="180"/>
+      <w:bookmarkEnd w:id="170"/>
     </w:p>
     <w:p>
       <w:pPr>
@@ -21496,7 +21566,7 @@
     </w:p>
     <w:p>
       <w:pPr>
-        <w:ind w:firstLine="420"/>
+        <w:ind w:left="0" w:leftChars="0" w:firstLine="0" w:firstLineChars="0"/>
         <w:jc w:val="center"/>
         <w:rPr>
           <w:rFonts w:cs="Times New Roman"/>
@@ -21532,7 +21602,7 @@
                     </pic:cNvPicPr>
                   </pic:nvPicPr>
                   <pic:blipFill>
-                    <a:blip r:embed="rId20"/>
+                    <a:blip r:embed="rId19"/>
                     <a:stretch>
                       <a:fillRect/>
                     </a:stretch>
@@ -21701,7 +21771,6 @@
       <w:pPr>
         <w:pStyle w:val="32"/>
         <w:spacing w:line="360" w:lineRule="auto"/>
-        <w:ind w:firstLine="420" w:firstLineChars="200"/>
         <w:jc w:val="center"/>
         <w:rPr>
           <w:szCs w:val="21"/>
@@ -21736,7 +21805,7 @@
                     </pic:cNvPicPr>
                   </pic:nvPicPr>
                   <pic:blipFill>
-                    <a:blip r:embed="rId20"/>
+                    <a:blip r:embed="rId19"/>
                     <a:stretch>
                       <a:fillRect/>
                     </a:stretch>
@@ -21920,7 +21989,7 @@
     </w:p>
     <w:p>
       <w:pPr>
-        <w:ind w:firstLine="420"/>
+        <w:ind w:left="0" w:leftChars="0" w:firstLine="0" w:firstLineChars="0"/>
         <w:jc w:val="center"/>
         <w:rPr>
           <w:rFonts w:cs="Times New Roman"/>
@@ -21956,7 +22025,7 @@
                     </pic:cNvPicPr>
                   </pic:nvPicPr>
                   <pic:blipFill>
-                    <a:blip r:embed="rId20"/>
+                    <a:blip r:embed="rId19"/>
                     <a:stretch>
                       <a:fillRect/>
                     </a:stretch>
@@ -22055,7 +22124,7 @@
       <w:pPr>
         <w:pStyle w:val="41"/>
       </w:pPr>
-      <w:bookmarkStart w:id="181" w:name="_Toc20099"/>
+      <w:bookmarkStart w:id="171" w:name="_Toc20099"/>
       <w:r>
         <w:t>1</w:t>
       </w:r>
@@ -22075,7 +22144,7 @@
         </w:rPr>
         <w:t>基于抗性基因的组间差异分析</w:t>
       </w:r>
-      <w:bookmarkEnd w:id="181"/>
+      <w:bookmarkEnd w:id="171"/>
     </w:p>
     <w:p>
       <w:pPr>
@@ -22152,7 +22221,7 @@
     </w:p>
     <w:p>
       <w:pPr>
-        <w:ind w:firstLine="420"/>
+        <w:ind w:left="0" w:leftChars="0" w:firstLine="0" w:firstLineChars="0"/>
         <w:jc w:val="center"/>
         <w:rPr>
           <w:rFonts w:cs="Times New Roman"/>
@@ -22194,7 +22263,7 @@
                     </pic:cNvPicPr>
                   </pic:nvPicPr>
                   <pic:blipFill>
-                    <a:blip r:embed="rId20"/>
+                    <a:blip r:embed="rId19"/>
                     <a:stretch>
                       <a:fillRect/>
                     </a:stretch>
@@ -22360,7 +22429,7 @@
     </w:p>
     <w:p>
       <w:pPr>
-        <w:ind w:firstLine="420"/>
+        <w:ind w:left="0" w:leftChars="0" w:firstLine="0" w:firstLineChars="0"/>
         <w:jc w:val="center"/>
         <w:rPr>
           <w:rFonts w:cs="Times New Roman"/>
@@ -22396,7 +22465,7 @@
                     </pic:cNvPicPr>
                   </pic:nvPicPr>
                   <pic:blipFill>
-                    <a:blip r:embed="rId20"/>
+                    <a:blip r:embed="rId19"/>
                     <a:stretch>
                       <a:fillRect/>
                     </a:stretch>
@@ -22572,7 +22641,7 @@
     <w:p>
       <w:pPr>
         <w:widowControl/>
-        <w:ind w:firstLine="420"/>
+        <w:ind w:left="0" w:leftChars="0" w:firstLine="0" w:firstLineChars="0"/>
         <w:jc w:val="center"/>
         <w:rPr>
           <w:rFonts w:cs="Times New Roman"/>
@@ -22608,7 +22677,7 @@
                     </pic:cNvPicPr>
                   </pic:nvPicPr>
                   <pic:blipFill>
-                    <a:blip r:embed="rId20"/>
+                    <a:blip r:embed="rId19"/>
                     <a:stretch>
                       <a:fillRect/>
                     </a:stretch>
@@ -22795,7 +22864,7 @@
     </w:p>
     <w:p>
       <w:pPr>
-        <w:ind w:firstLine="420"/>
+        <w:ind w:left="0" w:leftChars="0" w:firstLine="0" w:firstLineChars="0"/>
         <w:jc w:val="center"/>
         <w:rPr>
           <w:rFonts w:cs="Times New Roman"/>
@@ -22831,7 +22900,7 @@
                     </pic:cNvPicPr>
                   </pic:nvPicPr>
                   <pic:blipFill>
-                    <a:blip r:embed="rId20"/>
+                    <a:blip r:embed="rId19"/>
                     <a:stretch>
                       <a:fillRect/>
                     </a:stretch>
@@ -23007,7 +23076,7 @@
     </w:p>
     <w:p>
       <w:pPr>
-        <w:ind w:firstLine="420"/>
+        <w:ind w:left="0" w:leftChars="0" w:firstLine="0" w:firstLineChars="0"/>
         <w:jc w:val="center"/>
         <w:rPr>
           <w:rFonts w:cs="Times New Roman"/>
@@ -23043,7 +23112,7 @@
                     </pic:cNvPicPr>
                   </pic:nvPicPr>
                   <pic:blipFill>
-                    <a:blip r:embed="rId20"/>
+                    <a:blip r:embed="rId19"/>
                     <a:stretch>
                       <a:fillRect/>
                     </a:stretch>
@@ -23633,7 +23702,7 @@
     </w:p>
     <w:p>
       <w:pPr>
-        <w:ind w:firstLine="420"/>
+        <w:ind w:left="0" w:leftChars="0" w:firstLine="0" w:firstLineChars="0"/>
         <w:jc w:val="center"/>
         <w:rPr>
           <w:rFonts w:cs="Times New Roman"/>
@@ -23669,7 +23738,7 @@
                     </pic:cNvPicPr>
                   </pic:nvPicPr>
                   <pic:blipFill>
-                    <a:blip r:embed="rId20"/>
+                    <a:blip r:embed="rId19"/>
                     <a:stretch>
                       <a:fillRect/>
                     </a:stretch>
@@ -23825,7 +23894,7 @@
       <w:pPr>
         <w:pStyle w:val="40"/>
       </w:pPr>
-      <w:bookmarkStart w:id="182" w:name="_Toc12953"/>
+      <w:bookmarkStart w:id="172" w:name="_Toc12953"/>
       <w:r>
         <w:rPr>
           <w:rFonts w:hint="eastAsia"/>
@@ -23853,7 +23922,7 @@
         </w:rPr>
         <w:t>毒力因子分析</w:t>
       </w:r>
-      <w:bookmarkEnd w:id="182"/>
+      <w:bookmarkEnd w:id="172"/>
     </w:p>
     <w:p>
       <w:pPr>
@@ -23870,7 +23939,7 @@
       <w:pPr>
         <w:pStyle w:val="41"/>
       </w:pPr>
-      <w:bookmarkStart w:id="183" w:name="_Toc11402"/>
+      <w:bookmarkStart w:id="173" w:name="_Toc11402"/>
       <w:r>
         <w:t>1</w:t>
       </w:r>
@@ -23890,7 +23959,7 @@
         </w:rPr>
         <w:t>毒力因子基因丰度统计</w:t>
       </w:r>
-      <w:bookmarkEnd w:id="183"/>
+      <w:bookmarkEnd w:id="173"/>
     </w:p>
     <w:p>
       <w:pPr>
@@ -23910,7 +23979,7 @@
     </w:p>
     <w:p>
       <w:pPr>
-        <w:ind w:firstLine="420"/>
+        <w:ind w:left="0" w:leftChars="0" w:firstLine="0" w:firstLineChars="0"/>
         <w:jc w:val="center"/>
         <w:rPr>
           <w:rFonts w:cs="Times New Roman"/>
@@ -23946,7 +24015,7 @@
                     </pic:cNvPicPr>
                   </pic:nvPicPr>
                   <pic:blipFill>
-                    <a:blip r:embed="rId20"/>
+                    <a:blip r:embed="rId19"/>
                     <a:stretch>
                       <a:fillRect/>
                     </a:stretch>
@@ -24085,7 +24154,7 @@
     </w:p>
     <w:p>
       <w:pPr>
-        <w:ind w:firstLine="420"/>
+        <w:ind w:left="0" w:leftChars="0" w:firstLine="0" w:firstLineChars="0"/>
         <w:jc w:val="center"/>
         <w:rPr>
           <w:rFonts w:cs="Times New Roman"/>
@@ -24121,7 +24190,7 @@
                     </pic:cNvPicPr>
                   </pic:nvPicPr>
                   <pic:blipFill>
-                    <a:blip r:embed="rId20"/>
+                    <a:blip r:embed="rId19"/>
                     <a:stretch>
                       <a:fillRect/>
                     </a:stretch>
@@ -24323,7 +24392,7 @@
       <w:pPr>
         <w:pStyle w:val="41"/>
       </w:pPr>
-      <w:bookmarkStart w:id="184" w:name="_Toc30603"/>
+      <w:bookmarkStart w:id="174" w:name="_Toc30603"/>
       <w:r>
         <w:t>1</w:t>
       </w:r>
@@ -24343,7 +24412,7 @@
         </w:rPr>
         <w:t>基于毒力因子的降维分析</w:t>
       </w:r>
-      <w:bookmarkEnd w:id="184"/>
+      <w:bookmarkEnd w:id="174"/>
     </w:p>
     <w:p>
       <w:pPr>
@@ -24413,7 +24482,7 @@
     </w:p>
     <w:p>
       <w:pPr>
-        <w:ind w:firstLine="420"/>
+        <w:ind w:left="0" w:leftChars="0" w:firstLine="0" w:firstLineChars="0"/>
         <w:jc w:val="center"/>
         <w:rPr>
           <w:rFonts w:cs="Times New Roman"/>
@@ -24449,7 +24518,7 @@
                     </pic:cNvPicPr>
                   </pic:nvPicPr>
                   <pic:blipFill>
-                    <a:blip r:embed="rId20"/>
+                    <a:blip r:embed="rId19"/>
                     <a:stretch>
                       <a:fillRect/>
                     </a:stretch>
@@ -24611,7 +24680,6 @@
       <w:pPr>
         <w:pStyle w:val="32"/>
         <w:spacing w:line="360" w:lineRule="auto"/>
-        <w:ind w:firstLine="420" w:firstLineChars="200"/>
         <w:jc w:val="center"/>
         <w:rPr>
           <w:szCs w:val="21"/>
@@ -24646,7 +24714,7 @@
                     </pic:cNvPicPr>
                   </pic:nvPicPr>
                   <pic:blipFill>
-                    <a:blip r:embed="rId20"/>
+                    <a:blip r:embed="rId19"/>
                     <a:stretch>
                       <a:fillRect/>
                     </a:stretch>
@@ -24823,7 +24891,7 @@
     </w:p>
     <w:p>
       <w:pPr>
-        <w:ind w:firstLine="420"/>
+        <w:ind w:left="0" w:leftChars="0" w:firstLine="0" w:firstLineChars="0"/>
         <w:jc w:val="center"/>
         <w:rPr>
           <w:rFonts w:cs="Times New Roman"/>
@@ -24859,7 +24927,7 @@
                     </pic:cNvPicPr>
                   </pic:nvPicPr>
                   <pic:blipFill>
-                    <a:blip r:embed="rId20"/>
+                    <a:blip r:embed="rId19"/>
                     <a:stretch>
                       <a:fillRect/>
                     </a:stretch>
@@ -24958,7 +25026,7 @@
       <w:pPr>
         <w:pStyle w:val="41"/>
       </w:pPr>
-      <w:bookmarkStart w:id="185" w:name="_Toc10685"/>
+      <w:bookmarkStart w:id="175" w:name="_Toc10685"/>
       <w:r>
         <w:t>1</w:t>
       </w:r>
@@ -24978,7 +25046,7 @@
         </w:rPr>
         <w:t>基于毒力因子的组间差异分析</w:t>
       </w:r>
-      <w:bookmarkEnd w:id="185"/>
+      <w:bookmarkEnd w:id="175"/>
     </w:p>
     <w:p>
       <w:pPr>
@@ -25048,7 +25116,7 @@
     </w:p>
     <w:p>
       <w:pPr>
-        <w:ind w:firstLine="420"/>
+        <w:ind w:left="0" w:leftChars="0" w:firstLine="0" w:firstLineChars="0"/>
         <w:jc w:val="center"/>
         <w:rPr>
           <w:rFonts w:cs="Times New Roman"/>
@@ -25090,7 +25158,7 @@
                     </pic:cNvPicPr>
                   </pic:nvPicPr>
                   <pic:blipFill>
-                    <a:blip r:embed="rId20"/>
+                    <a:blip r:embed="rId19"/>
                     <a:stretch>
                       <a:fillRect/>
                     </a:stretch>
@@ -25249,7 +25317,7 @@
     </w:p>
     <w:p>
       <w:pPr>
-        <w:ind w:firstLine="420"/>
+        <w:ind w:left="0" w:leftChars="0" w:firstLine="0" w:firstLineChars="0"/>
         <w:jc w:val="center"/>
         <w:rPr>
           <w:rFonts w:cs="Times New Roman"/>
@@ -25285,7 +25353,7 @@
                     </pic:cNvPicPr>
                   </pic:nvPicPr>
                   <pic:blipFill>
-                    <a:blip r:embed="rId20"/>
+                    <a:blip r:embed="rId19"/>
                     <a:stretch>
                       <a:fillRect/>
                     </a:stretch>
@@ -25454,7 +25522,7 @@
     <w:p>
       <w:pPr>
         <w:widowControl/>
-        <w:ind w:firstLine="420"/>
+        <w:ind w:left="0" w:leftChars="0" w:firstLine="0" w:firstLineChars="0"/>
         <w:jc w:val="center"/>
         <w:rPr>
           <w:rFonts w:cs="Times New Roman"/>
@@ -25490,7 +25558,7 @@
                     </pic:cNvPicPr>
                   </pic:nvPicPr>
                   <pic:blipFill>
-                    <a:blip r:embed="rId20"/>
+                    <a:blip r:embed="rId19"/>
                     <a:stretch>
                       <a:fillRect/>
                     </a:stretch>
@@ -25670,7 +25738,7 @@
     </w:p>
     <w:p>
       <w:pPr>
-        <w:ind w:firstLine="420"/>
+        <w:ind w:left="0" w:leftChars="0" w:firstLine="0" w:firstLineChars="0"/>
         <w:jc w:val="center"/>
         <w:rPr>
           <w:rFonts w:cs="Times New Roman"/>
@@ -25706,7 +25774,7 @@
                     </pic:cNvPicPr>
                   </pic:nvPicPr>
                   <pic:blipFill>
-                    <a:blip r:embed="rId20"/>
+                    <a:blip r:embed="rId19"/>
                     <a:stretch>
                       <a:fillRect/>
                     </a:stretch>
@@ -25879,7 +25947,7 @@
     </w:p>
     <w:p>
       <w:pPr>
-        <w:ind w:firstLine="420"/>
+        <w:ind w:left="0" w:leftChars="0" w:firstLine="0" w:firstLineChars="0"/>
         <w:jc w:val="center"/>
         <w:rPr>
           <w:rFonts w:cs="Times New Roman"/>
@@ -25915,7 +25983,7 @@
                     </pic:cNvPicPr>
                   </pic:nvPicPr>
                   <pic:blipFill>
-                    <a:blip r:embed="rId20"/>
+                    <a:blip r:embed="rId19"/>
                     <a:stretch>
                       <a:fillRect/>
                     </a:stretch>
@@ -26409,10 +26477,10 @@
       <w:pPr>
         <w:pStyle w:val="43"/>
       </w:pPr>
-      <w:bookmarkStart w:id="186" w:name="_Toc7328"/>
-      <w:bookmarkStart w:id="187" w:name="_Toc16111"/>
-      <w:bookmarkStart w:id="188" w:name="_Toc5464"/>
-      <w:bookmarkStart w:id="189" w:name="_Toc4159"/>
+      <w:bookmarkStart w:id="176" w:name="_Toc7328"/>
+      <w:bookmarkStart w:id="177" w:name="_Toc5464"/>
+      <w:bookmarkStart w:id="178" w:name="_Toc4159"/>
+      <w:bookmarkStart w:id="179" w:name="_Toc16111"/>
       <w:r>
         <w:t>1</w:t>
       </w:r>
@@ -26502,7 +26570,7 @@
     </w:p>
     <w:p>
       <w:pPr>
-        <w:ind w:firstLine="420"/>
+        <w:ind w:left="0" w:leftChars="0" w:firstLine="0" w:firstLineChars="0"/>
         <w:jc w:val="center"/>
         <w:rPr>
           <w:rFonts w:cs="Times New Roman"/>
@@ -26538,7 +26606,7 @@
                     </pic:cNvPicPr>
                   </pic:nvPicPr>
                   <pic:blipFill>
-                    <a:blip r:embed="rId20"/>
+                    <a:blip r:embed="rId19"/>
                     <a:stretch>
                       <a:fillRect/>
                     </a:stretch>
@@ -26699,7 +26767,7 @@
           </w14:textFill>
         </w:rPr>
       </w:pPr>
-      <w:bookmarkStart w:id="190" w:name="_Toc24696"/>
+      <w:bookmarkStart w:id="180" w:name="_Toc24696"/>
       <w:r>
         <w:rPr>
           <w:rFonts w:ascii="Times New Roman" w:hAnsi="Times New Roman" w:eastAsia="宋体" w:cs="Times New Roman"/>
@@ -26767,7 +26835,7 @@
         </w:rPr>
         <w:t>可移动遗传元件分析</w:t>
       </w:r>
-      <w:bookmarkEnd w:id="190"/>
+      <w:bookmarkEnd w:id="180"/>
     </w:p>
     <w:p>
       <w:pPr>
@@ -27916,8 +27984,8 @@
           </w14:textFill>
         </w:rPr>
       </w:pPr>
-      <w:bookmarkStart w:id="191" w:name="_Toc32645"/>
-      <w:bookmarkStart w:id="192" w:name="OLE_LINK3"/>
+      <w:bookmarkStart w:id="181" w:name="_Toc32645"/>
+      <w:bookmarkStart w:id="182" w:name="OLE_LINK3"/>
       <w:r>
         <w:rPr>
           <w:color w:val="000000" w:themeColor="text1"/>
@@ -27965,7 +28033,7 @@
         </w:rPr>
         <w:t>可移动基因元件丰度统计</w:t>
       </w:r>
-      <w:bookmarkEnd w:id="191"/>
+      <w:bookmarkEnd w:id="181"/>
     </w:p>
     <w:p>
       <w:pPr>
@@ -27985,7 +28053,7 @@
     </w:p>
     <w:p>
       <w:pPr>
-        <w:ind w:firstLine="420"/>
+        <w:ind w:left="0" w:leftChars="0" w:firstLine="0" w:firstLineChars="0"/>
         <w:jc w:val="center"/>
         <w:rPr>
           <w:rFonts w:cs="Times New Roman"/>
@@ -28027,7 +28095,7 @@
                     </pic:cNvPicPr>
                   </pic:nvPicPr>
                   <pic:blipFill>
-                    <a:blip r:embed="rId20"/>
+                    <a:blip r:embed="rId19"/>
                     <a:stretch>
                       <a:fillRect/>
                     </a:stretch>
@@ -28171,7 +28239,7 @@
     </w:p>
     <w:p>
       <w:pPr>
-        <w:ind w:firstLine="420"/>
+        <w:ind w:left="0" w:leftChars="0" w:firstLine="0" w:firstLineChars="0"/>
         <w:jc w:val="center"/>
         <w:rPr>
           <w:rFonts w:cs="Times New Roman"/>
@@ -28213,7 +28281,7 @@
                     </pic:cNvPicPr>
                   </pic:nvPicPr>
                   <pic:blipFill>
-                    <a:blip r:embed="rId20"/>
+                    <a:blip r:embed="rId19"/>
                     <a:stretch>
                       <a:fillRect/>
                     </a:stretch>
@@ -28325,7 +28393,7 @@
           </w14:textFill>
         </w:rPr>
       </w:pPr>
-      <w:bookmarkStart w:id="193" w:name="_Toc5911"/>
+      <w:bookmarkStart w:id="183" w:name="_Toc5911"/>
       <w:r>
         <w:rPr>
           <w:color w:val="000000" w:themeColor="text1"/>
@@ -28373,7 +28441,7 @@
         </w:rPr>
         <w:t>可移动基因元件的降维分析</w:t>
       </w:r>
-      <w:bookmarkEnd w:id="193"/>
+      <w:bookmarkEnd w:id="183"/>
     </w:p>
     <w:p>
       <w:pPr>
@@ -28479,7 +28547,7 @@
     </w:p>
     <w:p>
       <w:pPr>
-        <w:ind w:firstLine="420"/>
+        <w:ind w:left="0" w:leftChars="0" w:firstLine="0" w:firstLineChars="0"/>
         <w:jc w:val="center"/>
         <w:rPr>
           <w:rFonts w:cs="Times New Roman"/>
@@ -28521,7 +28589,7 @@
                     </pic:cNvPicPr>
                   </pic:nvPicPr>
                   <pic:blipFill>
-                    <a:blip r:embed="rId20"/>
+                    <a:blip r:embed="rId19"/>
                     <a:stretch>
                       <a:fillRect/>
                     </a:stretch>
@@ -28750,7 +28818,6 @@
       <w:pPr>
         <w:pStyle w:val="32"/>
         <w:spacing w:line="360" w:lineRule="auto"/>
-        <w:ind w:firstLine="420" w:firstLineChars="200"/>
         <w:jc w:val="center"/>
         <w:rPr>
           <w:color w:val="000000" w:themeColor="text1"/>
@@ -28791,7 +28858,7 @@
                     </pic:cNvPicPr>
                   </pic:nvPicPr>
                   <pic:blipFill>
-                    <a:blip r:embed="rId20"/>
+                    <a:blip r:embed="rId19"/>
                     <a:stretch>
                       <a:fillRect/>
                     </a:stretch>
@@ -28995,7 +29062,7 @@
     </w:p>
     <w:p>
       <w:pPr>
-        <w:ind w:firstLine="420"/>
+        <w:ind w:left="0" w:leftChars="0" w:firstLine="0" w:firstLineChars="0"/>
         <w:jc w:val="center"/>
         <w:rPr>
           <w:rFonts w:cs="Times New Roman"/>
@@ -29037,7 +29104,7 @@
                     </pic:cNvPicPr>
                   </pic:nvPicPr>
                   <pic:blipFill>
-                    <a:blip r:embed="rId20"/>
+                    <a:blip r:embed="rId19"/>
                     <a:stretch>
                       <a:fillRect/>
                     </a:stretch>
@@ -29149,7 +29216,7 @@
           </w14:textFill>
         </w:rPr>
       </w:pPr>
-      <w:bookmarkStart w:id="194" w:name="_Toc30437"/>
+      <w:bookmarkStart w:id="184" w:name="_Toc30437"/>
       <w:r>
         <w:rPr>
           <w:color w:val="000000" w:themeColor="text1"/>
@@ -29197,7 +29264,7 @@
         </w:rPr>
         <w:t>可移动基因元件的组间差异分析</w:t>
       </w:r>
-      <w:bookmarkEnd w:id="194"/>
+      <w:bookmarkEnd w:id="184"/>
     </w:p>
     <w:p>
       <w:pPr>
@@ -29303,7 +29370,7 @@
     </w:p>
     <w:p>
       <w:pPr>
-        <w:ind w:firstLine="420"/>
+        <w:ind w:left="0" w:leftChars="0" w:firstLine="0" w:firstLineChars="0"/>
         <w:jc w:val="center"/>
         <w:rPr>
           <w:rFonts w:cs="Times New Roman"/>
@@ -29345,7 +29412,7 @@
                     </pic:cNvPicPr>
                   </pic:nvPicPr>
                   <pic:blipFill>
-                    <a:blip r:embed="rId20"/>
+                    <a:blip r:embed="rId19"/>
                     <a:stretch>
                       <a:fillRect/>
                     </a:stretch>
@@ -29549,7 +29616,7 @@
     </w:p>
     <w:p>
       <w:pPr>
-        <w:ind w:firstLine="420"/>
+        <w:ind w:left="0" w:leftChars="0" w:firstLine="0" w:firstLineChars="0"/>
         <w:jc w:val="center"/>
         <w:rPr>
           <w:rFonts w:cs="Times New Roman"/>
@@ -29591,7 +29658,7 @@
                     </pic:cNvPicPr>
                   </pic:nvPicPr>
                   <pic:blipFill>
-                    <a:blip r:embed="rId20"/>
+                    <a:blip r:embed="rId19"/>
                     <a:stretch>
                       <a:fillRect/>
                     </a:stretch>
@@ -29796,7 +29863,7 @@
     <w:p>
       <w:pPr>
         <w:widowControl/>
-        <w:ind w:firstLine="420"/>
+        <w:ind w:left="0" w:leftChars="0" w:firstLine="0" w:firstLineChars="0"/>
         <w:jc w:val="center"/>
         <w:rPr>
           <w:rFonts w:cs="Times New Roman"/>
@@ -29838,7 +29905,7 @@
                     </pic:cNvPicPr>
                   </pic:nvPicPr>
                   <pic:blipFill>
-                    <a:blip r:embed="rId20"/>
+                    <a:blip r:embed="rId19"/>
                     <a:stretch>
                       <a:fillRect/>
                     </a:stretch>
@@ -30042,7 +30109,7 @@
     </w:p>
     <w:p>
       <w:pPr>
-        <w:ind w:firstLine="420"/>
+        <w:ind w:left="0" w:leftChars="0" w:firstLine="0" w:firstLineChars="0"/>
         <w:jc w:val="center"/>
         <w:rPr>
           <w:rFonts w:cs="Times New Roman"/>
@@ -30084,7 +30151,7 @@
                     </pic:cNvPicPr>
                   </pic:nvPicPr>
                   <pic:blipFill>
-                    <a:blip r:embed="rId20"/>
+                    <a:blip r:embed="rId19"/>
                     <a:stretch>
                       <a:fillRect/>
                     </a:stretch>
@@ -30288,7 +30355,7 @@
     </w:p>
     <w:p>
       <w:pPr>
-        <w:ind w:firstLine="420"/>
+        <w:ind w:left="0" w:leftChars="0" w:firstLine="0" w:firstLineChars="0"/>
         <w:jc w:val="center"/>
         <w:rPr>
           <w:rFonts w:cs="Times New Roman"/>
@@ -30330,7 +30397,7 @@
                     </pic:cNvPicPr>
                   </pic:nvPicPr>
                   <pic:blipFill>
-                    <a:blip r:embed="rId20"/>
+                    <a:blip r:embed="rId19"/>
                     <a:stretch>
                       <a:fillRect/>
                     </a:stretch>
@@ -31271,7 +31338,7 @@
     </w:p>
     <w:p>
       <w:pPr>
-        <w:ind w:firstLine="420"/>
+        <w:ind w:left="0" w:leftChars="0" w:firstLine="0" w:firstLineChars="0"/>
         <w:jc w:val="center"/>
         <w:rPr>
           <w:rFonts w:cs="Times New Roman"/>
@@ -31312,7 +31379,7 @@
                     </pic:cNvPicPr>
                   </pic:nvPicPr>
                   <pic:blipFill>
-                    <a:blip r:embed="rId20"/>
+                    <a:blip r:embed="rId19"/>
                     <a:stretch>
                       <a:fillRect/>
                     </a:stretch>
@@ -31375,7 +31442,7 @@
         </w:rPr>
         <w:t>-mobileOG/6.Statistical_test_analysis/9.Lefse</w:t>
       </w:r>
-      <w:bookmarkEnd w:id="192"/>
+      <w:bookmarkEnd w:id="182"/>
     </w:p>
     <w:p>
       <w:pPr>
@@ -31395,7 +31462,7 @@
           </w14:textFill>
         </w:rPr>
       </w:pPr>
-      <w:bookmarkStart w:id="195" w:name="_Toc5600"/>
+      <w:bookmarkStart w:id="185" w:name="_Toc5600"/>
       <w:r>
         <w:rPr>
           <w:rFonts w:ascii="Times New Roman" w:hAnsi="Times New Roman" w:eastAsia="宋体" w:cs="Times New Roman"/>
@@ -31463,7 +31530,7 @@
         </w:rPr>
         <w:t>重金属抗性基因注释</w:t>
       </w:r>
-      <w:bookmarkEnd w:id="195"/>
+      <w:bookmarkEnd w:id="185"/>
     </w:p>
     <w:p>
       <w:pPr>
@@ -32376,7 +32443,7 @@
           </w14:textFill>
         </w:rPr>
       </w:pPr>
-      <w:bookmarkStart w:id="196" w:name="_Toc10224"/>
+      <w:bookmarkStart w:id="186" w:name="_Toc10224"/>
       <w:r>
         <w:rPr>
           <w:color w:val="000000" w:themeColor="text1"/>
@@ -32424,7 +32491,7 @@
         </w:rPr>
         <w:t>重金属抗性基因丰度统计</w:t>
       </w:r>
-      <w:bookmarkEnd w:id="196"/>
+      <w:bookmarkEnd w:id="186"/>
     </w:p>
     <w:p>
       <w:pPr>
@@ -32444,7 +32511,7 @@
     </w:p>
     <w:p>
       <w:pPr>
-        <w:ind w:firstLine="420"/>
+        <w:ind w:left="0" w:leftChars="0" w:firstLine="0" w:firstLineChars="0"/>
         <w:jc w:val="center"/>
         <w:rPr>
           <w:rFonts w:cs="Times New Roman"/>
@@ -32486,7 +32553,7 @@
                     </pic:cNvPicPr>
                   </pic:nvPicPr>
                   <pic:blipFill>
-                    <a:blip r:embed="rId20"/>
+                    <a:blip r:embed="rId19"/>
                     <a:stretch>
                       <a:fillRect/>
                     </a:stretch>
@@ -32630,7 +32697,7 @@
     </w:p>
     <w:p>
       <w:pPr>
-        <w:ind w:firstLine="420"/>
+        <w:ind w:left="0" w:leftChars="0" w:firstLine="0" w:firstLineChars="0"/>
         <w:jc w:val="center"/>
         <w:rPr>
           <w:rFonts w:cs="Times New Roman"/>
@@ -32672,7 +32739,7 @@
                     </pic:cNvPicPr>
                   </pic:nvPicPr>
                   <pic:blipFill>
-                    <a:blip r:embed="rId20"/>
+                    <a:blip r:embed="rId19"/>
                     <a:stretch>
                       <a:fillRect/>
                     </a:stretch>
@@ -32784,7 +32851,7 @@
           </w14:textFill>
         </w:rPr>
       </w:pPr>
-      <w:bookmarkStart w:id="197" w:name="_Toc26155"/>
+      <w:bookmarkStart w:id="187" w:name="_Toc26155"/>
       <w:r>
         <w:rPr>
           <w:color w:val="000000" w:themeColor="text1"/>
@@ -32832,7 +32899,7 @@
         </w:rPr>
         <w:t>重金属抗性基因的降维分析</w:t>
       </w:r>
-      <w:bookmarkEnd w:id="197"/>
+      <w:bookmarkEnd w:id="187"/>
     </w:p>
     <w:p>
       <w:pPr>
@@ -32938,7 +33005,7 @@
     </w:p>
     <w:p>
       <w:pPr>
-        <w:ind w:firstLine="420"/>
+        <w:ind w:left="0" w:leftChars="0" w:firstLine="0" w:firstLineChars="0"/>
         <w:jc w:val="center"/>
         <w:rPr>
           <w:rFonts w:cs="Times New Roman"/>
@@ -32980,7 +33047,7 @@
                     </pic:cNvPicPr>
                   </pic:nvPicPr>
                   <pic:blipFill>
-                    <a:blip r:embed="rId20"/>
+                    <a:blip r:embed="rId19"/>
                     <a:stretch>
                       <a:fillRect/>
                     </a:stretch>
@@ -33209,7 +33276,6 @@
       <w:pPr>
         <w:pStyle w:val="32"/>
         <w:spacing w:line="360" w:lineRule="auto"/>
-        <w:ind w:firstLine="420" w:firstLineChars="200"/>
         <w:jc w:val="center"/>
         <w:rPr>
           <w:color w:val="000000" w:themeColor="text1"/>
@@ -33250,7 +33316,7 @@
                     </pic:cNvPicPr>
                   </pic:nvPicPr>
                   <pic:blipFill>
-                    <a:blip r:embed="rId20"/>
+                    <a:blip r:embed="rId19"/>
                     <a:stretch>
                       <a:fillRect/>
                     </a:stretch>
@@ -33463,7 +33529,7 @@
     </w:p>
     <w:p>
       <w:pPr>
-        <w:ind w:firstLine="420"/>
+        <w:ind w:left="0" w:leftChars="0" w:firstLine="0" w:firstLineChars="0"/>
         <w:jc w:val="center"/>
         <w:rPr>
           <w:rFonts w:cs="Times New Roman"/>
@@ -33505,7 +33571,7 @@
                     </pic:cNvPicPr>
                   </pic:nvPicPr>
                   <pic:blipFill>
-                    <a:blip r:embed="rId20"/>
+                    <a:blip r:embed="rId19"/>
                     <a:stretch>
                       <a:fillRect/>
                     </a:stretch>
@@ -33617,7 +33683,7 @@
           </w14:textFill>
         </w:rPr>
       </w:pPr>
-      <w:bookmarkStart w:id="198" w:name="_Toc18919"/>
+      <w:bookmarkStart w:id="188" w:name="_Toc18919"/>
       <w:r>
         <w:rPr>
           <w:color w:val="000000" w:themeColor="text1"/>
@@ -33665,7 +33731,7 @@
         </w:rPr>
         <w:t>重金属抗性基因的组间差异分析</w:t>
       </w:r>
-      <w:bookmarkEnd w:id="198"/>
+      <w:bookmarkEnd w:id="188"/>
     </w:p>
     <w:p>
       <w:pPr>
@@ -33771,7 +33837,7 @@
     </w:p>
     <w:p>
       <w:pPr>
-        <w:ind w:firstLine="420"/>
+        <w:ind w:left="0" w:leftChars="0" w:firstLine="0" w:firstLineChars="0"/>
         <w:jc w:val="center"/>
         <w:rPr>
           <w:rFonts w:cs="Times New Roman"/>
@@ -33813,7 +33879,7 @@
                     </pic:cNvPicPr>
                   </pic:nvPicPr>
                   <pic:blipFill>
-                    <a:blip r:embed="rId20"/>
+                    <a:blip r:embed="rId19"/>
                     <a:stretch>
                       <a:fillRect/>
                     </a:stretch>
@@ -34017,7 +34083,7 @@
     </w:p>
     <w:p>
       <w:pPr>
-        <w:ind w:firstLine="420"/>
+        <w:ind w:left="0" w:leftChars="0" w:firstLine="0" w:firstLineChars="0"/>
         <w:jc w:val="center"/>
         <w:rPr>
           <w:rFonts w:cs="Times New Roman"/>
@@ -34059,7 +34125,7 @@
                     </pic:cNvPicPr>
                   </pic:nvPicPr>
                   <pic:blipFill>
-                    <a:blip r:embed="rId20"/>
+                    <a:blip r:embed="rId19"/>
                     <a:stretch>
                       <a:fillRect/>
                     </a:stretch>
@@ -34264,7 +34330,7 @@
     <w:p>
       <w:pPr>
         <w:widowControl/>
-        <w:ind w:firstLine="420"/>
+        <w:ind w:left="0" w:leftChars="0" w:firstLine="0" w:firstLineChars="0"/>
         <w:jc w:val="center"/>
         <w:rPr>
           <w:rFonts w:cs="Times New Roman"/>
@@ -34306,7 +34372,7 @@
                     </pic:cNvPicPr>
                   </pic:nvPicPr>
                   <pic:blipFill>
-                    <a:blip r:embed="rId20"/>
+                    <a:blip r:embed="rId19"/>
                     <a:stretch>
                       <a:fillRect/>
                     </a:stretch>
@@ -34510,7 +34576,7 @@
     </w:p>
     <w:p>
       <w:pPr>
-        <w:ind w:firstLine="420"/>
+        <w:ind w:left="0" w:leftChars="0" w:firstLine="0" w:firstLineChars="0"/>
         <w:jc w:val="center"/>
         <w:rPr>
           <w:rFonts w:cs="Times New Roman"/>
@@ -34552,7 +34618,7 @@
                     </pic:cNvPicPr>
                   </pic:nvPicPr>
                   <pic:blipFill>
-                    <a:blip r:embed="rId20"/>
+                    <a:blip r:embed="rId19"/>
                     <a:stretch>
                       <a:fillRect/>
                     </a:stretch>
@@ -34756,7 +34822,7 @@
     </w:p>
     <w:p>
       <w:pPr>
-        <w:ind w:firstLine="420"/>
+        <w:ind w:left="0" w:leftChars="0" w:firstLine="0" w:firstLineChars="0"/>
         <w:jc w:val="center"/>
         <w:rPr>
           <w:rFonts w:cs="Times New Roman"/>
@@ -34798,7 +34864,7 @@
                     </pic:cNvPicPr>
                   </pic:nvPicPr>
                   <pic:blipFill>
-                    <a:blip r:embed="rId20"/>
+                    <a:blip r:embed="rId19"/>
                     <a:stretch>
                       <a:fillRect/>
                     </a:stretch>
@@ -35739,7 +35805,7 @@
     </w:p>
     <w:p>
       <w:pPr>
-        <w:ind w:firstLine="420"/>
+        <w:ind w:left="0" w:leftChars="0" w:firstLine="0" w:firstLineChars="0"/>
         <w:jc w:val="center"/>
         <w:rPr>
           <w:rFonts w:cs="Times New Roman"/>
@@ -35780,7 +35846,7 @@
                     </pic:cNvPicPr>
                   </pic:nvPicPr>
                   <pic:blipFill>
-                    <a:blip r:embed="rId20"/>
+                    <a:blip r:embed="rId19"/>
                     <a:stretch>
                       <a:fillRect/>
                     </a:stretch>
@@ -35898,8 +35964,8 @@
           </w14:textFill>
         </w:rPr>
       </w:pPr>
-      <w:bookmarkStart w:id="199" w:name="_Toc4183"/>
-      <w:bookmarkStart w:id="200" w:name="OLE_LINK7"/>
+      <w:bookmarkStart w:id="189" w:name="_Toc4183"/>
+      <w:bookmarkStart w:id="190" w:name="OLE_LINK7"/>
       <w:r>
         <w:rPr>
           <w:rFonts w:ascii="Times New Roman" w:hAnsi="Times New Roman" w:eastAsia="宋体" w:cs="Times New Roman"/>
@@ -35967,7 +36033,7 @@
         </w:rPr>
         <w:t>群体感应基因注释</w:t>
       </w:r>
-      <w:bookmarkEnd w:id="199"/>
+      <w:bookmarkEnd w:id="189"/>
     </w:p>
     <w:p>
       <w:pPr>
@@ -36904,6 +36970,12 @@
             <w:insideH w:val="none" w:color="auto" w:sz="0" w:space="0"/>
             <w:insideV w:val="none" w:color="auto" w:sz="0" w:space="0"/>
           </w:tblBorders>
+          <w:tblCellMar>
+            <w:top w:w="0" w:type="dxa"/>
+            <w:left w:w="108" w:type="dxa"/>
+            <w:bottom w:w="0" w:type="dxa"/>
+            <w:right w:w="108" w:type="dxa"/>
+          </w:tblCellMar>
         </w:tblPrEx>
         <w:trPr>
           <w:trHeight w:val="397" w:hRule="atLeast"/>
@@ -37079,7 +37151,7 @@
           </w14:textFill>
         </w:rPr>
       </w:pPr>
-      <w:bookmarkStart w:id="201" w:name="_Toc16713"/>
+      <w:bookmarkStart w:id="191" w:name="_Toc16713"/>
       <w:r>
         <w:rPr>
           <w:color w:val="000000" w:themeColor="text1"/>
@@ -37127,7 +37199,7 @@
         </w:rPr>
         <w:t>群体感应基因丰度统计</w:t>
       </w:r>
-      <w:bookmarkEnd w:id="201"/>
+      <w:bookmarkEnd w:id="191"/>
     </w:p>
     <w:p>
       <w:pPr>
@@ -37147,7 +37219,7 @@
     </w:p>
     <w:p>
       <w:pPr>
-        <w:ind w:firstLine="420"/>
+        <w:ind w:left="0" w:leftChars="0" w:firstLine="0" w:firstLineChars="0"/>
         <w:jc w:val="center"/>
         <w:rPr>
           <w:rFonts w:cs="Times New Roman"/>
@@ -37189,7 +37261,7 @@
                     </pic:cNvPicPr>
                   </pic:nvPicPr>
                   <pic:blipFill>
-                    <a:blip r:embed="rId20"/>
+                    <a:blip r:embed="rId19"/>
                     <a:stretch>
                       <a:fillRect/>
                     </a:stretch>
@@ -37263,7 +37335,7 @@
         </w:rPr>
         <w:t>Result/group*/</w:t>
       </w:r>
-      <w:bookmarkStart w:id="202" w:name="OLE_LINK5"/>
+      <w:bookmarkStart w:id="192" w:name="OLE_LINK5"/>
       <w:r>
         <w:rPr>
           <w:rFonts w:cs="Times New Roman"/>
@@ -37313,7 +37385,7 @@
         </w:rPr>
         <w:t>QS</w:t>
       </w:r>
-      <w:bookmarkEnd w:id="202"/>
+      <w:bookmarkEnd w:id="192"/>
       <w:r>
         <w:rPr>
           <w:rFonts w:cs="Times New Roman"/>
@@ -37371,7 +37443,7 @@
     </w:p>
     <w:p>
       <w:pPr>
-        <w:ind w:firstLine="420"/>
+        <w:ind w:left="0" w:leftChars="0" w:firstLine="0" w:firstLineChars="0"/>
         <w:jc w:val="center"/>
         <w:rPr>
           <w:rFonts w:cs="Times New Roman"/>
@@ -37413,7 +37485,7 @@
                     </pic:cNvPicPr>
                   </pic:nvPicPr>
                   <pic:blipFill>
-                    <a:blip r:embed="rId20"/>
+                    <a:blip r:embed="rId19"/>
                     <a:stretch>
                       <a:fillRect/>
                     </a:stretch>
@@ -37449,7 +37521,7 @@
         </w:rPr>
         <w:t>注：图中列代表不同的样本，行为相对丰度排名前50的群体感应基因（不足50显示全部），图中的颜色代表了重金属抗性基因的丰度大小，</w:t>
       </w:r>
-      <w:bookmarkStart w:id="203" w:name="OLE_LINK6"/>
+      <w:bookmarkStart w:id="193" w:name="OLE_LINK6"/>
       <w:r>
         <w:rPr>
           <w:rFonts w:hint="eastAsia" w:cs="Times New Roman"/>
@@ -37457,7 +37529,7 @@
         </w:rPr>
         <w:t>颜色由蓝色到红色渐变表示功能丰度由小到</w:t>
       </w:r>
-      <w:bookmarkEnd w:id="203"/>
+      <w:bookmarkEnd w:id="193"/>
       <w:r>
         <w:rPr>
           <w:rFonts w:hint="eastAsia" w:cs="Times New Roman"/>
@@ -37565,7 +37637,7 @@
           </w14:textFill>
         </w:rPr>
       </w:pPr>
-      <w:bookmarkStart w:id="204" w:name="_Toc22044"/>
+      <w:bookmarkStart w:id="194" w:name="_Toc22044"/>
       <w:r>
         <w:rPr>
           <w:color w:val="000000" w:themeColor="text1"/>
@@ -37613,7 +37685,7 @@
         </w:rPr>
         <w:t>群体感应基因的降维分析</w:t>
       </w:r>
-      <w:bookmarkEnd w:id="204"/>
+      <w:bookmarkEnd w:id="194"/>
     </w:p>
     <w:p>
       <w:pPr>
@@ -37719,7 +37791,7 @@
     </w:p>
     <w:p>
       <w:pPr>
-        <w:ind w:firstLine="420"/>
+        <w:ind w:left="0" w:leftChars="0" w:firstLine="0" w:firstLineChars="0"/>
         <w:jc w:val="center"/>
         <w:rPr>
           <w:rFonts w:cs="Times New Roman"/>
@@ -37761,7 +37833,7 @@
                     </pic:cNvPicPr>
                   </pic:nvPicPr>
                   <pic:blipFill>
-                    <a:blip r:embed="rId20"/>
+                    <a:blip r:embed="rId19"/>
                     <a:stretch>
                       <a:fillRect/>
                     </a:stretch>
@@ -38014,7 +38086,6 @@
       <w:pPr>
         <w:pStyle w:val="32"/>
         <w:spacing w:line="360" w:lineRule="auto"/>
-        <w:ind w:firstLine="420" w:firstLineChars="200"/>
         <w:jc w:val="center"/>
         <w:rPr>
           <w:color w:val="000000" w:themeColor="text1"/>
@@ -38055,7 +38126,7 @@
                     </pic:cNvPicPr>
                   </pic:nvPicPr>
                   <pic:blipFill>
-                    <a:blip r:embed="rId20"/>
+                    <a:blip r:embed="rId19"/>
                     <a:stretch>
                       <a:fillRect/>
                     </a:stretch>
@@ -38283,7 +38354,7 @@
     </w:p>
     <w:p>
       <w:pPr>
-        <w:ind w:firstLine="420"/>
+        <w:ind w:left="0" w:leftChars="0" w:firstLine="0" w:firstLineChars="0"/>
         <w:jc w:val="center"/>
         <w:rPr>
           <w:rFonts w:cs="Times New Roman"/>
@@ -38325,7 +38396,7 @@
                     </pic:cNvPicPr>
                   </pic:nvPicPr>
                   <pic:blipFill>
-                    <a:blip r:embed="rId20"/>
+                    <a:blip r:embed="rId19"/>
                     <a:stretch>
                       <a:fillRect/>
                     </a:stretch>
@@ -38461,7 +38532,7 @@
           </w14:textFill>
         </w:rPr>
       </w:pPr>
-      <w:bookmarkStart w:id="205" w:name="_Toc17242"/>
+      <w:bookmarkStart w:id="195" w:name="_Toc17242"/>
       <w:r>
         <w:rPr>
           <w:color w:val="000000" w:themeColor="text1"/>
@@ -38509,7 +38580,7 @@
         </w:rPr>
         <w:t>群体感应基因的组间差异分析</w:t>
       </w:r>
-      <w:bookmarkEnd w:id="205"/>
+      <w:bookmarkEnd w:id="195"/>
     </w:p>
     <w:p>
       <w:pPr>
@@ -38615,7 +38686,7 @@
     </w:p>
     <w:p>
       <w:pPr>
-        <w:ind w:firstLine="420"/>
+        <w:ind w:left="0" w:leftChars="0" w:firstLine="0" w:firstLineChars="0"/>
         <w:jc w:val="center"/>
         <w:rPr>
           <w:rFonts w:cs="Times New Roman"/>
@@ -38657,7 +38728,7 @@
                     </pic:cNvPicPr>
                   </pic:nvPicPr>
                   <pic:blipFill>
-                    <a:blip r:embed="rId20"/>
+                    <a:blip r:embed="rId19"/>
                     <a:stretch>
                       <a:fillRect/>
                     </a:stretch>
@@ -38885,7 +38956,7 @@
     </w:p>
     <w:p>
       <w:pPr>
-        <w:ind w:firstLine="420"/>
+        <w:ind w:left="0" w:leftChars="0" w:firstLine="0" w:firstLineChars="0"/>
         <w:jc w:val="center"/>
         <w:rPr>
           <w:rFonts w:cs="Times New Roman"/>
@@ -38927,7 +38998,7 @@
                     </pic:cNvPicPr>
                   </pic:nvPicPr>
                   <pic:blipFill>
-                    <a:blip r:embed="rId20"/>
+                    <a:blip r:embed="rId19"/>
                     <a:stretch>
                       <a:fillRect/>
                     </a:stretch>
@@ -39166,7 +39237,7 @@
     <w:p>
       <w:pPr>
         <w:widowControl/>
-        <w:ind w:firstLine="420"/>
+        <w:ind w:left="0" w:leftChars="0" w:firstLine="0" w:firstLineChars="0"/>
         <w:jc w:val="center"/>
         <w:rPr>
           <w:rFonts w:cs="Times New Roman"/>
@@ -39208,7 +39279,7 @@
                     </pic:cNvPicPr>
                   </pic:nvPicPr>
                   <pic:blipFill>
-                    <a:blip r:embed="rId20"/>
+                    <a:blip r:embed="rId19"/>
                     <a:stretch>
                       <a:fillRect/>
                     </a:stretch>
@@ -39436,7 +39507,7 @@
     </w:p>
     <w:p>
       <w:pPr>
-        <w:ind w:firstLine="420"/>
+        <w:ind w:left="0" w:leftChars="0" w:firstLine="0" w:firstLineChars="0"/>
         <w:jc w:val="center"/>
         <w:rPr>
           <w:rFonts w:cs="Times New Roman"/>
@@ -39478,7 +39549,7 @@
                     </pic:cNvPicPr>
                   </pic:nvPicPr>
                   <pic:blipFill>
-                    <a:blip r:embed="rId20"/>
+                    <a:blip r:embed="rId19"/>
                     <a:stretch>
                       <a:fillRect/>
                     </a:stretch>
@@ -39706,7 +39777,7 @@
     </w:p>
     <w:p>
       <w:pPr>
-        <w:ind w:firstLine="420"/>
+        <w:ind w:left="0" w:leftChars="0" w:firstLine="0" w:firstLineChars="0"/>
         <w:jc w:val="center"/>
         <w:rPr>
           <w:rFonts w:cs="Times New Roman"/>
@@ -39748,7 +39819,7 @@
                     </pic:cNvPicPr>
                   </pic:nvPicPr>
                   <pic:blipFill>
-                    <a:blip r:embed="rId20"/>
+                    <a:blip r:embed="rId19"/>
                     <a:stretch>
                       <a:fillRect/>
                     </a:stretch>
@@ -40250,8 +40321,6 @@
         </w:rPr>
         <w:t>距离进行不同组之间的</w:t>
       </w:r>
-      <w:bookmarkStart w:id="209" w:name="_GoBack"/>
-      <w:bookmarkEnd w:id="209"/>
       <w:r>
         <w:rPr>
           <w:rFonts w:cs="Times New Roman"/>
@@ -40775,7 +40844,7 @@
     </w:p>
     <w:p>
       <w:pPr>
-        <w:ind w:firstLine="420"/>
+        <w:ind w:left="0" w:leftChars="0" w:firstLine="0" w:firstLineChars="0"/>
         <w:jc w:val="center"/>
         <w:rPr>
           <w:rFonts w:cs="Times New Roman"/>
@@ -40816,7 +40885,7 @@
                     </pic:cNvPicPr>
                   </pic:nvPicPr>
                   <pic:blipFill>
-                    <a:blip r:embed="rId20"/>
+                    <a:blip r:embed="rId19"/>
                     <a:stretch>
                       <a:fillRect/>
                     </a:stretch>
@@ -40904,12 +40973,12 @@
         <w:t>-QS/6.Statistical_test_analysis/9.Lefse</w:t>
       </w:r>
     </w:p>
-    <w:bookmarkEnd w:id="200"/>
+    <w:bookmarkEnd w:id="190"/>
     <w:p>
       <w:pPr>
         <w:pStyle w:val="40"/>
       </w:pPr>
-      <w:bookmarkStart w:id="206" w:name="_Toc20593"/>
+      <w:bookmarkStart w:id="196" w:name="_Toc20593"/>
       <w:r>
         <w:rPr>
           <w:rFonts w:hint="eastAsia"/>
@@ -40937,7 +41006,7 @@
         </w:rPr>
         <w:t>软件列表</w:t>
       </w:r>
-      <w:bookmarkEnd w:id="206"/>
+      <w:bookmarkEnd w:id="196"/>
     </w:p>
     <w:p>
       <w:pPr>
@@ -44719,7 +44788,7 @@
       <w:pPr>
         <w:pStyle w:val="40"/>
       </w:pPr>
-      <w:bookmarkStart w:id="207" w:name="_Toc25321"/>
+      <w:bookmarkStart w:id="197" w:name="_Toc25321"/>
       <w:r>
         <w:rPr>
           <w:rFonts w:hint="eastAsia"/>
@@ -44747,7 +44816,7 @@
         </w:rPr>
         <w:t>文件位置</w:t>
       </w:r>
-      <w:bookmarkEnd w:id="207"/>
+      <w:bookmarkEnd w:id="197"/>
     </w:p>
     <w:p>
       <w:pPr>
@@ -44781,7 +44850,7 @@
       <w:pPr>
         <w:pStyle w:val="40"/>
       </w:pPr>
-      <w:bookmarkStart w:id="208" w:name="_Toc5557"/>
+      <w:bookmarkStart w:id="198" w:name="_Toc5557"/>
       <w:r>
         <w:rPr>
           <w:rFonts w:hint="eastAsia"/>
@@ -44806,11 +44875,11 @@
       <w:r>
         <w:t>参考文献</w:t>
       </w:r>
-      <w:bookmarkEnd w:id="186"/>
-      <w:bookmarkEnd w:id="187"/>
-      <w:bookmarkEnd w:id="188"/>
-      <w:bookmarkEnd w:id="189"/>
-      <w:bookmarkEnd w:id="208"/>
+      <w:bookmarkEnd w:id="176"/>
+      <w:bookmarkEnd w:id="177"/>
+      <w:bookmarkEnd w:id="178"/>
+      <w:bookmarkEnd w:id="179"/>
+      <w:bookmarkEnd w:id="198"/>
     </w:p>
     <w:p>
       <w:pPr>
@@ -45210,6 +45279,12 @@
       <w:footerReference r:id="rId13" w:type="default"/>
       <w:pgSz w:w="11906" w:h="16838"/>
       <w:pgMar w:top="1440" w:right="1800" w:bottom="1440" w:left="1800" w:header="851" w:footer="992" w:gutter="0"/>
+      <w:pgBorders>
+        <w:top w:val="none" w:sz="0" w:space="0"/>
+        <w:left w:val="none" w:sz="0" w:space="0"/>
+        <w:bottom w:val="none" w:sz="0" w:space="0"/>
+        <w:right w:val="none" w:sz="0" w:space="0"/>
+      </w:pgBorders>
       <w:pgNumType w:start="1"/>
       <w:cols w:space="425" w:num="1"/>
       <w:docGrid w:type="lines" w:linePitch="312" w:charSpace="0"/>
@@ -45466,133 +45541,15 @@
       <w:spacing w:before="100" w:beforeAutospacing="1"/>
       <w:rPr>
         <w:rFonts w:ascii="黑体" w:hAnsi="黑体" w:eastAsia="黑体"/>
+        <w:color w:val="auto"/>
         <w:sz w:val="24"/>
         <w:szCs w:val="24"/>
       </w:rPr>
     </w:pPr>
     <w:r>
       <w:rPr>
-        <w:rFonts w:ascii="Times New Roman" w:hAnsi="Times New Roman" w:cs="Times New Roman"/>
-        <w:szCs w:val="21"/>
-      </w:rPr>
-      <w:drawing>
-        <wp:anchor distT="0" distB="0" distL="114300" distR="114300" simplePos="0" relativeHeight="251660288" behindDoc="1" locked="0" layoutInCell="1" allowOverlap="1">
-          <wp:simplePos x="0" y="0"/>
-          <wp:positionH relativeFrom="margin">
-            <wp:posOffset>-83820</wp:posOffset>
-          </wp:positionH>
-          <wp:positionV relativeFrom="paragraph">
-            <wp:posOffset>-349250</wp:posOffset>
-          </wp:positionV>
-          <wp:extent cx="841375" cy="535305"/>
-          <wp:effectExtent l="0" t="0" r="0" b="0"/>
-          <wp:wrapNone/>
-          <wp:docPr id="26" name="图片 26" descr="sanshu logo - 副本"/>
-          <wp:cNvGraphicFramePr>
-            <a:graphicFrameLocks xmlns:a="http://schemas.openxmlformats.org/drawingml/2006/main" noChangeAspect="1"/>
-          </wp:cNvGraphicFramePr>
-          <a:graphic xmlns:a="http://schemas.openxmlformats.org/drawingml/2006/main">
-            <a:graphicData uri="http://schemas.openxmlformats.org/drawingml/2006/picture">
-              <pic:pic xmlns:pic="http://schemas.openxmlformats.org/drawingml/2006/picture">
-                <pic:nvPicPr>
-                  <pic:cNvPr id="26" name="图片 26" descr="sanshu logo - 副本"/>
-                  <pic:cNvPicPr>
-                    <a:picLocks noChangeAspect="1" noChangeArrowheads="1"/>
-                  </pic:cNvPicPr>
-                </pic:nvPicPr>
-                <pic:blipFill>
-                  <a:blip r:embed="rId1" cstate="print">
-                    <a:extLst>
-                      <a:ext uri="{28A0092B-C50C-407E-A947-70E740481C1C}">
-                        <a14:useLocalDpi xmlns:a14="http://schemas.microsoft.com/office/drawing/2010/main" val="0"/>
-                      </a:ext>
-                    </a:extLst>
-                  </a:blip>
-                  <a:srcRect b="22156"/>
-                  <a:stretch>
-                    <a:fillRect/>
-                  </a:stretch>
-                </pic:blipFill>
-                <pic:spPr>
-                  <a:xfrm>
-                    <a:off x="0" y="0"/>
-                    <a:ext cx="841086" cy="535594"/>
-                  </a:xfrm>
-                  <a:prstGeom prst="rect">
-                    <a:avLst/>
-                  </a:prstGeom>
-                  <a:noFill/>
-                  <a:ln>
-                    <a:noFill/>
-                  </a:ln>
-                </pic:spPr>
-              </pic:pic>
-            </a:graphicData>
-          </a:graphic>
-        </wp:anchor>
-      </w:drawing>
-    </w:r>
-    <w:r>
-      <w:rPr>
-        <w:rFonts w:ascii="黑体" w:hAnsi="黑体" w:eastAsia="黑体"/>
-        <w:sz w:val="16"/>
-        <w:szCs w:val="16"/>
-      </w:rPr>
-      <w:drawing>
-        <wp:anchor distT="0" distB="0" distL="114300" distR="114300" simplePos="0" relativeHeight="251661312" behindDoc="1" locked="0" layoutInCell="1" allowOverlap="1">
-          <wp:simplePos x="0" y="0"/>
-          <wp:positionH relativeFrom="margin">
-            <wp:posOffset>4716780</wp:posOffset>
-          </wp:positionH>
-          <wp:positionV relativeFrom="paragraph">
-            <wp:posOffset>-305435</wp:posOffset>
-          </wp:positionV>
-          <wp:extent cx="539115" cy="486410"/>
-          <wp:effectExtent l="0" t="0" r="0" b="8890"/>
-          <wp:wrapNone/>
-          <wp:docPr id="173" name="图片 173"/>
-          <wp:cNvGraphicFramePr>
-            <a:graphicFrameLocks xmlns:a="http://schemas.openxmlformats.org/drawingml/2006/main" noChangeAspect="1"/>
-          </wp:cNvGraphicFramePr>
-          <a:graphic xmlns:a="http://schemas.openxmlformats.org/drawingml/2006/main">
-            <a:graphicData uri="http://schemas.openxmlformats.org/drawingml/2006/picture">
-              <pic:pic xmlns:pic="http://schemas.openxmlformats.org/drawingml/2006/picture">
-                <pic:nvPicPr>
-                  <pic:cNvPr id="173" name="图片 173"/>
-                  <pic:cNvPicPr>
-                    <a:picLocks noChangeAspect="1"/>
-                  </pic:cNvPicPr>
-                </pic:nvPicPr>
-                <pic:blipFill>
-                  <a:blip r:embed="rId2" cstate="print">
-                    <a:extLst>
-                      <a:ext uri="{28A0092B-C50C-407E-A947-70E740481C1C}">
-                        <a14:useLocalDpi xmlns:a14="http://schemas.microsoft.com/office/drawing/2010/main" val="0"/>
-                      </a:ext>
-                    </a:extLst>
-                  </a:blip>
-                  <a:stretch>
-                    <a:fillRect/>
-                  </a:stretch>
-                </pic:blipFill>
-                <pic:spPr>
-                  <a:xfrm>
-                    <a:off x="0" y="0"/>
-                    <a:ext cx="539115" cy="486410"/>
-                  </a:xfrm>
-                  <a:prstGeom prst="rect">
-                    <a:avLst/>
-                  </a:prstGeom>
-                </pic:spPr>
-              </pic:pic>
-            </a:graphicData>
-          </a:graphic>
-        </wp:anchor>
-      </w:drawing>
-    </w:r>
-    <w:r>
-      <w:rPr>
         <w:rFonts w:hint="eastAsia" w:ascii="黑体" w:hAnsi="黑体" w:eastAsia="黑体"/>
+        <w:color w:val="auto"/>
         <w:sz w:val="24"/>
         <w:szCs w:val="24"/>
       </w:rPr>

</xml_diff>